<commit_message>
Remove team member names and signatures from project documents
</commit_message>
<xml_diff>
--- a/docs/Project_Proposal.docx
+++ b/docs/Project_Proposal.docx
@@ -105,7 +105,7 @@
                 <v:stroke joinstyle="miter"/>
                 <v:path gradientshapeok="t" o:connecttype="rect"/>
               </v:shapetype>
-              <v:shape id="Text Box 2" o:spid="_x0000_s1026" type="#_x0000_t202" style="position:absolute;left:0;text-align:left;margin-left:371.8pt;margin-top:.1pt;width:124.8pt;height:86.4pt;z-index:-251657216;visibility:visible;mso-wrap-style:square;mso-width-percent:0;mso-height-percent:0;mso-wrap-distance-left:9pt;mso-wrap-distance-top:3.6pt;mso-wrap-distance-right:9pt;mso-wrap-distance-bottom:3.6pt;mso-position-horizontal:absolute;mso-position-horizontal-relative:margin;mso-position-vertical:absolute;mso-position-vertical-relative:text;mso-width-percent:0;mso-height-percent:0;mso-width-relative:margin;mso-height-relative:margin;v-text-anchor:top" o:gfxdata="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" stroked="f">
+              <v:shape id="Text Box 2" o:spid="_x0000_s1026" type="#_x0000_t202" style="position:absolute;left:0;text-align:left;margin-left:371.8pt;margin-top:.1pt;width:124.8pt;height:86.4pt;z-index:-251657216;visibility:visible;mso-wrap-style:square;mso-width-percent:0;mso-height-percent:0;mso-wrap-distance-left:9pt;mso-wrap-distance-top:3.6pt;mso-wrap-distance-right:9pt;mso-wrap-distance-bottom:3.6pt;mso-position-horizontal:absolute;mso-position-horizontal-relative:margin;mso-position-vertical:absolute;mso-position-vertical-relative:text;mso-width-percent:0;mso-height-percent:0;mso-width-relative:margin;mso-height-relative:margin;v-text-anchor:top" o:gfxdata="UEsDBBQABgAIAAAAIQCxgme2CgEAABMCAAATAAAAW0NvbnRlbnRfVHlwZXNdLnhtbJSRwU7DMAyG 70i8Q5QralN2QAit3YGOIyA0HiBK3DaicaI4lO3tSbpNgokh7Rjb3+8vyXK1tSObIJBxWPPbsuIM UDltsK/5++apuOeMokQtR4dQ8x0QXzXXV8vNzgOxRCPVfIjRPwhBagArqXQeMHU6F6yM6Rh64aX6 kD2IRVXdCeUwAsYi5gzeLFvo5OcY2XqbynsTjz1nj/u5vKrmxmY+18WfRICRThDp/WiUjOluYkJ9 4lUcnMpEzjM0GE83SfzMhtz57fRzwYF7SY8ZjAb2KkN8ljaZCx1IwMK1TpX/Z2RJS4XrOqOgbAOt Z+rodC5buy8MMF0a3ibsDaZjupi/tPkGAAD//wMAUEsDBBQABgAIAAAAIQA4/SH/1gAAAJQBAAAL AAAAX3JlbHMvLnJlbHOkkMFqwzAMhu+DvYPRfXGawxijTi+j0GvpHsDYimMaW0Yy2fr2M4PBMnrb Ub/Q94l/f/hMi1qRJVI2sOt6UJgd+ZiDgffL8ekFlFSbvV0oo4EbChzGx4f9GRdb25HMsYhqlCwG 5lrLq9biZkxWOiqY22YiTra2kYMu1l1tQD30/bPm3wwYN0x18gb45AdQl1tp5j/sFB2T0FQ7R0nT NEV3j6o9feQzro1iOWA14Fm+Q8a1a8+Bvu/d/dMb2JY5uiPbhG/ktn4cqGU/er3pcvwCAAD//wMA UEsDBBQABgAIAAAAIQCT4czWWAIAAJoEAAAOAAAAZHJzL2Uyb0RvYy54bWysVE1v2zAMvQ/YfxB0 X50ESZsYdYquXYcC3QfWDTvLshwLk0RNYmq3v36U7KTFdhgwLAdBNulHvvfInF8M1rAHFaIGV/H5 yYwz5SQ02u0q/u3rzZs1ZxGFa4QBpyr+qCK/2L5+dd77Ui2gA9OowAjExbL3Fe8QfVkUUXbKingC XjkKthCsQHoMu6IJoid0a4rFbHZa9BAaH0CqGOnt9Rjk24zftkrip7aNCpmpOPWG+Qz5rNNZbM9F uQvCd1pObYh/6MIK7ajoEepaoGD7oP+AsloGiNDiiQRbQNtqqTIHYjOf/cbmvhNeZS4kTvRHmeL/ g5UfH+7958BweAsDGZhJRH8H8kdkDq464XbqMgToOyUaKjxPkhW9j+X0aZI6ljGB1P0HaMhksUfI QEMbbFKFeDJCJwMej6KrAZlMJVfr5eaUQpJi89nmbLle5BqiPHzuQ8T3CixLl4oHcjXDi4e7iKkd UR5SUrXaaH+jjWGNJwMIOQB+19hlOQ8cU9IkKI3D38dutOoa5N4qh+PsBWUE0uDHTvtIZUpla9VQ g7fNnPjQ3COp4YN2OA5aDPILNZ+HLmJQKLvUcEvNTu+JyjFA9wOVlGUc6yu+WS1WmbyDxDFDWY20 REbbiq9n6TdWS469c01OQaHNeCdU4yYLk2ujfzjUAyUmK2toHslMEi2LR8tNlw7CE2c9LUrF48+9 CIozc+toIDbz5TJtVn5Yrs4WSfCXkfplRDhJUBVHzsbrFeZtTAQdXNLgtDpb+tzJ1CstQHZ6Wta0 YS+fc9bzX8r2FwAAAP//AwBQSwMECgAAAAAAAAAhAOHPjdQpwwAAKcMAABQAAABkcnMvbWVkaWEv aW1hZ2UxLnBuZ4lQTkcNChoKAAAADUlIRFIAAAG9AAABFQgGAAAAdGE7xwAAAAFzUkdCAK7OHOkA AAAEZ0FNQQAAsY8L/GEFAAAACXBIWXMAACHVAAAh1QEEnLSdAADCvklEQVR4Xu29h7/tVLU9zv/z fdanzwsigoiC2H1PfeeKSLMgKNh7QbGCiIC9YEEBlY5ge4qAKCoKAiJFQaU3KZd27z35fdacc8w5 1spKzj7n7py9s+8v5yRZa43ZxppJVpK9d7LD8vJy0zTL+mfl9N8sR12xxjCdXbbERDUwndRGTCEL NOpmP2odmNm3eDwW9q+VgkcfFj7mhWMfxrF6nCIOTHXXxJ/tmEfIxTRyjnOSY47HY2H/Whk1xz6M Y/U4RRyY6q6JP9sxj5CLaeQc5yTHHI/Hwv61MnOOO0S7OTZxddRWUF+FQcZcH1Adk/B6MWrD5Gax tDhasfZj0G1jZH3GHBlz3F1i2c2xD4NuG6vHKuUOTGPtw6gNUwWbCccZ5ziW3Tz6MOi2MbI+Y46M Oe4usezm2IdBt43VY5VyB6ax9mHUhqmCzYTjjHMcy24efRh02xhZnyLHHaTgEBnNaiEVdZTqmLZG 4I7BeYFlgaHgiI7yjpEXtHEUXMsx1DBxjS2gjlIdg+9BODpsbTPi7z4XmKOW6hh8T5O/y5EXyHMU NVZ5DRPX2ALqKNUx+J4mR8Yi5tnl2H0uMEct1TH4niZ/lyMvkOcoaqzyGiausQXUUapj8L0Sxx0k eEsSGxARJ1bBihZ3RLYyTLxGQC6j0agvkxMMoiXGMu4WOAE+GY+xcnQZ48CYhwRdAnxaI//tgeO8 5NjdAifAp5FzdBnjwJiHBF0CfFoj/+2B47zk2N0CJ8Cn2XPcAcagr6D+eSn0zAGMgLjWMiLeKcAs BmCwC8AxLMwPsFD26ByGPV8CQwCGGZRbsdKccTStsFnoMDYM/yi7GXOoWuR3tBy1gviCo3sYhr9J eQSLyDHD3Gz4oMhddRD+UXYz5lC1yO9oOWoF8QVH9zAMf5PyCEbCcYcwDE0IsdM2hkaMzGhxhwWm 9R4M4YlfIuJYxFF2FseaY2YSbavEarGmUi+PPky1ze8KHCtYneMw/Ht59GGqbbbnmyMtZpPjLJ4F 5VjB6hyH4d/Low9TbbM93xxpMZscZ/HMP0f5TM9UQyiR1NjbWKJFWJ7kwLSjGON1dGJrDdsmE75C n7FUQLNWyCfkgHE8I+OYTevIf3vgKOUObAj+Pi0wR+gz5iCmdeS/PXCUcgc2BH+fRsZRr/RMWbVj ZgyBlZi4gZx5d0eCeUSI2jANxG16OzrQ/IRKEJKFS4YWXACzwJgHc2AeIdfGZsIxw7Ck2uD8I+TF 5TjjHMtiwTlmGJZUG4y/6rs6rC8UxzamHOHK/Ggow/GXxXg4yk8W4B+zy5kDbyADgXEj2Wph1kWZ sygHZgWSk2Xh28kWlryBsTFz7MMG5O/ygrm01DMsUxwXxxzjRrLVwgbgvz1w7MOG4B/NpJw7zzBX 1HJgViA5WeamZsOx8DPzHI+Eo317E03653XBjGSYyDC0AhNcRuVwkpHIdDkelg2fwNyHm/IgszrL hcjicezDpsFfLC44R8bQuh78oeCaGbYYHDk2L1Q49mHT4C8WF5wjY2hdD/5QcM0Mm1+O9uP0cMqh 5Fhu0GUlQMag1oVx4IHBrmPm21EijEbXt04E5n46sJAosYhn1hwtP1kM5tTN9XHsw0KixEzHJdJC bbQxipUwj2sUHBGX2mhzTIsuzPyuhT+sWLGPRx8WEiUW8cyMY4aR1YJHaLYxj6EDC4kS80igvaAc IYG41EabY1p0YeZ3LfxhxYp9PPqwkCixiGeaHLMvsrBhGTmrWNKHUbSTJjAEzesKhjqXc6yQ0wUi ITKBaY1jBJZFOt8cI5AqRwOrmNZiDixjMRl/inVhOXo7aVY4+rqCoc7lHKOyx4NpATlma3FW5Whg FdNazIFlLCbjT7EuLEdvJ80KR19XMNS5nGNU9ngwjYPjDhqkmoPB8AvhCmZrVUdANYwaIUuYi7ud OuYE0cazCLgzaQ3dwLAcE0esNWHEi+d14U+NslpEjvBWw6gRslPi7/MCc8R6vXLsXsnRonGctxz7 POccdxCzKUEurK5SA2MSrIAUNAKUurWTnToWAmK7A9NaHTOLFiPWfKYQbSWPsNHG5omj15yT2bH2 DBuEf8iqqHmtxDpejubLYmtzdEMVLATWyn974Og152R2rD3DBuEfsipqXiuxjpej+bLY2hzdUAUL gbXyHxtH/UyvUDTzxsacuJJiIOdEyYybykiHuTpGnVDBuCHksAjjjGkx54GphpF79YPKLDgSFoYN cxtYTJ+/u7OGKIdKHRsPR/GDyixy7HJYLCBHwsKwYW4Di+nzd3fWEOVQqWPj4Sh+UJlFjl0Oi/nm uANAMUrSLNiHeecUNgxBBeItLNpyjM8EGFMfRCws6T93dETQii8rj4BjrNuYedH/KfPfHjimgsba tjEEfy0tNkfVaXOMdRszL/o/Zf7bA8dU0FjbNobgr6XxcdRnb5qy/sOhWSXDggkJMmykVKzoGARY xcKXyuWYGYeEYyiHbbRyx7AmY2PiGDqsidLw/N3UAnM0YyKyfjl2SAqLyTHKocOaKA3H32ybLa8v FEfzO6McOySF8XD0Z2+KEfepjQgsHPjCA3RMW/UPjiuYy4SlAst12vLWasZzeWBacD0TGBNHQeC/ bAc2IH/5W3COipn/Cseh+GetC8ox2meUY7Mif4vKMRYzyXHWOiKO+u1NDpiDgAUK0k2hvcBQRic4 lulGg/qx9izICTEjaxWUdJHxgK2Rc+zDpsgf5UXmKFbDZYahPAT/sEDYgnGsYjPIMcqLzFGshssM Q3kI/mGBsBFwlNub0gynVK9hQkqKVGeMPKojc1tgCKATc//WUsXUd5BHR4ZsF48+bL44inbmJ7AB +QsUddgvMZ17MPdhLZ3YDDhKkeqMiVrU4bvEdO7B3L+1bDcca1juJ7Ah+GscCgEL3yWmcw/mPqyl E1tPjharFKnOmKhFHb5LTOcezP1by4g52vv0tKKOrAVGCkzLgSGWkDPjLI96hgWqGJVZ0zDAYVVL TqwSK7XUsTFwNJvmOccsFmAlD2qpYxPwt3+3Iv8LxhGoYpCzOFge9W3lD3kqLRzHWChqNs1zjlks wEoe1FLHJuBv/25F/heMI1DFIGdxsDzq28of8lQaA0f79qaJYgR10irfi1kEjpkCfKlYYAg4sFhU MbegHR7OoWadxZiP8CBdYhUefZjZngVHhcL3uvG3xoXmyJjZXg/+IUD4gnFULFoVWj/+RmKhOVYx s80cTZx4TId/CBA+Ao7y43QPiicoGBYSIBQEYDjDXNow6wi3Z0EDExj23C5h8JDFCn0rFRhWbSxE JIY55OgTxcaxGmj6VhqCv7cEDzVnOovAcUY5jlihb6UF4ugTxcaxGmj6VhqCv7cEDzVnOovAcUY5 jlihb6U55UhXeqHlCoTlVTPrnUKYOcXUwqgDqxjCgIkwapgVDFNZEHehHPP1iDgS5rLryV9btFCK yloL7rbExsBx1jn2QBeYI2Euu578tUULpaisteBuS2wMHGedYw90HBxl0CuFgmEUoZhNjBW6FEKO eVVCyIOmTkSAwNQF/sIk6rDFerAjJdjiWIriXHOUSgeG0lT5wyrVWXchONrEWKEb0tPjbyWTIAyl BeAIhiqRY4EWGEpT5Q+rVGfdheBoE2OFbkhPj7+VTIIwlOaUYzx7s5ANOtxWImXweSd4m1UEgQ93 qDNIqKwpe1tgTtZihg+24T40Mv0bHUfGQn69+bOPReUoNSvA15D88/JictSm0Cnl15s/+1hUjlKz AnwNyT8vj4ejvkTWhPPAjJAZmBwzQjIzFuEp4SCRoaIDCoRpP5KVDHb5HDPCI+QICUez9sKuY0AJ WDP/7YFjHzYc/0yO0EXiqKGaX0az9sKuY0AJWDP/7YFjHzYc/0yO0HnnGO/TgzCSKUKuWayDipOn tYXYjxVGPaQsAYFRYG5BMGEJXy5pmC7c1pg5uq8KNgh/8tSHFYrObBQcKcIWRlH0YYVRbVmJP9fg f9E4QhdL4+i+Ktgg/MlTH1YoOrNRcKQIWxhF0YcVRrVlJf5cg//556jf3iRScJ4LB6akbF3DRJ0I wRyiUTWfJBSQrWLUXMO8g1kgeKh+O9bRcYzmNuagR7Pt/EVkwTk6nwom6gPxp2lhOdawWeRYRBac o/OpYKI+EH+axsRRbm/CmDsWASPvGJTNMQgWGMibBXJosjYFZvao3W1Y58dMshUskmWYuxghxz6M ORI2Tf4eHzwCs9gxBYYoot1tVGJV3z0Y8yBsmhwRw8xyzDwIWyiOfRhzJGya/D0+eARmsWMKDFFE u9uoxKq+ezDmQdg0OSKGmeWYeRA2rxzlfXrqJAQ9CNPvx6yttXalDAPxbIkAYTuzUWBhwCCrCx5l U8sxtME+MLfVhSGecu1Kg3NEPDVM26fM39cOLB7HDEOs5dqVpsZfGhaco/rNAKmvO39fO7B4HDMM sZZrV5oaf2kYIUf9nZ5C1mZrC0p9MYaZDDls4bYCCJLeD2yfzgTEW4bZ2logq5OV0SNet0UYNWw8 HDHVMEIpJp3NvC7CoWGr4E9ivFwojubYJRw2ewPzNy9ah1GTMhO6CKOGjYcjphpGKMWks5nXRTg0 bBL+pLOwHNMaszVZIXyFCV5Ok7950TqMmpSZ0EUYNWw2HPXN6bmWOYy6O4ZJIepgjrk+oDqWBVXF qA1Tixg6roy1H4NuGyPrM+bImOPuEstujn0YdNtYPVYpd2Aaax9GbZgq2Ew4zjjHsezm0YdBt42R 9RlzZMxxd4llN8c+DLptrB6rlDswjbUPozZMFWwmHGec41h28+jDoNvGyPoUOcq3NznkmLgWUlFH qY5pawTuGJwXWBYYCo7EGQWiwhJtHAXXcgw1TFxjC6ijVMfgexCODlvbjPi7zwXmqKU6Bt/T5O9y 5AXyHEWNVV7DxDW2gDpKdQy+p8mRsYh5djl2nwvMUUt1DL6nyd/lyAvkOYoaq7yGiWtsAXWU6hh8 r8RRf6dXXKJiXY6YGVa0uCOylWHiNQJyGY1GfZmcYBAtMZZxt8AJ8Ml4jJWjyxgHxjwk6BLg0xr5 bw8c5yXH7hY4AT6NnKPLGAfGPCToEuDTGvlvDxznJcfuFjgBPs2eo71aKPQV1D8vhZ45gBEQ11pG xDsFmMUADHYBOIaF+QEWyh6dw7DnS2AIwDCDcitWmjOOphU2Cx3GhuEfZTdjDlWL/I6Wo1YQX3B0 D8PwNymPYBE5ZpibDR8UuasOwj/KbsYcqhb5HS1HrSC+4OgehuFvUh7BSDjuEIahCSF22sbQiJEZ Le6wwLTegyE88UtEHIs4ys7iWHPMTKJtlVgt1lTq5dGHqbb5XYFjBatzHIZ/L48+TLXN9nxzpMVs cpzFs6AcK1id4zD8e3n0YapttuebIy1mk+MsnvnnGE9kcUAXaV3FEi3C8iQHph3FGK+jE1tr2DaZ 8BX6jKUCmrVCPiEHjOMZGcdsWkf+2wNHKXdgQ/D3aYE5Qp8xBzGtI//tgaOUO7Ah+Ps0Mo56pWfK qh0zYwisxMQN5My7OxLMI0LUhmkgbtPb0YHmJ1SCkCxcMrTgApgFxjyYA/MIuTY2E44ZhiXVBucf IS8uxxnnWBYLzjHDsKTaYPxV39VhfaE4tjHlCFfmR0MZjr8sxsNRf5zuLTAaUgjetVoYN5KtFmZd lDmLcmBWIDlZFr6dbGHJGxgbM8c+bED+Li+YS0s9wzLFcXHMMW4kWy1sAP7bA8c+bAj+0UzKufMM c0UtB2YFkpNlbmo2HAs/M8/xSDjaWxYSaCMkHMrIyhgZJUzwwiFj4RzlXBZo1M1+1Dows2/xeCzs XysFjz4sfMwLxz6MY/U4RRyY6q6JP9sxj5CLaeQc5yTHHI/Hwv61MmqOfRjH6nGKODDVXRN/tmMe IRfTyDnOSY45Ho+F/Wtl5hztx+nq1NRDIcPCYJgDacag1oVFpzAGu46Zb0fNngUT8tAxecB9WEiU WMQza46WnywGc+rm+jj2YSFRYqbjEmmhNtoYxUqYxzUKjohLbbQ5pkUXZn7Xwh9WrNjHow8LiRKL eGbGMcPIasEjNNuYx9CBhUSJeSTQXlCOkEBcaqPNMS26MPO7Fv6wYsU+Hn1YSJRYxDNNjtkXWdhw GjnrWNKHUbSTJjAEzesKhjqXc6yQ0wUiITKBaY1jBJZFOt8cI5AqRwOrmNZiDixjMRl/inVhOXo7 aVY4+rqCoc7lHKOyx4NpATlma3FW5WhgFdNazIFlLCbjT7EuLEdvJ80KR19XMNS5nGNU9ngwjYPj DhqkmoPB8AvhCmZrVUdANYwaIUuYi7udOuYE0cazCLgzaQ3dwLAcE0esNWHEi+d14U+NslpEjvBW w6gRslPi7/MCc8R6vXLsXsnRonGctxz7POcc5X16KRCOMZIWmAQrIAWNAKVu7WSnjoWA2O7AtFbH zKLFiDWfKURbySNstLF54ug152R2rD3DBuEfsipqXiuxjpej+bLY2hzdUAULgbXy3x44es05mR1r z7BB+IesiprXSqzj5Wi+LLY2RzdUwUJgrfzHxlE/0ysUzbyxMSeupBjIOVEy46Yy0mGujlEnVDBu CDkswjhjWsx5YKph5F79oDILjoSFYcPcBhbT5+/urCHKoVLHxsNR/KAyixy7HBYLyJGwMGyY28Bi +vzdnTVEOVTq2Hg4ih9UZpFjl8Nivjnqq4VglKRZsA/zzilsGIIKxFtYtOUYnwkwpj6IWFjSf+7o iKAVX1YeAcdYtzHzov9T5r89cEwFjbVtYwj+WlpsjqrT5hjrNmZe9H/K/LcHjqmgsbZtDMFfS+Pj qM/eNGX9h0OzSoYFExJk2EipWNExCLCKhS+VyzEzDgnHUA7baOWOYU3GxsQxdFgTpeH5u6kF5mjG RGT9cuyQFBaTY5RDhzVRGo6/2TZbXl8ojuZ3Rjl2SArj4ejP3hQj7lMbEVg48IUH6Ji26h8cVzCX CUsFluu05a3VjOfywLTgeiYwJo6CwH/ZDmxA/vK34BwVM/8VjkPxz1oXlGO0zyjHZkX+FpVjLGaS 46x1RBzt1UJacQh1iwrCHhhhaAUmuI/MkM8iIV1rVoMkGz6BuQ835UFmdZYLkcXj2IdNg79YXHCO jKF1PfhDwTUzbDE4cmxeqHDsw6bBXywuOEfG0Loe/KHgmhk2vxzl9qaIiAy5EryNqXGxEnXG1IPX zWULi4g6MPdvLVXMugymDJuERx82XxxFO/MT2ID8BYo67JeYzj2Y+7CWTmwGHKVIdcZELerwXWI6 92Du31q2G441LPcT2BD8NQ6FgIXvEtO5B3Mf1tKJrSdHi1WKVGdM1KIO3yWmcw/m/q1lxBztfXpa UUfWAiMFpuXAEEvImXGWRz3DAlWMyqxpGOCwqiUnVomVWurYGDiaTfOcYxYLsJIHtdSxCfjbv1uR /wXjCFQxyFkcLI/6tvKHPJUWjmMsFDWb5jnHLBZgJQ9qqWMT8Ld/tyL/C8YRqGKQszhYHvVt5Q95 Ko2Bo31700Qxgjpple/FLALHTAG+VCwwBBxYLKqYW9AOD+dQs85izEd4kC6xCo8+zGzPgqNC4Xvd +FvjQnNkzGyvB/8QIHzBOCoWrQqtH38jsdAcq5jZZo4mTjymwz8ECB8BR/lxugfFExQMCwkQCgIw nGEubZh1hNuzoIEJDHtulzB4yGKFvpUKDKs2FiISwxxy9Ili41gNNH0rDcHfW4KHmjOdReA4oxxH rNC30gJx9Ili41gNNH0rDcHfW4KHmjOdReA4oxxHrNC30pxyzK/0sglBumlqJqMtjOo1jMA+zCe0 lcK1trUar/KYM459WM14H+ZTjrVUUK9ha3TVEp4Uqxnvw3zKsVxlznJcM9CH+ZRjucqccezDasb7 MJ9yrKWCeg1bo6uW8KRYzXgf5lOO5SpzluOagT7MpxzLVabHUQY9NAZYSAnGZm1irNAN6QLzalrq WYPWgFk7x2VyOk5DgjCUMOiTP5eDLY6lKM41R6l0YChNlT+sUp11F4KjTYwVuiE9Pf5WMgnCUFoA jmCoEjkWaIGhNFX+sEp11l0IjjYxVuiG9PT4W8kkCENpTjnGszcL2aDDbSVSBp93grdZRRD4cIc6 g4TKmrK3BeZk/ZI17ARm5jUy/RsdR8ZCfr35s49F5Sg1K8DXkPzz8mJy1KbQKeXXmz/7WFSOUrMC fA3JPy+Ph6O9RNb5wKwZUFOrw4yQzIxFeEo4SGSo6IACYdqPZCWDXT7HjPAIOULC0ay9sOsYUALW zH974NiHDcc/kyN0kThqqOaX0ay9sOsYUALWzH974NiHDcc/kyN03jnqq4VMUg0jtmiHFRBVI9Ze YChLgIxlutGgfig4M+rLlTAjYxWUdJHxgK2Rc+zDpsgf5UXmKFbDZYahPAT/sEDYgnGsYjPIMcqL zFGshssMQ3kI/mGBsBFw1G9vOgUYDnIlBsMw0sJEPQhpPTAO2jSto7owaq5hSdfb3aPzUP12rKPj GM1tzEGPZtv5i8iCc3Q+FUzUB+JP08JyrGGzyLGILDhH51PBRH0g/jSNiaPc3oQxdywCRt4xKJtj ECwwkDcL5NBkbQrM7FG727DOj5lkK1gkyzB3MUKOfRhzJGya/D0+eARmsWMKDFFEu9uoxKq+ezDm Qdg0OSKGmeWYeRC2UBz7MOZI2DT5e3zwCMxixxQYooh2t1GJVX33YMyDsGlyRAwzyzHzIGxeOcr7 9NRJCHoQpt+PWVtr7UoZBuLZEgHCdmajwMKAQVYXPMqmlmNog31gbqsLQzzl2pUG54h4api2T5m/ rx1YPI4ZhljLtStNjb80LDhH9ZsBUl93/r52YPE4ZhhiLdeuNDX+0jBCjvo7PYWszdYWlPpiDDMZ ctjCbQUQJL0f2D6dCYi3DLO1tUBWJyujR7xuizBq2Hg4YqphhFJMOpt5XYRDw1bBn8R4uVAczbFL OGz2BuZvXrQOoyZlJnQRRg0bD0dMNYxQiklnM6+LcGjYJPxJZ2E5pjVma7JC+AoTvJwmf/OidRg1 KTOhizBq2Gw40o/TXaswZiFkVQQcRrM1DNUw6HRhxDUHdbZ0OKay3GlRdszXI+JImMuuJ39t0UIp KmstuNsSGwPHWefYA11gjoS57Hry1xYtlKKy1oK7LbExcJx1jj3QcXDcwVybWigWZlwq6ijVMW2N IB1DHxSY1hljJM4oEBWWaOMouJZjqGHiGltAHaU6Bt+DcHTY2mbE330uMEct1TH4niZ/lyMvkOco aqzyGiausQXUUapj8D1NjoxFzLPLsftcYI5aqmPwPU3+LkdeIM9R1FjlNUxcYwuoo1TH4HsljvY+ vdKZrnmEbGFFizsiWxkmXiMgl9Fo7KwiArT42hjLuFvgBPhkPMbK0WWMA2MeEnQJ8GmN/LcHjvOS Y3cLnACfRs7RZYwDYx4SdAnwaY38tweO85JjdwucAJ9mz9FeLRT6Cuqfl0LPHMAIiGstI+KdAsxi AAa7ABzDwvwAC2WPzmHY8yUwBGCYQbkVK80ZR9MKm4UOY8Pwj7KbMYeqRX5Hy1EriC84uodh+JuU R7CIHDPMzYYPitxVB+EfZTdjDlWL/I6Wo1YQX3B0D8PwNymPYCQc5fYmC0RcbKxcUxAtTEy7g06s MOqkzbbHZRgF5hYEs94BUZM0TBdua8wc3VcFG4Q/eerDCkVnNgqOFGELoyj6sMKotqzEn2vw383x A8ed2Xz4hLObD3/+HNc3sTnmCF0sjaP7qmAd/Lctx+SpDysUndkoOFKELYyi6MMKo9qyEn+uwf/8 c4xBjw1a0FXMDAPLAwkskS+DjHWQa629IyxU98VkA0sFNGuFfEIOGMczMo7ZtI78tweOUu7AhuDv Uw/HTQ8/0hzx+XOaD59wTnOEDXg+6HE8c8oR+iXHbOrhDwPO0dWpBGwC/tsDRyl3YEPw92lkHHdA oB4gzYwhsBITN5Az7+5IMI8IURumgbhNb0cHmp9QCUKycMnQggtgFhjzYA7MI+Ta2Ew4ZhiWVBuc f4S8uBxnnGNZ5By/d9bFzREn6AD34c+f3Rxhcyo/8ODDzoM5MA+x7nHOAccMw5Jqg+VY9V0d1heK YxtTjnBlfjSU4fjLYjwc9cfp3gKjIYXgXauFcSPZamHWRZmzKAdmBZKTZeHbyRaWvIGxMXPswwbk 7/KCubTUMyxTHBfHHONGstXCBuC/3DTv/+wPZaCTqzubZfDzAfCc0lzU3dUcc+zDzAR78QbGVsM/ mkk5d55hrqjlwKxAcrLMTc2GY+Fn5jkeCUd7y0ICbYSEQxlZGSOjhAleOGQsnKOcywKNutmPWgdm 9i0ej4X9a6Xg0YeFj3nh2IdxrB6niANT3TXxZzvmEXIxjZzjHOT4wyecZQOcXs3FlR21nXBO84Nz LxktR9PqxDhWj1PEganumvizHfMIuZhGznFOcszxeCzsXysz5yhXetGIEhy1FdRXYZAx1wdUxyS8 XozaMLlZLC2OVqz9GHTbGFmfMUfGHHeXWHZz7MOg28bqsUq5A9NY+zBqw1TBZsJxRjn+zWXX+BWd rmnAS5/hoU2u8hRr8yC7LYzimRHHGua4u8TSsBaPfgy6baweq5Q7MI21D6M2TBVsJhxnnONYdvPo w6Dbxsj6FDlmX2QJszqq1jEY5XbSBGZEs3UFQ53LOVbI6QKRGHmOFTWOEVgW6XxzjECqHA2sYlqL ObCMxWT8KdaF5ejtpFnh6OsKhjqXc2y5eeuRJ8mAprNdzVk5XdVFG764ktrOad7y0W+OhmMm52tx Vs2jgVVMazEHlrGYjD/FurAcvZ00Kxx9XcFQ53KOUdnjwTQOjvo+vSw8cyOyEK5gtlZ1BFTDqBGy hLm426ljThBtPIuAO5PW0A0MyzFxxFoTRrx4Xhf+1CirbeN4/s9/0zzpGfs2/2/HJZeZPUd4q2HU CNkJ+fsVnVzF6UBWfn7ng5x9UzOuANM3NuefI2PwTeZ9vV45dq/kaNE4zluOfZ5zjvI+vRQIxxhJ C0xHTARlISFAqVs72aljISC2OzCt1TGzaDFizWcK0VbyCBttbJ44es05mR1rz7BB+IesiprXSqx9 HH9x4R+anfd6ffMfO25s/mPDxuY/dlzSss3/T9qXmic+49Uz4Gi+LO42RzdUwfr5X/nXm7KBTa7o bNArBzwf6OwzPPwmL8m875gfVnlEaG1svTjy1I9pLBaJylp7hg2S45BVUfNaiXW8HM2Xxdbm6IYq WAislf/YOOpPFvJ2l+vD0OiBWYtW25jWezDV9qAZ9RpWWTzQqWFmEm2rxGqxplIvjz5Mtc3vChwr WJ3jMPx7eVSwhx9+tNl174Plyk0Gtg0bm/+3YUkHNRvcUj0GPwx4OXbjP24lH+ZvII60mFqOj/4a rtjSlV38vs6v5HjAo29meh1t9tneI48+NhGPPqwWayr18ejFVNv8LtZ27Jhqm+355kiL2eQ4i2f+ OdpbFnQR8lSWQjcmfyqSYYagAvEWFm05Jh1dwdQHJ8Et6X92BkFyRXxZeQQcY93GzIv+T5l/yfG+ +x70gSsNcDrIpUGrHMgUS+0ZJmsdGHlQjCtAxdaTYypoPto2Sv4mnmEpng8ed0Zx2xJXbTGA+RUf cBoUs8/zMGCeoLc254Fj3pZjY9yOXbzAajzGwjEVNNa2jSH4a2l8HPXZm6as/3BoVsmwYEKCDBsp FSs6BgFWsfClcjlmxiHhGMphG63cMazJ2Jg4hg5rojQ0/0su/XPzhKfvYwOaDlA62LWv3hRLV3cl pvIY0BiDLRn8ikET8/5vPHJQjtua4wc2PezfsMSXUWLQ48/w+j/Hc338XMGu9n5/xfUz5xju4MNk CDPjkHBMy6HDmiiFX2hMK8dm22x5faE4mt8Z5dghKYyHo9/eFCPuUxsRWDjwhQfomLbqHxxXMJcJ SwWW67TlrdWM5/LAtOB6JjAmjoLAf9kObAr8z/vZJc2OexyoV2R2WxJXY3olZldrdCXmV2oYsLJ6 DGQqHzoxBwbbYaccNDduM8dp5/j0n1xqV2bllVoMYHxVx1h+tVfc0iywWXI0j1SCPcZynba8IfBf tgMz321MC27TBCbib1bkb1E5xmImOc5aR8TRXi2kFYdQt6gg7IERhlZggvvIDPksEtK1ZjVIsuET mPtwUx5kVme5EFk8jn1Yjf8tt97V7PGiN8XAxJ+l2VUcBh6/IuOrOLoCiwGrwHBl5wMoDXCOWZv5 ZyyuGNvY43feZ0WOjA2R4w8ff0Y+MPkPyunKTn56kN++FHl6hibqdUw/D/z8ST+fCUf3Sfg8bceM TcJfLC44R8bQuh78oeCaGTa/HO3H6eGUQ8mx3KDLSoCMQa0L48ADg13HzLejRBiNrm+dCMz9dGAh UWIRz6w5Wn6yGMypm6tx3Lx5S/OU3fb3Ky4MIjEY6ZVXHesaxOIKLjAMljnmgyGuEv1KD4NY6OBK zmOywTfiopgsxquuucG7oMY/ugcSJWY6gbqNdh7TYtmemlIMcHY7M7/Cw1UabnXiSpAHO8jpbUyX hz27JYqw14tjHTO/bkUx2B1yOwbch4VEiXkk0F5QjpBAXGqjzTEtujDzuxb+sGLFPh59WEiUWMQz TY72Pj0ToAAxapaYlgOTkgcYmP2bY6tnWKAeUwUzHtoSC2jqCA9ZlJhHHzYGjmbTPDt2w99vbh6H qzEfWOw2Ia7iskHHBizG5FZmG0MZg4+3ZXUeKEvZwNw/D3Dul3wRDwysPMCWHIfO8XV/v9WvujBg 6WAWtzO1HINYDUNdrwLbtzDjKpFlz27zGIDjPGzHXht4P7Z/tyL/C8YRqGKQszhYHvVt5Q95Ko2B o31700QxSjpple/FLALHTAG+VCwwBBxYLKqYW7CzDXcONessxtDxTrrEKjz6MLM9C47/d+Efmqfs up8POLji8YEBtwWBoc0GF/4CimO4sjM7PuPqja6wMFjp4MSDWYFlgxlhNGhioGOMfa+W48tf817L FToz1tU89mHW70d/9dxsMMNgFbcsYzDLsfjiShXDgEa3M7PBT76tqYNl+plCxKqxTZMjb6sm7rqM mThhsahibqG9HSsUvhlTk9Pdj43EQnOsYmabOZo48ZgO/xAgfAQc5cfpHhRPUDAsJEAoCMBwhrm0 YdYRbs+CBiYw7LldwuAhixX6ViowrNpYiEgMc8Dx8iuva571wkNsoImDvg8UfpUTV0h+tYRBij9D wxVYFcNAY3aLqyxd51dymYwNQm63GGTx2VwMkoT5YDo9jsjjtuT4A59Ln9fR52o2OGHAyjD8pMCv 0GIw858bGBaDGr6wUrnlyfr2nM3gYaUpcNQWoMNsx+W+6hPFxrEaaPpWGoK/twQPNWc6i8BxRjmO WKFvpTnlqJ/pGYgpN2aKwNQaGaXQwr83RDnM1THtzC6MG0IOizDOmBZzHphqGLlXP6hMkeN9921q dk+DGx285baiX8kUB3q+8gGGKyhqUzzHYpAqbBRYe3DSssywaxjkNGazi0HIBqa4kguOR33upOb+ BzbJVavzmCLHx+30qlXn+N/3b/JBKvu5QTbY1b+AApn44koMWvisDnohb5/ZfSHkgGHwO/Onl45i O+7DuIGxMGyY28AiHE+Lv7uzhiiHSh0bD0fxg8oscuxyWMw3R7m9iUYH29HkZzSYGCt0Q7rAmDx1 GDpSw7IlYeoCf2ESddhiPdiREmxxLEVxmhw3bXo4rlTkoI0rFRtkcHXDmF9R4conMB0gCiwbPNRP DFSFbx4orE1lMECZb7QhHvbDGA04jL1if7vlaFnifHAeh+J44a//tGKOjzsRg0wMZH77kq6+fDAD RoNTfD5nV3r8pRQMcHyrExjr8MBqdemdOdqOQ2JK+6pUOjCUpsofVqnOugvB0SbGCt2Qnh5/K5kE YSjNKcd49mYhG3S4rUTK4PNO8DarCAIf7lBnkFBZU/a2wJysxQwfbMN9aGT6NxDHyy7/a/OkZ7w6 rkKywUJvx2H2KyocsB3LB6Vcrxyw6IqHBgX3DVkbTHTAiIGEMbR7vL6Odh1MIhb4fd3hn/L+pOSs Ko/vP/JLg3Hsy/HHvhDfxvRBDQOTfy5XXvnhyyiK+YDoV3B2tWify6lsXEVmbWLTrvroKvKwI06c 2XbsbVYRBD7c4epznGMhv977MftYVI5SswJ8Dck/L4+Ho71E1vnArBlQU6vDjJDMjEV4SjhIZKjo gAJh2o9kJYNdPseM8BQ4XnrZ1c0z7MHJcnC1QSy/IlFMrz5yDIOg6sbBOsP8SouuBKFvV4dsG4OS DBx+pZgPBj541jAMaBYT2wTHz33x1MHyCImhOD7v5W9p5ZFz7IMP3WrE1Z8OcvFbuxLDtywZiyu2 4qqQMWrPryz1zeiIcKjtOMeG31ch4WjWXth1DCgBa+a/PXDsw4bjn8kROu8c9dVCJqmGEVu0wwqI qhFrLzCUJUDGMt1oUD8UnBn15UqYkbEKSrrIeMDW6jn6QMBXSXxFUmJ20PaDtA90GMwC04M2DZY8 4OEqKNPJMb/6sYO/YjYIk12+ovKrKmr/1vfOa7Zs2TqzPP7txpsH49iX459ddIVdcfFVHZVl4Ktg PuhhUItvdsaAVv6cIW/TAVOx9xz9A++RobbjEkN5vXKc7at92BT5o7zIHMVquMwwlIfgHxYIGwFH +Z2eNMMp1WuYkJIi1Rkjj+rI3BYYAujE3L+1VDH1HeTRkSHbxaMPq3F84MFNejD2W252cLYrjBrG A5sOXDHwMaYDox2o/QDOWPvqkO2UWDZ4EJbKrzvsE81jj21emT/lY/g8qu+EbdjjoG3myBjspC+6 tDhqQFJP397MB7O4lZkPbDn2yCOPNtfdqL/piys3HfhwlcdXe9kVoN1KTfOWrVvWZTuehxzDVmAa 13T5axwKAQvfJaZzD+Y+rKUTW0+OFqsUqc6YqEUdvktM5x7M/VvLiDnK7U1PoHpy5zkGPRjHRpVj TDrDFLGAGDN71O42LOiYSbaCMUmY1vX0OO72/DdmB1o9wNpVh1+REWZXKopFuw9kdBtPBj4+kHdh NrBqW2B6wNdY/vfAD2wTf8+BSgVm+cEUmPUZtbuNSq7Udze2MscCs9vDmou44tO+BLbUnH7Or/J4 KccPPfyof87GtyL9FiQGqRPOyPi/81Mnhw5fCcIGfzMUV3ewaxjzX4/teB5yrK7a2DT5e3zwCMxi xxQYooh2t1GJVX33YMyDsGlyRAwzyzHzIGxeOcpPFtRJCHoQpt+PWVtr7UoZBuLZEgHCdmajwMKA QVYXPMqmlmNog31gbqsLQzyxjoOuHmizW5ElxoOiHIANwwGcr1JksIO8zaaDATSubDY27zniixrk tPn72oHB84h4gH3m+O9lg5gOZBj00TdRzjAe+KyfGZO4Mv7B7Zivn+e3HXmQOvWcX7sM88+v4uw2 p3/BBTYC8y+w2KB60813zGw7zjBZBrYeOWZM26fM39cOLB7HDEOs5dqVpsZfGkbIUZ/IopC12dqC Ul+MYSZDDlu4rQCCpPcD26czAfGWYba2FsjqZGX0iNdtEUYNmy7HM8/9Vdxuo9tqMajxZ0x0dWeD X2A2WPrgh9tycbA+8bvnKvf14k9ivJxmHjHVMELpBIKvdIsTDvSdn0ygf+PEA20YSJ/9ksNyjkWO 8RleuoVpEi3+Pzw/vXEBg559TueDX35bMxv86KpQOLtfnbUeca05jxaoSxQcMww2Co7rkWM1B4lp 8CedheWY1pityQrhK0zwcpr8zYvWYdSkzIQuwqhhs+FIjyFzrcKYhZBVEXAYzdYwVMOg04UR1xzU 2dLhmMpyp0XZMV8Pw9EPwsUVB1+RZJhdefABGFctfBWY2oIHwreCBeM8LOap8dcWLZSistaCuy2x SfJImMt2cLzzznv9Kg0nGn77l/rR+67Vt3TS4bO2IbYWjwn4xyDHa3ypJb4ggx+xx5dmtP7tMy8m /gPkcRXbcQuDThc25RyLvjubEn9t0UIpKmstuNsSGwPHWefYAx0Hxx3MtamFYmHGpaKOUh3T1gjS MfRBgWmdMUbijAJRYYk2joJrOYYaJq6xBdRRqmPwnXikL4fgakOvNDCw4SqErz6Kqw6+QuErGMP+ dcsdM+PPHDOsyOOjj21unrzLa5zHVt9IQ0f+mIfD1jYBx2fufbD1L18N80kGX1Gjb3kAzLHIzcZV 878/vUTWBjkZ0HArlG+L0hdXuI5bpjWO8MS1HEMNE9fYAuoo1TH4rnGsYVpnjJFtzzHMcS3HUMPE NbaAOloXm6OW6hh8T5O/y5EXyHMUNVZ5DRPX2ALqKNUx+F6Jo71Pr3Smax4hW1jR4o7IVoaJ1wjI ZTQaO6uIAC2+NsYy7hY4AT4Zj3Xi+OKld2QDnxxQ/VZmWhPmbXYlmMnlg6R+DgUu68C/g+NN/7i1 ee5LD5uI4y7Pe4OHpuuIMePhMhbnBBzzQSu+rOIDXInR1XaG4danYV/42mnutMZfKhaH37rEVZ79 xMF/jI7bmo7ZFR9+CnH82b0c82mNeVzjduxxsCVpT+uIkcNuYVUZ48CYhwRdAnxaI//tgeO85Njd AifAp9lztFcLhb6C+uel0DMHMALiWsuIeKcAsxiAwS4Ax7AwP8BC2aNzGPZ8CQwBGGZQbsVKU+ZY 3obTK40Y7PTAS1cdPrgRRu0qt9R87OgT14X/w4882rz2sE/4AOY8aKCblOMVV11vgeZ59GjRb1l7 P8c04Bz6wa/biUH0VwxsuGIGRicQFjuuqMEhTjyWEG5vjv3pLHS7EgOhDnr5Nzr5Fmhq35p+ptDD Uf1beY15hB21wTzcQy9H9+txmEq2MD/AQhmew2ahw9gw/KPsZsyhapHf0XLUCuILju5hGP4m5RGM hKPc3mSBiIuNlWsKooWJaXfQiRVGnbTZ9rgMo8DcgmDWOyBqkobpwm2tM8cLL/lT68pCD7DFAZcP 0NkBPMcw8CVsavyXl5sDD/24DVIYrDB4sd8OrODRx3HFPHp/VjDi+Ne/3eIDSRpEHv/0fWwg5sEr BuoYpMs1xdjCNjYb9jiQYuKO1djyAc2+xOK3MXMsbmnGINnH0XrKMF2YJP51nWF5jFAOHyUWnnqx wqi2WLxh3TEKzC0ItoocmxXDdOF+VsWfPPVhhaIzGwVHirCFURR9WGFUW1bizzX4n3+O+mohIgXn uXBgfjmrgm1M1IkQzCEaVfNJQgHZKkbNNcw7mAWCh+q3Y11PjhgcWoMHPo/C1VwnxrftAvvPZ75m Vfx3ewF+Yxi3IGPw0kED/nTwyK/sGPOZY52A4wGHfCzrmyyP0dzGiKMPMvTV/w8ef1bBY0KOGZZz xLovx1dec1M22PlA51d0hmXf3jyn+fEFf+zliHUtj4qu/3assZqdKkbNNWwVOXZUDG4DfxFZcI7O p4KJ+kD8aRoTxx3Mji5U0mfGIrAcA1k1jODgSzuQMUzaRP683WjDT6gQXbWHDnItuABmgTEP5sA8 Qq6NTYPjY5vxRRceIHBllw8QfNDmgTA7QPs3FZeaa6690fnfcde99oxQumr0Kx4MBDHnmJZ9sCC/ GV7EGwNMYCtx3LwlPYHE+jmyOlGO/Usifvswfv+25yvetQqOwGJgDrzNvy/HHzrujPiGpg+C9Dke 3+JM78xbgWOG2cbH2ypvpyJHmJbb2DS2Y1eIaPv31QzDkmqD8Vd9V4f1heLYxpQjXJkfDWU4/rIY D0f9cbq3wGhIIXjXamHcSLZamHVR5izKgVmB5GRZ+HayhSVvYGyOOO538EdjAJODagxkfpWEgU4G izYWB2e9CvOrFJS7sEIPtvyA7zGRPAYu3Ab0QRdlYDwgx2DRx/Gpu+1v/Td5jj9w7OnxmRldPfls gx849HHMMebYzf+jR32jM8dbtmzx2Px2pn/eF4Pg4eltCj0cM9Nzuh0XjjOsmsc+bAj+0UzKufMM c0UtB2YFkpNlbmo2HAs/M8/xSDjaWxYSaCMkHMrIyhgZJUzwwiFj4RzlXBZo1M1+1Dows2/xeCzs XysFjz4sfAzNUa88aACyqws9KBvmg0gXhno56MRVTVxpaZsfwA1DPR8U9ACfD2iINQaGKlaLdQWO P7vgdxPn2D9Hoy+R4G0IcdWn68M/+u1+joQJnjDvr37+HCsm5PhrJ/+ffXYXtzsRcyqvxNEsrbCt 9mEU28DbcfAwC1XM1h0Yx+pxijgw1V0Tf7ZjHiEX08g5zkmOOR6Phf1rZeYc9c3p3ogSHLUV1Fdh kDHXB1THJLxejNowuVksLY5WrP0YdNsYWV8Hjlde/Tc6uPKVR1yVyYGaDro+4GSYDSZ0JeMYBhof lGjAamE42CMWHQg0nrVi1jYBR3QU9xjn8X1Hn1x8RhZfGvGfCOBWp3/ud3bzhJ31fYfMUfvQBj0e lDt5tLEnPH2f3hzjyi5ux57TvPvTp/RydCO+nXRj0G1jZH0dtuO+fZUxx90llt0c+zDotrF6rFLu wDTWPozaMFWwmXCccY5j2c2jD4NuGyPrU+QY396MsLRcjODsMhtx6S/DjGi2rmCocznHCjldIBIj z7GixjECyyKdCcctW7c2T9ltv8pVRwxmelUSB2Y9GPMVXjFwMUZXI34FQ7I6wEC2C8NBngcEDBqw n2OoR1w2mK2S4+4vOtT6HVOe43iHHT4n458F0NWeD4CBdXK0QVcGN+u71fDfsnlrlmPO/7U33OxX fWlgDm7dHIFpLebAsq1xJttxHSvkfC3OqhwNrGJaizmwjMVk/CnWheXo7aRZ4ejrCoY6l3OMyh4P pnFw1PfpZeGZG5GFcAWztaojoBpGjZAlzMXdTh1zgmjjWQTcmbSGbmBYrgfH226/u9n75W+1qwMc SGlA4CusEuODrF1d4CqFMW0vMAxofPA2DAMcMBl8gME/Y/DFg1kxyJVXctPi+NDDj3iPa5qis0/4 pj4Q2m8d2g/C47M9uwL0z/gUS9qvOujDLY5yolDluDr+knnfVvLt+Ijjz2w+dEL6mYJhCnVyBOpy M9qOGYtYolbDahyxFqy4XebzFPm7V3K0aBznLcc+zzlH+cmCjLAurK5SA2M6YiIoCwkBSt3ayU4d CwGx3YFprY6ZRYsRaz5TiLaSR9hoY2vh+MADDzWvf8un7CCIqxk7OGLQKQ+WhuFg34vR1Vg+QBCG Kxge+KytimUDDN3is1t4etUVsoEFx8Pf89nmkUcekz74733fMwjHdFuyL8fpiSa4vZlf1fEXSQz7 7A+yHCtHxML8jeMK/LtyfMjbjxrldlzHKFaKo8S01ocRR43U2zNsEP4hq6LmtRLreDmaL4utzdEN VbAQWCv/sXHUnyzk7S7Xh6HRA7MWrbYxrfdgqu1BM+o1rLJ4oFPDzCTaVolxrGk+9B1HZ1dFeoXA B/sOzA/wOHAqhsFAbRZ2cLAlzK8q0toxHJQrmB+w4+CNmTGU/QBPPF688Z3NLbfeGZ3jfRx9g2ko jt8+5fzOHP/tH7fp52blA57p25xpVsXQS8ULLvqjDbTJV8TG/NeaY413/rZjxrryqPUeTLXN7woc K1id4zD8e3n0YapttuebIy1mk+MsnvnnmH2m50IYaWtYokVYnuTAtKMY43V0YmsN2yYTvkKfsVRA s1bIJ+SAcTw9HPd4yZvsgGYHN1x9ZAe74qBeHqyLA36OlQf8Qt8Own7wRRtmx+hWIWFqJ24VBl5g rrvUPPVZ+zf33Hufdd/a8/iLiy4bjKN7quT4g5+znzKUtzVPOKd5/7Gnt3LMHIfK8X/sFG/J4O3Y p4G3Y+Yo5Q5spRz3cezKsTx31QxZmO0OWEf+NY6T5hEczZ3HCTslj2xaB47R75Ntx+khFaGPvrFy uYbfBdiOrWjP3jRl/VeHOio6YzOsJHw0VU8RkJUBSR1htLDwpXI5ZsYh4RjKYRutYT+znWHB8YEH N2U/4tbbfXamLgMCnfnzAGFlHJwVg2y+8wQWA1BgGKBsIy12OmAuCz2XQcywwTEGj8DqHNEn6KPI cfT5WvL4uJ1eNQjHp+3xWndey/GHim92plue3RyJSDq4D5TjW2+/y6PE5OVt3I61zfAJOK52X9U8 rsyxluP0/FaNyyNVo1Qajn/Ow+vEcbV55GhgU8uz4qh+V3uskkGv1TcUB+3HwDw2VBmXwrAct3U7 Dnd0e1OMuE9tRGDhwBceoGPaqn9wXMFcJiwVWK7TlrdWM57LA9OC65kAc6yeEdmg4DswDsrAfEeI QSTHcKZlmMlGHeXYEBmDTraRZnbKHdHKnZj5xIBiZ30+8Fnbzy/4XSvHmj+s85xErjgv0abrprnv /gcH43jvvx/ozPE3Tv25D3zpqm812/HBb/20+Zhejrlvoh+tdRu3Y1hcDUd4kL+eHKen5kzKsSvH mX+PCF4G5G9W+jhuax6zeGfB0RbYjyTeCY5VeqUXLHI+0QbPEXMun7UOzFEx87+KHAeP4GKvFtKK Q6hbVBD2wAhDKzDBfWSGfBYJ6VqzGiTZ8AnMfbgpDzKrs1yI1Dn+/aZbdGOxMyVs+Lq2DamCYSPz M0PH84N5huGMmK+0IO+YteFMjTC3V8NsBw3MBjry5QMfdmgMJsTR+47yNI087n/IkYNwTFchfTn+ 0PFnNVde+881bcfTyPHpZ//SfaJv1LrWPYoMy3nAQMQaGHDmAX+TcBS8J8eTcFxpO776r39nAhHV OvEXix0cJ80j+Ig2xcr+KZCsvhI2DY7lfqzbafexale50tO+kWh8+7Bmi1WLuU9grr5OHBlDK0XR mWPGwcl+nB5OOZQcyw26rATIGNS6MA48MNh1zHw7SoTR6PrWicDcTwcWEtqw4dkHxAbuG7/dGvCN qWvHoAOyY6HDmO9gOPOyg3ccNEKHr3JS2+4vPKS5+ZY7nEcWr+2gvqNmXArM7NWxpeYFr3wb9VD0 +zTyuBJH7LQR12QcjzrhewgW/60cB8Y8sH3VOf75quvXlOM01/irYT0zp0DDb2Vb7cNCosSYRz9H VWtjZ/7oV70cV7Mdwxdi4FgRYw0Duy4sJErMDK/AcaU8lhwzy2ZP2pyHLdeNI3is7li12wsOziw7 D7LpMfdsx5BCYx+PPiwkSiziQXSwkWNQ68Jyjv//j9OpHDuwbSi28aBddwrCcMD2M0I+gAeGOh/Q fUOVeuBPfsa+zdatW4OmJbLkmKb7H9hEO6wdeHww4PjDT3aQKgYc5r91q/Uf5w/rbcjj5TKQmH8+ SJY8gKF/WnG3OSKArhzn2OTb8WpyvFzpN/A/+7yL/IBqACKp5lhrHCOwLNKpcJQ2WvdxnGQ75hx/ /DPf7N2O1XEb0xrHDyxjMRn/KXBUZc4pr8VZlYeBVWwaHFd7rJJBT8Ixv9QnqHM5x6js8WAajuNa t+MatoNpwTIJw5t7rWMyE2YKHqOFCczECYtFFXMLdrbhzqFml7WMofOcdIlVeBh2/Fd+oBsI7wA2 65kfNqi4UtGNi3aQEssOAoq9Yv/3Z667OCoUMdf477zn6yxGGwj4FiK1OYZYfefGgSoOXOA4VB6f +Ax9NBj7xqDCB0/lETGvxPE/d91vxRxXMQuaOZq46/bl+GX7vLubv13dYRBIOrU8TnM7rmJmu49j anvOS99c5VjbjjUnOBEIjoyl9jKuofkbwU6O6X+1HDli+St4KLR+HJ2Hxev9vcKxCrc3zULRN7Go YlZab44ZZrYdM4U81sA8FMP0fXoIiicoGBYSIBQEYDjDXNow6wi3Z0EDExj23C5h8JDFCn0rFRhW bSxEJIYKRz2I0hmTrXFGlWE4AEu7HqD1AI4yNsZ0UH6NeliBo08UG8dqoPNPV4c+EHicxCHDbMYB nOOvcDxNPpuCr+nl8cFND+cHShxoMDgQVufRzfFfN6dbweqc+y16zzZSjjeiC8ylFdv39Ue0ctzH /yWvemeWf2wzXXmU0hS3Y2uYmOOmh1JOVt6O9USDTqBaHOlEZceNcmKG2DjW8NzFcUr8vQW+7KHv q+AIvXI79on8ryfHbB+Y4Filg552ituTNWJsb8cWQpX/enC0hom3Y8QKHRExjvqZnoGYcmOmCEyt kVEKLfx7Q5TDXB3TzuzCuCHksAjjjGkx54GphpF7wdJXzXWDpwOv7eAy+06OHSXagbUHGC0/+uhj TKnNkbCI0zDi6IDx+Pq3z8nixEYvsfCZIGHlgauLI3yiy7TezlUfxg0oHv7uz+bxUT/FGWrwYKyP Y+r3LOBKjnWVgNVtx8n3hZdcXsGU/79uuSO2Dd8mYhAQSXeIRcQ6ze1YV5Nx5O1jku24kyPySNtU erRcOF0f/jWOUFktR+h1bcdaYKfrw9FPGic8VulPFsIcDLlL49iHccN6cBQ/qEywHWs5zDFmtzd1 4WBBuA/zzilsGIIKxFtYtOWYjMoVTH0QsbCk/9zREUErvqy8Asdd5Pd8tkPwARll28iw4zvmZ1eG 8Q5lG+qkHGPdxmr8s1gRHwaMCiZnuSVW4Zh+2zhUHuEbZ9c4mPrBkwbpVqw9HA95+9Er5lhjRZAc c3D0VQVjjppryzEOqsi/xVXjb5b0f4DteCWO5//sklVtx+lWchdH1WnnER7Xmz/nCqtJOHIeOcew WeMR6zam5elyBA/d9mnw7tiPd3t+8eN06psaR/mr7MfryZExjadtg3n4qoLFszdN0G2TULSVCBlF AIbJzEFZsO7DHeqcYkDVlb0tMJTVXvhgG+5DI9O/KXDUjSZ2EN1J9OzKNzq/xaB1nv2KijbSNH// zJ9XODL/6JPV8N+06SGPF4Os7gBxYMri9fXKHNOtSbimwFeZR8ZU/prr/0FXCxGzDngWl+/ItHNP wFF8rpBj9Ccw7mON0RDrY+b/ze+d25ljbkuxrSaPFpn+TWE77uJY5rhvO05vClGdDo5Ze2DX/+1f Bcf14c8+kMeVOJZ5FEUJEWuUMZsP8Fonjr7dY1/1wbu+H8ug17Mdc3zMp+Sfl4flGAh8hC9g7F/j rnO0l8g6H5g1A2pqdZgRkpmxCE8JB4kMFR1QIEz7kaxksMvnmBGeIsfvnHK+bmS2Y6SNLQ7MepDl M9zsIGwHE5xx+ZWLYekbk+CIGDyirH11/J/70jf7jsADRewkdrbumA0WE3BsxYL4JshjjeMJ3zxX HiX2X88+KItHDkZ0Np7xwMGqhhUc/yP9tg+xiE+Lo5X/ybfj9LqoSXOMg1JYyQz35nGa23HJ8aX7 vLszx7XtWHWbZp/XHVHliIOuHnhJH08BWjf+3XlciWOZx5hW3o7Xk6PEXu7HlMdyP/YrPe6fMk7H 3HuOebWiOwDHfqw7x4iOOeqrhUxSDSO2aIcVEFUj1l5gKEuAjGW60aB+KDgz6suVMIzmWkFJFxkP 2JoOR9m47GywPNhiQ/ODru88OAgEFgcMbdtlr/TMwh6OfVgP/ySHM1ecvYpPcKjxmJDjiSel1/ag f+OvFWsfZjz4/XgfOuEsi436DDsvYqa+A5dJOF5x1Q0aSU+OJ92ON216eFU5jkGvzd8qERKarH3a 2zE4rpRj3o73O/ijlkU1WuMY69iGRH/HpeZj6ScM68SfOWaYfQTQxbGWR4+V/sx7nUcfNkWOHvOE +zH/OF0i8g2EYu3j6O2uEdhAHMUq2gsM5VqOQzca5Nmb0gynVK9hQkqKVGeMPKojc1tgCKATc//W UsXUd5BHR4ZsF48+bFKO9/77fj9zlx3EDshxVUKYHQCiPTDd2exAbdgjD9tzC8GS+nJb+J/7k1+H f965+YBV8JiU49rzqDHfcNOt8WJYeVuCDoCvOvQo65v2wRWxR3w51svRfzrQnWPU0b8lluY06InN iXPMP043H6vM4yTYpNsxnq85SY4TR+jB50c+/Y0Kx7L/eUBZD/66rXGsZR77ONbyqD7ME/EPHup7 WvvqJJjwyLbx7jwCS7/TK/tGZ/VRxdy/tawzRw2F6oxRrGWOGdMZD5y2ijqyFhgpMC0HhlhCzoyz POoZFqhiVGZNwwCHVS05sUqs1FLHpsQx3T6Ug2l21YEyH6i5HDsWztJ0A8WOpwcH5R88psVfD0C2 M+CglJ0dMg9rm4Dj43feh/rGe7M/j8YxvWTV35KQvR5Ir/wQKw6ssuZ+LHhMyvGFG99pfRkxlzk2 FlrPsBj0Js5x8eN09d2dq748Sss2bMeXXf7XVeX4jHN/JTaYf5paHIvtWLHoj6c/93UW4frwt3+3 kv67OHblUTQl/2YrFuF3gH11JY68jce+ge29vR93/jjd/CtGZcIy/pCn0lAcV9qOLVCOVOsVjvKT BQUUc4GQXQEjg9nalTIsiNDSFujQsImJMO4JgawueJRNLcfQBvvA3FYXhnjKtStJm+8gfv/cNjw+ CNgVRhxcdEPEQQMHDpXX+YSv/tDjmSb/hx56xGPwGNNO4vEVPAhbieMdd91L/ebB9uZRXwcUrwTi QU/bz2k+cOzp5CvvqzizJR50IK5jweOxxzavmGNgET5ub06e49RW4y915GoVedyW7Xi1OYZtz6PZ uuzya1fcjsWXt+NuBmIeiL+vHfC2Lo5deXT7K2zHiKeGaft0OZbbsW7b3ftx9uP0Vt/EosxxUFl/ jjmGeMq1K3Xuq2nSnywoZG22tqDUF2OYyZDDFm4rgCDp/cD27ewAHZxjtrYWyOpkZfSI120RRg0b nuNZ511IO0ocXHXnsp3edqjA7CDjBw3FsBNiTj9AH4L/S/d5l+8sODjlZ8AUq9Un5YhwannElIqf /up5/j48fS0QDXp4Czp93rfTXgfHgUriNZ8cN3Z+78OCox8YNjZHHfdd75aVcgwR1GXQ6+DfleMh 8uiajmG2JivA1yv3e9+qcnzXPel9ixqbusz31ZJj13aMPMkg6pxg1FkQj+Co2CT8SacjjzWOfXmE K0Qp3jyuOkaohQyJaXDU/PJ2jDzqXN+Pd33+G6vbsdvvyfGsOMKxSzhs9hiDjQ6O9Bgy1yqMWQhZ FQGH0WwNQzUMOl0Ycc1BnS0djqksd1qUHfP1+nH0HRw7va+xo9FZMA7afNAhzGU3bGyetvsBiH6q /CVm8+Gx2oFJ5hLzs8eVOR4jD4Qmx8gjujBd5eGt5/5Znr0B3W5tahl1e2feCWe1+tH7rtW3dCDz WdvWmmOVaZpND+qTZbr4lzlO8+y3Y3slzYQ53mmPg1r6Hoa13X7nvRNvx3IA3nFjc+31/xyWv7Zo oRAtOa60HRdGLYx8O9Z4CPNAh+MY271xKfNY5Dj9OD30teAhZet2jqv814Gj6id5bWzF6gFWMOhY mwx6pVAwjCIUs4mxQpdCyDGvSgh50NSJCBCYusBfmEQdtlgPdqQEWxxLUZw2R7l96GeMcRDQqw/a QAuMN1LfaOkgndofsltD0+Z/2RV/1YOUHZTiYBA84uwRcpNx7Mvjh4873W5pxpUeZlzdyVrek6dv RkfbgW8/IQ5WOOD6wZbW6F9ru+fe+1v8V5vjtMSV3kr8Y0COn3p4fqacx9bEGD28YNIcIy411b2v rnY7TjNsDsMfVqlulZLjStsx8+/ajoEFWmAoTZFjuY0j3q4c483p6AvEhLi01p3jWXD0ibFCN6QL rOBo79OLYEI6BV0xBqxoYRZVTPypL8akKs2GIUCIlhjLuFvgBPhkPGbI8eWvsdtIxS21aMMBm3Y0 kSmxuNUimO+I0+evO4zFSGWd+baJHSSy2Ps5ariUR3RZuuI7Xt92nq7q/BYnrv7ksz58szPmL37v Z2LPryZoZ9cDWT747Lq3vlplWjnWQW9y/qk8y+34nnvus3zSHYaeHB/+3mNVX7gjd7X8Nc2DDz60 6u34yKO/ORz/njyudjuu8q/2g8XJGPpvAI4Y5Hgblxx25Fh/nB5xZl5qHE2giq0TR8GKFsTOtjJM 4kXggdm3N0NfQf3zUuiZAxgBca1lRLxTgFkMwGAXgGNYmB9goezROQx7vgSGAAwzKLdipXXgyDtQ eWYZBwXCqF3loEPYjhubj3zq6wPwb5qHH3nUd3yd8wMEHzRaO9cKHG+86ZaIFv1mlfN+eVl8rofB z77ZGVd/wM7OOP7rljttsMOJAfoSgw1z1Arys9Ycy7c3V8O//HG62cxyhQi2OY9aYY4+8HAee3Is 2h6Hh0UL82PY0559YM5/gu14OP5RdjMW62q344y/uiT+bjZ8UHSuOgBHnACDQ3ZyUcnxbs+3b29a lO53FTmO+NaHI+wghsije9DGDNN4spjS7U2YgkDExcbKNQXRwsS0O+jECqNO2mx7XIZRYG5BMOsd EDVJw3ThtuaA4wUXXWYbI22ofIC2HVDP2nIMB4wMw8a9YWOzZcsW82xeM46r5R889nvDR/xAEAcE GkyIBw4Qk3LM8uj9qa3vP/Z0u9LTK7y4/RkD3/s/e1qV4+4vOtQPYsnPV751VoXjdHLsP1mYmH/x 43TwX4ft+EMf/2o9j9TG2K8u/mN1O5a2nn11tdvxhmcfOBD/sFbmcbXbccnRnMO6YpXtOMMG4Jht ax155Bz77c1iO2aj2tKfYwQIC1IbiCPisGJLxqPow6xRXy1EpOA8Fw7ML2eR3BITdSIEc4hG1XyS UEC2ilFzDfMOZoHgofrtWGfNUXcs3SBxBhxnliVGZ2wZFgMedtQnPXPf6fCvcEQsOGNsxVo7eE7A 8QMf+0r0D02p5d5/P5j9hCG+5KJtmx56pJPjls1bxFcNm2aO/Yksk/L3by2qZ9iFafK47XksOEo8 lMe4zWixFjn2UDxW80H8A4vmnfeMh7RPuh2nOwuw5la3lb+I1PO42u245Fjl37EdO+bg9Dhq/uIk o8xjmWP9Iov5dzIezcQ55mlojoKpYBsTdeibR8LKgOUzPRhzxyJg5B2DsjkGwQIDebNADk3WpsDM HrW7Dev8mEm2gkWyDHMX88lx8+b8HXhy5stnZV2Y7Ix2pkxYDCpLciDeFv5dHP95820WRxwk9MBR 7HR88OjiUWDRS9ZXlOOPnnBGfGuTvtW5LRwV2/Ycy7c3V8nfrGYcLaLBtuOn7rYfHejzs3/PqdQ1 9vT5XM4fEQZ376cKj1qOV9qOp83f48t4aG2123GNo/qmWEtsHXKMfkasK+VYr/S0bzBF31DcLjV7 joqZboF5fIgGmMWOCZj+OF1bfHYxKVND6BPGjWSrhaEDsGCjjFmB5GRZ+PbOKix5Q869ikFp1hxf f/gndaens8pyB2RMDyQ642ARB5Qc8zA5pAn4ZzwqHB+/06v84JjWmN0/H0gIm4SjB1DJcXpqCz7r +7+LrwhsDRxzjBvJVgtr5zhub07O351UONZ4eCgVDEp9HP/xr9vsViIf6BGPXW05ttTsap/7kHcv ezPaSE6WhqVXOnXluGs7vumft+Zu18o/mkmZQTyGzPhPsB3DKXM0U9bQgw2YY/SlDs4r5zgGvTKQ KAdmBZKTpWNoHpZjjnEj2WphdY72loUEliNs1BUjozwal5ioBhbOUc5lgUbd7EetAzP7Fo/Hwv61 UvDow8LHLDj6AVI2TuyMaAsMbXHGXO6sccaXNvTD3v1Z4jgh/wk4phfh+g6GWyx2KyXjQVegLayD 45V/+Vv4tnyg/qvfXCVXet08JuQ4pRzrF1lWxz/yj1hzjho6MKlsE0ffPjAIWWz5wT7yWHKMGtfN ftRaWF+Ou7bjqfJnOxRp+sPAUONfy2MXR/PSi3k8FIuGDkx118JR+tIHu5VznL69GVkLO1FbXY61 hliH4ciY4IyxD4q0i6O+Od0bUYKjtoL6Kgwy5vqA6piE14tRGyY3i6XF0Yq1H4NuGyPrM+J42eXX xNkZ37KwHdJ31AyzHdR3UsKw827Y2GzevCViBt8u/qvg+OZ3HmM7l8Ymn93g7N1idg5+VjoZx748 9mERY4kRjynl+EH8OH1C/mlma308+jDotrGc4/uP/LL1sx0MO2NV7CNHfYNsq50+/rXtGNhZ5120 Yo7L7fjIo06cHn+KVcqEdfGv9038ntCnCn/H3SWW3Tz6MOi2MeKBQW/CHMtnem4JMaw9x7Hs5tGH QbeNkfUp7asJk29vcsgxcS2koo5SHdPWCNwxOC+wLDAUHNFR3jHygjaOgms5hhomrrEF1FGqY/A9 BMfYaPWMODZc2qDpTA4bNQ4iOLDoASXkH79TfIkCzFCmgNbEEf4khiIOP5NnbEKO6TYZMocouJZj qGFamaOW6ljJ0THijyeyTMofgzl7gS2OosYqr2Hq55jF5lddGhP6ObadeDQYc1zrdpz+J8lxuR27 HzO+LfyjNecRJ4jBvy+PsFfjGHHpgdWxLOaIHFHUWOU1TFxjC8ZjFTmu/ThdebCHEmMEV10RFdeG 4Mjl3Hpg8N23ryZM36dXC0KkyoQSBntSpiBaGDVCljAXdzt1DL7JfMwi4M6kNXQDw3JMHGOD1au2 ODjFYJZhfIC1gwywOPgsNbfdcY9RmpQ/NfZwvPvu9MPnOGAgVo3FdkI70GRYyaPCMX0bM6b5yTG+ vdni2MXfr/TCo4aZObNYrbRGjk94+j7uW/1HDH6QJ+yKq64Lm8Qx/HJf1bFyO/7dH/8ycY6B/dfu +28Tf/fuBtp5VP6UK8TQkcc+jrwWrLgl6PMAOUYeJ80x/2QBBmt5dE8VrMbf5wE4sqOIrQujRsgS Jj9ZkDMTF1ZXmrTAMLJbxYowZgFYnQxVsBAQ2x2Y1uqYWbQYsY6zLxUK22Pk6LXl5eZdH/5CPpDZ HAcPxeQsGgOftVUxOsB0888DWS3HJ++yL/mKHY/PSh3z2Cbj6J7nJMfZ7/S6OBYYLKgpiTSP1X2v nePWLVsoFhzAU11zzzG2sIKHY6vgmGGrzHGqP/LIY9vEf6U8lrGuxBG+yvx7zfNmMa9DjoXHKnOs rxZq89CY+jjWsfXgCGFpc4zjcUMVLOe4gzvOAgidLgyNHpi1aLWNab0HU20PmlGvYZXFA50aZibR tkqsFmsq9fLow1Tb/K7AsYL52aidecpBA+Ua5hs6HZAIB7bfG49s8e/l0YcRx8cee8wPhhorH1Ao BsKqPIhj+Ic/c4e2VWI1HsKgA9N6jumgB0444CinLv5hx2xan6FtGhzRvzrQpHL4937FLcUyNzVs lRzXmmPGVuK4ElbmiqfVcsQ0yb5az+P0c5yKq83xHi9+k+rCsJSZBXhMeKzK4hmGIy22aV9NUzyR xQFdpHUVk5E4sDzJgWlHMcbr6MTWGrZNJnyFPmOpgGatkE/IAeN4RsYR03V/+6efGctGbBu377B+ YIlbRYEXmOvqGfZjm7cMwvFDn/ya7XR0QLNY+YDHB52S4y8vuiw8WADaN7PPsb9Przh45wd84u0/ WchzbGatQj7XwPHkH/6UDnaR4+j/wLKBqxyQikFtUo7OdRU5rm3Hf0+Pq1sD/0nyuFqO5s6shB2P L9zHNGCOwXG1Of7EZ79N+ugbK5dr2o8tFOIQQsCEVgBT48hYnsf+HNc46pWeKat2zIwhsBITN5Az 7+5IMI8IURumgbhNb0cHmp9QCUKycMnQggtgFhjzYA7MI+Ta2Ew4ZhiWUfMNXA4OOMuLQUzPUg2T HZjkac4x3SmG4ogDGs6i9cwzYs8w45Hq5sVyau7nKMeb0kOWvb+DB27VaT74gB/vGZQYjJ95sngI WwPHdo4tJgw+GGio330bIB6OgceEHFeb477teC38OVdSR+9aW2os412J49Y17quKeVBTyzHaV5vj W26/y/sGk5ojf95ukWccA4Pu0BwZE2vuyvxYYIqZY6w9XuXhtzdhG0bRBueIEVbEMGNmFk4RWIm5 TFgqsFynLW+tIJvJA9OC65nAmDgKAv9lOzD7ZpweRLBh01kqH8isnTG06cHJ2kz2iquuH4Tjvf9+ IDuj1zNQPdiVPMaSY3ym5/3tB3TMgYEjIhiC4857vs7yiBxjACr7WA/mumaMeXBuJuc4aY5je+zG PnrUN1bFP/qxP4+r5XjaWb8Im5Yjt4btqGwHNuUcW1EWq80xvCPanE+0wXPEnMtnrQNzVMz8ryLH wSO42KuFtOIQ6hYVhD0wwtAKTHAZlaFlWMCka81qkGTDJzD34aY8yKzOciGyeBwZ++Rnv2NnqHqw QNkHN5zx0Y7tdTrDhi529IQNxfFpzzqgiDXOtF932CdbHEv+HouL5Bj349A5xu1NPUijb+0qCwdN x/SAFKamy3HTQ7jVGjnlKzFsA5zjNp4PWBk2IUdpa22PfDVVwYptk7fjSfkjW5Pk8U3vPHpVHF/w irfBWfgw/xRIVl8JW0uOwQTWVptj92nTWvdjKLhmhk2XI2NopSg6c8w4ONmP08Mph5JjuUGXlQAZ g1oXxoEHBruOmW9HiTAaXd86EZj76cBCosQinllztPxkMZhTN1dy5NsZfgChg0p2MKli9Z3/Zfu8 exCO6cfy+QFO37XXxxGYx9CBhUSJRayIHDbaHNOiCwseD2ZvWbADEF3dJCwGBpVDPIgDMZhTh/uw kAisnUfc7tKYIvfa75854XvyiLJ//PM2XU883xrlUvefK2M8oMVgV2yPhD1l19dMxF//rWNdIi20 DzmPV//1754rzVH0TVce3TJtx7qNU0xFrrRkfit57MNCosS0/aq//G3FHDOWZEvLzgNx2JRh5ttR kI5Ae3n0YSFRYhEPooONHINaF5ZzzL7IwoZl5KxiSR9G0U6awBA0rysY6lzOsUJOF4iEyASmNY4R WBbpfHOMQKocDWxht91+t+28MbjxoJIdiIsBJz87jDNtaduwUb6NqS6ny/G4L53aXP7n9PuwyTjq Es5KLMvUuuRYf5xuB2y6QvGDER/QrX/VL6bpcDz/55d059EO6rgKAMY8snWFP+pczrFCztepaLjF veNzDooTAfRPa9vMt+NH0/ZnAdT4t7E6D+ZYbuMr5fEO/L7VuXVzDABybUxrMdd5dHNMPw1aKcfM 8R0fPD7jrwXzLA5sTeUcozLx8PIAHKVlSvtq+t/BtGCZhOHNvdYxmQkzBY/RwgRm4oTFooq5BTvb cOdQs8taxtB5TrrEKjz6MLM9C44Khe9J+T/hGa+2s2U7cNBaz2CxQ9CMM0U6w9azRBxAFZsXjvA5 6xz7tzftABNn3riSiYMo5IbgWM0jH8gRj2G33HpXmFyBo2KxqGJuYbIc+3ZVbJfZtmr9he24j78H gcAmyGP68X62jU+Qx9Vw9GZgqY2xVeaYOaaTgJVyXO7HOrBMJ8cZD1ebLscqZraZh4lTrN0c9X16 CIonKBgWEiAUBGA4w1zaMOsIt2dBAxMY9twuYfCQxQp9KxUYVm0sRCSGOeToE8XGsRpo+laq8PcN nz978YMjzmLjDBsHZz7LxYDnMhuWmh//7Ddzw7GOhQjbDAnK4zbmOBv06POTOPAQZv05bY7pFnQ9 j5FnPajr+gk777MqjoxNK8fyFgaL0we31raac/jXzbdX+cMmfBDQy/H++zeFTxpk+/L4zg+eMDHH QOHXSmvIccmx1j+c49p+XPKfRo6H5EiAx6stHkFgLh08oCMixlE/0zMQU27MFIGpNTJKoYV/b4hy mKtj2pldGDeEHBZhnDEt5jww1TByr35QmQVHwsKwYW4Di37+Xz7xDD/zxxwDGJ8V4ixRyzL7wTrX FRk/c2Sfs+EILIzWMVeFH1S2Icf+43Q/ieBBTg/e2l+WA1wtEA/3aMZXy7ErjxhQFIs8rpZjjk0v xx5ndrUSfYhtkbEwimJ3jt2dNeSxqgy2cR0oJsvjtdf/ww2txDHDyPFqc8zYjnsctGKOy/34mmtv CrNkTutl36wix8TDrLrxbeFI7tUPKtuwr6ai3d7UhYMF4T7MO6ewYQgqEG9h0ZZjcjCtYOqDiIUl /eeOjgha8WXlEXCMdRszL/rfw98PJnYQ8bLtyC2Md34Mej4QGrbjUvOclx5W5TELjqpLmJuF3Tqm sbZtgIdVIJ5hcqWHvuGDpvVdhln/TpPj43ZM7zbsz2NcudBLRFfBMW/LsW3J8de+dVbESoNblYdx /Oinv9GZx7JvajxKjn/4U3qzCe5oTJ7HCy+5fCKOjGl59Tlmjuldlq2+KXJcYolDF/+15nhIjn2Y xtO2wTz6OO4QShYkEUEbZAQTEmTYSKlY0TEIsIqFL5XLMTMOCcdQDtto5Y5hTcbGxDF0WBOltfJP 3zTk2zl6kLHbbrZz5IMjDkC4jUJnvRm21Dzy6KMZj1isL0fG1iPHmzbFj9PzvtH+EowOlmkNGtvK 8eLf/GmFPNLtL8trnUc/R49jgO0YsWo/2VULDTo5pjPHVM+x2p6U4xPlsz3ux8ny+KRd9p2IY3hG zC6WtQcWOda25eb+Bx6cOMfaf7Efb9mSXivWzT+LY8IcOySF6XBEG2QEk1jNmIisLcfwZS+RFVwB E1HbEeDkmAaIET4wR+3MwAIr0ayDCFPuZCWDXT7HrFNHyBESjmbthV3HgBLQwX+XvV7vAxrOCLEz 6w6tO5PMdBACpjrlAUp3tHnh6BF05rEPmzzH8RJZnBTwSQMOUPmZ+LQ4+oG4mkfLD2FHHXeS21wN xyxOx7TU0lxljs8891d20KaBpeAhmPVdwp70jFeHP7FrNrchj+V2vFIeFdOYj/vy98NuhSM59f7K se4c//2mm1eV43JfPfu8Cyfin8XpmJZaml6t6K6Bo3vpzGMfNnmOE6avFjJJNYzYoh1WQFSNWHuB oSwBMpbpRoP6oeDMqC9XwoyMVVDSRcYDtkbOsQ9bA389mNBOQjuUlIGXmA16cfabHwRO/O657Vhn xHHoHOPVQswfJwb5ATPaLLJt4vj8V7wtvxqq5NHjsnmtHFFHLPiz1smwnhz7FYxx0QN5xM2Y1Dds bB551H5Co8ZhNnjYtBqOq8ljrCPW1Pajn15S5biaHJ9y2s9s/yP+E+aYsQ99/Kur4u+x0l+Lh7e7 RmCr4GgqHk9gFF8WZ9hhDOVJOcrtTWmGU6rXMCElRaozRh7VkbktMATQibl/a6li6jvIoyNDtotH HzZfHEU78xPYdPifcrrtYNiJcXvHzx5jpy8xPiDIzpfevP3pr3fwmB3HEptmjvPHkMUBMztYysHJ DmLZj9PNxxo4ug8+SJd5JOxft9y5Zo69mMdmLZ1Y7iew5eb2O+72vgGnGHDAA9tgYBpT2Ikcaxwc 66QcJ89j2f80ABEPyO2698HNS/d5d7PfGz/avHjjO5tnPu/g5nE75bmrcSzt9OWY99UvfO20NfGv YtpgEsix1Rxb23a8EibxqNOoM0axTsJRP9OzijqyFhgpMC0HhlhCzoyzPOoZFqhiVGZNwwCHVS05 sUqs1FLHxsDRbJrnHLNYgJU8qKWOFfxxdqhnirGz8dVdftaNcuzg887RYzC7wNSP1hizf/cg/xkW g170VfQN6jgTR1+GVYt1lRxhSw+ydsCzXFTzaE8TWStHoIpRmTUNAxxWrX2FHHtfWb+BR9aPBcdb br1johzbv/lbmeMT0+9cV8qjDTbR13oy6NuADZAxUOY8JuU4aY7Z5n33P7hN/CfKMeSptNrtOMMm yCNQxSCnmP27B/mvcJSfLCigmAuE7AoYGczWrpRhQYSWtkCHhk1MhHFPCGR1waNsajmGNtgH5ra6 MMRTrl1pcI6Ip4Zp+3T4Ly9vjcHMP7PDjkYHgQJ74MGH3Pa8c6xjiLVcu1Jnjls/Trezb+3DODjx QXNbOKbflokvutUXgyBuczGGx2eV3Cbn6EtbeB4zGwVW4Yg+r2HpdqXGbAMArnyMH7bBkmNvjrP4 Vsfx9jvv6c0j+t3jlLgix14mDPKr5ThJjlM7fn+5HjmWhkoetX3l7djbYB+Y2+rCEE+5dqVejvqT BYWszdYWlPpiDDMZctjCbQUQJL0f2L6dHaCDc8zW1gJZnayMHvG6LcKoYePhiKmGEUox6WzmdREO DZuc/wte8Vbbyeiqjuoo7/zc14WNkXGEY5dw2OwxBhuw5+bjJwt6sIrbTX6SQH2nB059kDeitsgm 5hgHYdiPqwq0xUF2qXna7gdsM0fGIpzp51ivkOKgn51wYcAp+B/xqXQ7Hfad0NQ4HvvFUzvziBxH /2NwjCsvxfgkcfUcV8rx4/wbweufY/OidRg1KTOhizBqmAeaYa7pGGZrskL4ChO87OJIjyFzrcKY hZBVEXAYzdYwVMOg04UR1xzU2dLhmMpyp0XZMV+PiCNhLrue/LUldmQ/Q42zUdhp6Y2F45RyrM/e zPtGD458Jm8HNKuvleN7P/LFOOi1bNOg67P9PmsbOVaxAXL8qFztxYkWrmBKjiX/8F/fjjG1sFVw vPIvf8vy6CeBFIfnXNowiBFGvFbLsZbjl7/mfdZ/M8xxJY9hsL4dZxgsFFhenR5HGfRKoWAYRShm E2OFLoWQY16VEPKgqRMRIDB1gb8wiTpssR7sSAm2OJaiONccpdKBoTRV/rDayCPHcHWXdrzjvvR9 AUJirBxtYqzQDenuHOc/Tuczczu7LzAMRMLDLU7GkU8+YDcOjMAiV0cedSJM6GqNHBGX1obN8TP2 en12osXbXhd/f6yaxBKMmIHXvbJ2jpf+/qq4sverO7uisxxnGHhg4LKTotVwxPpFS+8YZDteDf9J 8ti3HbstjqUoDsVRnr2ZDEgjyQYdbiuRMvi8E7zNKoLAhzvU2c8qWNnbAnOyFjN8sA33oZHp3+g4 Mhby682ffaQdbhE5Ss0K8FXjrzFuO/+8vJgctSl0Svn15s8+huB4330PNrvsfXAxYJVXcjq46aAX V3IYMP2WKMmntf7ObuuKHKVmBec6IP+8bH7IzhB5lJoV1srRvr0Zhkoz8gfy5ikCo46xgpvhTiPH WjXb0hasOTD4diyUPTqHYc+XwBCAYQblVqw0ZxxNK2wWOowNwz/KbsYcqhb5HS1HrSC+4OgehuFv Uh7BInLMMDcbPihyVx2Ef5TdjDlULfI7Wo5aQXzB0T0Mw9+kPIKRcIz36XnAwNlYuaYgWpiYdged WGHUSZttj8swCswtCGa9A6ImaZgu3NaYObqvCjYIf/LUhxWKzmwUHCnCFkZR9GGFUW1ZiT/X4H/R OEIXS+PovirYIPzJUx9WKDqzUXCkCFsYRdGHFUa1ZSX+XIP/+eeorxYiUnCeCwcWl70dmKgTIZhD NKrmk4QCslWMmmuYdzALBA/Vb8c6Oo7R3MYc9Gi2nb+ILDhH51PBRH0g/jQtLMcaNosci8iCc3Q+ FUzUB+JP05g4yrM3Ycwdi4CRdwzK5hgECwzkzQI5NFmbAjN71O42rPNjJtkKFskyzF2MkGMfxhwJ myZ/jw8egVnsmAJDFNHuNiqxqu8ejHkQNk2OiGFmOWYehC0Uxz6MORI2Tf4eHzwCs9gxBYYoot1t VGJV3z0Y8yBsmhwRw8xyzDwIm1eO+uN0bfHZxaRMDaFPGDeSrRaGDsCCjTJmBZKTZeHbO6uw5A05 9yoGpbnm2IcNyN/lBXNpqWdYpjgujjnGjWSrhQ3Af3vg2IcNwT+aSTl3nmGuqOXArEByssxNzYZj 4WfmOR4JR3vLQgLLETbqipFRHo1LTFQDC+co57JAo272o9aBmX2Lx2Nh/1opePRh4WNeOPZhHKvH KeLAVHdN/NmOeYRcTCPnOCc55ng8FvavlVFz7MM4Vo9TxIGp7pr4sx3zCLmYRs5xTnLM8Xgs7F8r M+eob073RpTgqK2gvgqDjLk+oDom4fVi1IbJzWJpcbRi7ceg28bI+ow5Mua4u8Sym2MfBt02Vo9V yh2YxtqHURumCjYTjjPOcSy7efRh0G1jZH3GHBlz3F1i2c2xD4NuG6vHKuUOTGPtw6gNUwWbCccZ 5ziW3Tz6MOi2MbI+RY7y7U0OOSauhVTUUapj2hqBOwbnBZYFhoIjOso7Jq8A0d+/4AehHAXHBFZ5 DdP6c/Tf8NiLMAMpOHoXWFvBH0v+Qewpp/+cNchyWcPEtZCKOlq7Oe74nNf6D2fljdaEoQydtXJE G0fItRxDDRPX2ALqKNWxtOTfTCWeT3/uawVgTH9nZU9aWYE/auwF8hxFjVVew7TtHDXWAst4FHZ6 OJ5y2s99G9ftk16lNIMcIwbk6l0f+nxg+JG4YaHVz7HcjuU1T/bj8ze/6xjBqvwH4hilOgbf08rx mLdjvb1pCWQDIlKMmBlWtLgjspVh4jUCchmNRn2ZnGAQLTFb+wZlP/h02xEsPLh+lcc6c5SB2na0 lTiKvssYB8bwhA77wWt6B1cEhGmN/CfkuONzDrI8LOmgxzxMeVs5qivoEuDTGjlOmGP/8bDl7unP SYOeosDwY+M18Z8Djhkm8SLwRn50/cy9D2522fsNzTOf94Zm9xe9qZdj2g715A7bur3pnOyuG395 nmd+0iKDnsWCR4EBYx59HB2z9fPxrNoNG5vD3nWM4Bn/ITlOIccuU+NoAlWMZdwtcAJ8mj3HeCIL BScmxFBgCCYzwsSdaNipYyEgtjswrdWxVMKVHtYeqwup7bRRP/zII6Pj6DXnZHasPcOYhyuHX+bo cAXL+YesiprXSqzj5Wi+LLY2R538AG4nF09/TnrItgr4gGcnYTWO9973gDyx4/4HNjUPPfSItw/J 8cFNDzX33nt/c++/0/zAihzrmAqkN2g8bfcDnaNe2drzLl099NL7GXHl61c6zsn4DMwfugn2WCyP 7/rQCYTF8zETxjzyDso5tjHisUaOW7duaTZv3tLJcevWrc1DD6djWcnRfFls7Ty6oQqmAj846xcr bsdd/FfDMcMqHBmbNkfo7+COswBCpwtDowdmLVptY1rvwVTbg2bUa1jJm5bttoQ9yof7J/Qa2Yjk lSU7bpQnkcsOizM7v9VIt6io/qwXHdrc8PebV+SYXpoKfb/yJI6x88dDZv1RQ7j1smGp2bo1Eljj X+eIPgvsbe8/Tm0SRxMmPV2kHankX+PIUy/WLDdHH//dFkdgafK+ov7WHQ79p+s77/p36C03zW7P f2PIQI84In7M7/nwF+wg4sH5FBTaPEr+iA1x7yRvligwm2vbMeeY7aSYMQjW8ogJofTxSNiTnrFv lsfIa749Qq83j4bd8Pd/SdyHvOPo5gdn/p9xie14a2VfTbc3yxwDC9ux1r7J81jm+Fsnn9/L/y/X 3djs9d9vaZ73P4c3e/334c3z/vtw5yi3Hf3EJW5v1rCwK9rWt22Oqa3k2LUd77jHQWHTcvW3G29u cWT+2IaBP3HnV/fyTwu1EduY92sXx1BufnDmL1SvZzt2PdSwyuLZ9u24C0PjWrZjxuKJLA7oIq2r mCQ8sHxDDkw7ijFeRye21rBtMuEr9FPBNzBLrgEuBB7p7Drh5/7k4uas8y5snrLrfqZHT8K3Z97F xoqNJLDnvvSwTo5p0Ct3VuaoPhT7yjfPai7+7Z+bH/30183rD/+kb5jQZ47g74YwFVjAyv/tadAD R9uhLGKoq43lptmydWuLf42j62Xreh6PPv570be25jzGjr3UPGmXVze//f1VzQUX/bH5yKe+Hjue xf6rX//JOe72Ah30/LPcgqPqFpj5/9FPfp3zX8V2zPlL653kSq/A/GChk9sutuOr0pP6C46bN292 jqbtney5iuhzHpbHcjs+9ounyAnNpBy7cswnLml+5JFHfRtH31746z9lHNNny5xj5J8IupPUxPvx C175dvl8LB3kaznu4n/5lddl/HWgtb6xAz54ZINegSFEX1fyeNFvLs+2hxTfU591QHPsF05pTjv7 l83p51yQ5TgNeuAPu8DA8YX/+47mK988s/n8105rdn3+wb4d64O0l5tfXnRZnT/lkfm/7vBPNqef 88vm2yef3ywd9MGMY4r7Znn5Ljguy5WeYGU/mO2NB31Ic0DHKuao2FJz4knnUJpXvx1XsVXsq13b MR+r9ErPlFU7ZsYQWImJG8iZd3ckmEeEqA3TQGAPHShfythxqbny6hvUT6gEIU6wbDi4LYFwjbwM eg/aTqryzIF5lByPOeHk2LltEJQdqcLRr/RwluVXNspRz4oVSzsMUgP+vAHthLNCxJddGSnXM390 YXC0mfmnQS98auzgWPLfsiW9NBZ9qRxKjsgJ8M998VQFKnlMkwx6pqNnl3iJadjTuJaa/3zmvoZh uSxvreaDeI2j87cEch43P7a52XGPA5W/DXxpvdvzDza5iBd6Yg02VuD/dHuHoGPGUfrOpjLHzD/V lFs/Rz3w0TZOHJlDmnkbT7czV8tRMXNsOulp/r5P+nahCryvJuz5r3ybczw1DXqU48g/llSTE4fu /XjL1i3ZdvyTn/+myl8GvWw7jn0VB2nEq5/pKZYddwqOiFW7xPqycucmz7Eunf+O6UrvQFhxixjk k8zjdtooJyiCQcw4nppuFdN2DEzlgn9a8bHqqOO+6xxBB/xjP3ea+e3Nyna88aAP2vbIA15wxHaM XH3k099Q32IE27XxLziWPPo4qs3Jt2PmqE3pgdMeWMwuZw68gQwExo1kq4XZRpE5i7J0HG2cV179 N8dkWfjGhh1ngIVpC1veMm0yvtGsgiN2BiT8Zfu8O/yI3nLzlvce6xsBeEQgcfBKWBr03LjZeGq6 +rT4kh3AyCxjaT7zR7+KZFPICCnd3uS+SToec8F/65Z0e9MGBtsh2Jb4J/5p/bkvnUoC7F1zlQY9 PyiYXWApbN9pNmxsnrzLvhmWpnSVgpOMNJdeSh5oK7F0603ioIPBzbfcGcZcr9xWyVaFfzrrdcxy izn0rEBBydIwxNXHsbWNVzim1b///UDG0Xd6TBNwBPaXv96Ybcd+MMsG5uJEbMPGZsvmLY5dceX1 WY71IFrfj1PDSvsxb8dPfdb+GQZzV1x5Xb4dky20IY+f/cIpBY86RzfujhQr90dtDj3expOc3N4s 9tX9Dzky+pj444rk+C//IMNga9Jj1dFp0IOILR6/06uy7ZixC3/9xzVtx4BTw/LWeP9m8pFu4ZqK m4AZMhd1x7o5TrodA8kwM2bf3kST/nldMCMZJjIMrcAEl1E5nGQkMt2IR89msBMtyQsbgUUMEZsk x3aopAOA5dJ83/0Pkm3daFbD8fd/vNp2bjuoYGciji951buyZKeZOfpOsmHJr/TYJ3ik+b92P8Bj Q0HP8myD3LCxOSMNekEgk01lDHrcny5e8E9v1cZBTuOnszzjiB0FMjLoUd+Zd48HV3qam/zAkFbS Zvl4Uhr0Ch4776nvUwPfGkfOsarnGPD0bUP0XbL52sM+0cpxsl/mON1p6OKPqYXh6sLjixybM/Mc n0kn/XTLvcYxtnGNq4tjqjPH6/7+rypHi8oxwWk7Zo5x0MaBUAfmf9/3QGtfrXHkHMs2RRhzFL8r 7Mfs64BDjnSM+V9+5bWd23HiwDzSF3PMeZUjYtViO4/YV8GROUEWuUsy6UqPMeb4yKOPtvZV6GEg fsLT9zH1PJYyx7wtypWeTZNsx9k+sGFj89hjj5ntNn/ejsEDhQMOTYN5HKs8TjMQPIID53EljpNs xyrvgTmOnNqP08Mph5JjuUGXlQAZg1oXxoEH5hufbUx/tis9RcMe4vmvZx1g8/4yn3HOr5ozzr2g OeOcC+SeOubv/fAnzVN33b956m77NU/dbf/mtHMuaE47J913t1nuweuc2hVTmTQf9+XvN0/ZbT+a 9w/7pvucl75JsHQWmvDE46RTz5f7+z84K334rxtbmj9xzLea75/xf81Jp/642e+NH/UdVXDcXkm8 jXha6QYEG+n2Zhr00DvWL9rp8v+29x8fG55tfCme5PM7p/5Yyvu8/gjH+CCW50r7HQck8EiDXlce 06RfZMkPQPisI/XXfz7zNfIZSJo37HGgt3/wY1+WPpR5N52P+NTXKVcql2xJftJa5l+01j88S2e9 zRkcX7z0DuIY27H2b3D8wMe+4icqzD/digJr6Rs6OKWy54XyuOfLDpP5WS88RD6X3O0FWOsMfM+X 2rost+bDW23PesEhzbNe8EZZ7/bCtH6j+NP5UN9O0t9KOT7ozenEQHlgu0uYfC2fB0NcwamR2AKW l/Wzc1x52UH8kLcfLSeh5tQ3mThI4pabYunz3HI7BsYM0l+60uPtOJ1MffLYb/tBnPPI2uABjh4U GGX7o3I89Yz0RR2NCRz3fcMRzRnn/qr5+QW/a/7vV7/3fTXF89TdDmh+efFlzQWYL/qjldP6j4K9 5uCPVPZH/Uy7nNNnqLUyOCY7b3rHZySOH//8N83Hjv5mazu+4qrrvffA8UOf+Kpvx+XxGPsxH6uY ow/alkfwQK58uyuOVWUec8x0AnUbXdtxHaM86ktkc6fugs9KMizpwyjaSZMGJnVG6wqGOndg6ryf /+r3huVyaZHuf4c8Nj5Line+4YQh6blsDcPtC9qw/eBGGPT9LI3tBeYbRsEx7CzJrQfmqGvp0BbH dPvPQEqm1Zum2ffgNKCtjn86gajmGF+SII7vPuILnXlMc/pxbo0j+iD5irjigMSxOgbdVtxry7G8 dbrkaLcpOcfP2OsNphN5vOa6G63L230DWe4L9E3JH3EPxbG2HWs09X2VOe798rdkHC/9w9Utjsnu k5/5moyjKWX8v/j104LjNueYrqiMw2r4p7jf+9EvZTEnjsDAEbEzjxrH9E1r9Mn0OG5bjlVf22G3 dqxi/jWOW7Zsac758cXNoe88ulk68IPNize+s3nx0jubF298h5Zl5jLPqT1mtRj7GWpRjvp6jTk7 2ClMOIYbkYVwBbO1qiOgGkaNkCUMIllyUtlvGyAMREEf2NoZSCqTM4sVuuEMy1lxDDt1jDnyOl3J ykZsZ13oG5+JY5qw8etGv9S8cOltZG/1/NNZMx98+OBQ41Hmcc+XHeZYF0flogbzNoSZcwxLOVbl sQJH+VyTT0pwO9Zkhs6xzwNyFEzK8Ia25eaOO+5pbk/znfc0m7ekz+YgogZvvfWu5pbb7mpuvf2u 5rbb725uu+PuiKJ008FRsWX5ndkDD2ySKz7M/8Y6/Z6R2h9++OFMt+QPvfQbyGx9v/4mkn8CFPzD AnOs8VgTR5nVYN5m8wxynGPUCNkp8cfxeN456vv0+B4tJiOWglTzbBkOytAIc2nDQAb27DIU2GOP PhafS9hZMQ7wx3/p+803v3dudiaDA1Qqp698t3kE6TYWImvhGGdO+rmBfGZg8Rz0po93ctR8mxVO PDB44A3GbCnvNv/jvvT95sJfX9584hi9hcEYBqiSv+KB9fK3FuYofuxs87NfOLm56JI/NZ/+3El6 5msY53FSjugtxGOg6VtpijlOH7yffd6FcYJgazxmTHVd2uLQxmnkuMaRT26AYbUWjtZQ3Y4dc+np c/RpnXKMbZQAX2lL8FBzFteIOMIHAc5FWzy6wFwacUyPP2zjeKz+Sh5WqmIhIjEMzFE/0zMQU27M FIGpNTJKoYV/b4hymKtj2pnpm0588JbLetwawu0EKz8+/YYFHs142K/zIJctjHloRMByjn6FaV9c wOCc5gPfnAa9EK5x7MK4gTEEl37Lw/yxTp+LxYATWPp9TskxTX5CQV8wYPddeXzpPu92Xc2L+twp PX/T+kAGZYvhf17z3ozHJBxR5jw6YLFuS473ed2Ho+9wt8BuS6WyPDexg39pro6tIsfEAx45j6FH hQk4knv1g8qU99UujBsYC8OGuQ0swvFac5weQOGqC8ox5BH/jHPscljMN8cdAIpRkmbBPsw7p7Bh CCoQb2HRlmMyKlcw9UHEwpL+c0dHBK34svIIOMa6jZkX/Z8y/0Xj+IsL/yBPFklfBkof9N/0z1vX PcdaGo5jF7aeHFWnzTHWbcy86P+U+W8PHFNBY23bGIK/lsbHcYdQsiCJCNogI5iQIMNGSsWKjkGA VSx8qVyOmXFIOIZy2EYrdwxrMjYmjqHDmigNz99NLTBHMyYi65djh6SwmByjHDqsidJw/M222fL6 QnE0vzPKsUNSGA9Hf/amGHGf2ojAwoEvPEDHtFX/4LiCuUxYKrBcpy1vrWY8lwemBdczgTFxFAT+ y3ZgA/KXvwXnqJj5r3Acin/WuqAco31GOTYr8reoHGMxkxxnrSPiqN/e5IA5CFigIN0U2gsMZXSC Y5luNKgfa8+CnBAzslZBSRcZD9gaOcc+bIr8UV5kjmI1XGYYykPwDwuELRjHKjaDHKO8yBzFarjM MJSH4B8WCBsBR7m9Kc1wSvUaJqSkSHXGyKM6MrcFhgA6MfdvLVVMfQd5dGTIdvHow+aLo2hnfgIb kL9AUYf9EtO5B3Mf1tKJzYCjFKnOmKhFHb5LTOcezP1by3bDsYblfgIbgr/GoRCw8F1iOvdg7sNa OrH15GixSpHqjIla1OG7xHTuwdy/tYyYo36mZxV1ZC0wUmBaDgyxhJwZZ3nUMyxQxRp/Ckf6XZpr Wnt60kla64NZXdOJpSeuQEbeH5ZHL3/pW4YJ//7pP69yfO5L3uwxpBkYc3zJxndlMpNyTI/DSvEd +o7PtLCkcuCbPh7fArVvFT7+6a9qLrzkT5G89DDlzVvim632zcO0PuTtRwVb6/tUv+bam6xv9mth ymG/5tkvTk/sUCw9r5L52z8ilUp6ygf/bCPFkh4SffU1f48Nt+CI3DyaHm8EGaCU4/QUlQxrmua3 f7jK9PfLOKY2zOnLKTX+4Jj4p6f3A1M5lUpP2Ehyz9jr9WRDsfR/6+13C77h2fo4qTLHf73+H7E9 dPBP7cd/+fueO+QvrdNTZDjHEbduX9qiL+xNPNJTaZgj4knf4m1tl4bBBvq6a06PkSo5Jr8J+9kv f2dYzvF5//MWwVMevH9t8fL93uffwk7fSn37B443EBFabXlZniqC/Vhjh6TGftfd/9YnH5Ef5u89 WOS41ScWe3qrQWCBgosIVfII/J5773cez3npYb6Np5b0gGbYVk2NxSKUx/9xXNiOsa0Ci35Vjvyj c2w/h7ztKOevfrSW8oKfD6V99ePHfCvjn961yPy5r8BF54gHsQD//Fd/aH0THNP7FPvymJVWkcca R8bs3z3If4Ypat/eNFGMoCLs2v2YReCYKcCXigWGgAOLBb7u/jh5Okm4jq+W646DSdWWRR5f9U4b AQY9jVWt/PNft9nX6vX3Y4qxoabZZa/Xqw37Svu/brnD+AXHONDb18on5BiDGT8tPzi+6rUfdI4/ +8WlzVe/fRb9ni6ePp9+k6i2NsrridLjl572bHrUlvxOxrKQ3jN2TXqAMPUb5Uq/tr+x2XlPe2uA nFGlty7EbxBreUyDA3KVHir77ZPPywbskv/r3/Ip46J5VAzMddKfDODt74Gl0m8uvdJ/tuIY/VRE d+wcS38nnnSuc0zzs1+sb/z2XJm49p3O//jXbZ5HM9XcettddqDB7w7zHF9z7Y0eCzRrOU7PQ4Tc uedf1Hz3+z9Wu8hxUjLlyLsaSJg8JMC4Pv/lb23xSCce5faSbeNmGzzSgQmP8XtaeqTf7mnQ+5jz T+LpfZLY3lKcCIg5pkef4QAMzVtuvdP7NL0H8VPHndQ8fifdrs798a9bOea4Uvx/vf4my1XwT4Ne vo1XOJotIyEyXftqeo0PtuPA8n01HpsW5rEd33PP/e58l+el1wHlfY9jybdO/pHx0AP736RPlQcG QmzH6Z2IT5N86Kz5OcA5Ylv+0U8ubq674R/NE3fex39+k37cn4xd+oervC9f8qp3Nkd86muei9Sv iO/ef9+X8U+x8KMd+edHadsAloQf25LefqF8cSGSQnz00fTqKfWd3naiQJ5HtAXWnccqJjNhppDv c4GZuGM66AHyyCIolWUMM2xQ2YkQBhuw5+ZzLK2RPN15Igzp/B03Nm94y6eknK524Cg9GDW1vfw1 6YxS5eTVKgjC/GAjPvLT35B1etFkyXGX56VHT2kiscEyRwyKX/rGGbqRls+q7OAoZ2Ublpr3H/ll 55jzT4Oevq+KMdG1gw2k06CXH2DAMR4Ym2JDzH+55u+2o8TOCAyDRRr0YuOKx565eMFRBj3jj1iv vOZvdtVpg3qymPG33/ClN01ccnnGUXOssZ9y2k99ezC0ueR3V4quxOSc8cxGfQB3Wv/Pa96XccSB BP0iV7TOX+c9X3aYYO/7yJf8wFBux+lJJGorTng2b97q/ZGuppFjbVPlMsc+6Fm/gSP6JT3+yaRb eUwG9Mk42se+/YVDeyWTnRwQR+8SK+Bgdfe99+WYx2pl+rH8e474gnDc+3/0FULMcfc06Fn/aPRN 86ljvxMnKiYPDHrgn+pp/02+dn7u630/VoHgL4Oe8S8xq1H+o71rX/1CGvSK7TgtsR1jX03Prgy9 yNc9997neunYUe6rF//2iuq+qse4peYNb/2085BtNL2P7rvnmmxsx8xRfSw1jzySHgit+cWxKj3T NbWl9z2m+pOe8WrRiS7J+acrvRp/5Ab80x2nwGxtLegLOEJ8N950i/GAcM5DsTpHtc8Y5vAbsNnr 4AgRrtOVnmsVxiyErIqAw2i2hqEaBp0KJhtb6uh0pQcTftarO4FuMPjhLj2BAWdW9D4x8MADV7Gz yE6/48bm4Yf1rdXguEt63qId+L7wtR+K/DdlI7TX1NhV6Fe+dWaW7JIHc/yVvLIjvbVdNxxw3PTQ wxnHNOhlB1aLMcXtT4XHlR52JOKYClvT2RcOeob5oGcPB4bPtMLZpl7paY5T7Lqx25NcIkRf66Cn /CWs5UZ2DNezeBKWzkRTW3rItrzB3g+OEYvn0foeOUbcyDF4wTgwfS1KzvEdHzxe2n72y0sdS1d6 zCPlAAf1NEn8GzY2R376RJWxANOgByzpJXuJ/8233CES6UpP27A98E4ZHNOg53ktOOpdBd87W3lM a1zppZjl9U3c39bXOFibiunn+ypyIDHbdiwz6zVNc9i7j5H2lNvgvbF59NHHMo7pSi/63zjLQ+H3 z7bjV+7/fseUVSSD9+MXvPJtUn7j29KgEPxxpYf9GK48YNs2siqdVJSiOujl27HIW8z33/+g7O8J l1vbpqh80qB3v2/HcsJstpgjcvzGt35amr9zyvm2ndP+6Nu/bRPGEfsDcwSmg14jgwvaNm16yLml NzNwjt/23s85hrUOem3+0Q+6LclDQKwthHS+5Hd/zrbjZAsvfkY+UGYeGWbmSiyvtrfjbO0BVjDo WJsMeqVQMIwiFLOJsUKXQsgxr0oIWdC6M9KT7A3DBpBkXmVv8L3uhn8K5meF8t4z3XnvkSs9WI2d FW+S/sWv/uAbrofSpIN5eg2NJlBth0y6B59sp+f9ffVbZ9rGFGc4XRwlPhxMmuXm+r/9064++KpA r/TAP70l+aTv/9gOBDgTUwuP2Wd6vhN7urUvBQOvZrm52m5vlgc0ic244vamnOFhp8btTYgTxzTo Sax+8FaO/pmY7fDpLeEcT2pLB4/EceNBH7AtQCccrJcO/IBcVaQ5Pdg6rQ96Mz7v1H5Av2n8S7KT 3fSPW0U/fZYi/VDJ47NflAa9YAT+5/3sEqmnKy30eWTQrvQoj+i7JPvFr5+utzcxABF/X5pLH/Qs x98/8/+Ml/Loy2PC0qAnfmzw/fuNN2fbqLxt3Lah1mQxyEkNDsRvO6o5/D2fbQ5/z7E2fzYSQhy1 z5abr34T2z3uAmh7+oyX+WuO8NfIczvTA6qRY+zLyH86QCf+x3z+5F7+adBj/sB8Io7c2LWvpkEP HLVRfYNjurWZPKfbs0nmCTvrlROOR3ffc5/zeIbdJeJ9FRhynGrYjq+94Z/q0WLB9vWK/d4X2/+H 0/qLGUfdfjTH6PNUT32T8bdyekg6+Cc5f8Reo7c3a/zFBh2Pn7Dzq7JYkWNwTG9ugf30pgYVw3aQ H3NQdFuE+cQ8yomxQjeku4/HaZZnb8rBrpCNlHFbiZTBByYz2qwiCHy4Q53lYGtnoPKZnrUnEd7Q IZc2nMfttI+U5bYQfSZw7732mV7TNBv2OMh2Nrti8IO1bqDpNTQIB7co9AC0LF86SXJ/ve4mlZed cLn5yrfi87Y+jump43L2ZjPiA5/0QTo48pWeJlRntH3gY1+Wun+mV9xKS4X0wbViuMXSyNkf+Luo YXoGvCQHPLTpi1e1XexX8iiDHg4ky03z4KaHnKPc37fwEafOwVvX9pDwIscnn/az2KBtu0y3N/XK hz/3soNJutK75I/S78hxer1UWqeXhUq7XVXtnj7TM07pyyPK37YF3Aa1ASh9hgH+8pkebtVRjnEA SwM5eCI+7SvrPGvDoBc5VhzbZXrNkNj3bTzymIR10IuriYSlLwYhj35wo1tstX0VHNPtTQ5T5K2S ru7iYBnbMLbj3/7+SueYXmOE/mH+vB2jDfzTA6FT2x133uv8kWPsJ2l+/NPTowY1Nh30cv4ly2gL BPvq7y67OuOYTrx4O0aQiEEGPeP4kU99vbUd333P/c5xl+fZiaBsI2offfG0Z+sJMzim4xtvx2ml Mertzb7jMeJNd00SJld0Oy41e7zkzSpnCp5P6xl5watvoyogg16FP2IHnyfIlR7nkWK3svQZHQ+Z P/PwmHo4WjOtGenhyG1WEQQ+bKEvkTXhPDAjZAYmx4yQzIxFeEo4SADFmWC60mNNbIQghDeNp4Th FSdpgYMWX+lhR5UaxfOXv+ptPz0r1lj9Mz2/CosrteQv3cNPsun2JsdU44g3kssBCFkCll5LYldI mOQzPTt7U4vLzXNfqp83pY1PnhiPb29ix7fpkkttUDD+Kqv+0r/0gWFpoL3kd1f5gYD5B2c9IUgP s/7cF0+V9+cd96VTm5/+4lKxqoMeBlLN47s+9AU/QKaWAw/9eIsj/Lz8Ne+V9vTFBkSqO5h9kcV7 UaffpEFPOODqUzHkKr1TLMWdvlSDXCVMJfHZ5ZJe6cGfDXg3/uPWjL9iOGPXbfUWudLTPIR/xdLz RYFpToDBe2wd8pme5QJy+77+w56LRx5+1OXBQycN7km76BdVZNB0qznHUg85ZY568N2og15lX00n Prrt4rPHyMVfrr3JDnDY9vVKL+O/3DR/vf6fov/kZ+7bHPy2T8s7J5FjzaNaRa7S+93UiXpi7Kq/ /F2a9TM95Z+2yc+l7fNLpzbHfun78j5N5qiT+nj16z7s+8yb3nl0c9fd9zX/uateeaZYbvrHbRlH bMf3PaCDHvJ48y13Opbs3e3f3tTvA2BfxXEK/qXPjYsei4IjfMq+smGpOfDQI5Wb7XfgiDwix2nQ A0fE9NdrbxTfJ//wJxLHf+66nzxLNn0XAfx129NJB718P44pjsfpSo97Ff3sZcqVNVU5Slv6N+V2 rtrb6mQYtuESczTbjuN9ehCWoDQiV0bB10HFydPaQuzHCqOpjsTj9iYwbJwWmLTi4CEdYWRxIMOg p2dkS83rDv8knKtF4wj5XZ9/sLTpfXlLnnH8arqqwxmnhZxu88RBIaPhHNX2kr1TKjhK9H5Q2Shn iGmSKz3jj7gSx/3eeGSWbHyRBfxlvWFJHtSdvtSjkhaKVLS/0u00PktN8+sP/6TLopDOCHXn1AM/ drLUlr7skSbZicCfiKe8pbY9X3aYHxjl80jij84Hx/S5WJpgLwY9LO1Kj04IwBEHwPSZHjyA469/ e4Xzxw6ZBr007fHiN0tdtzPTDBrNiza+3fmnBr29GYOeUPAIl5t/yTeDbXukHFvJ+R+VXq4rOdZ+ Qh5f8Mq3Z9txklfMBlnj8UT7IoscWBGHYWm183P1Cwy6/YIPRWFtkLnHbs8JD+IPrkcdd5JzdBAH 6B2X5OcNCfOfsPjnwBrYLy/6Q/Mf6Rub2FZ3XGpesf/7nOPbP3hCdT9G7x559Ime4wTcaV9kKbfj tG2kW+AUYrYWBsvLdhvVdNK+t9cbgj8piMyOS839D6RvbrbziG019R9ilSs94xj9GdY/9ImvCdc9 /+fwAtMJxyrdVtsckWPEL4OeKafPFnE8Sftvmr59ynkui3jf8p5jVcH05DO9yn6syzge4/YmY1Im Hn15dMtSob4sjseBsVIou2YLC0+9mDXqq4XCnDvPhQNTUrauYaJOhGAO0aiaTxIKyFYxaq5h3sEs EDxUvx3r6DhGcxtz0KPZdv4isuAcnU8FE/WB+NO0sBxr2CxyLCILztH5VDBRH4g/TWPiKLc3Ycwd i4CRdwzK5hgECwzkzQI5NFmbAjN71O42rPNjJtkKFskyzF2MkGMfxhwJmyZ/jw8egVnsmAJDFNHu Niqxqu8ejHkQNk2OiGFmOWYehC0Uxz6MORI2Tf4eHzwCs9gxBYYoot1tVGJV3z0Y8yBsmhwRw8xy zDwIm1eO8j49dRKCHoTp92PW1lq7UoaBeLZEgLCd2SiwMGCQ1QWPsqnlGNpgH5jb6sIQT7l2pcE5 Ip4apu1T5u9rBxaPY4Yh1nLtSlPjLw0LzlH9ZoDU152/rx1YPI4ZhljLtStNjb80jJCjfZFFIAvE JGjEhaJiOrtsiYlqYDqpjZhCFmjUzX7UOjCzb/F4LOxfKwWPPix8zAvHPoxj9ThFHJjqrok/2zGP kItp5BznJMccj8fC/rUyao59GMfqcYo4MNVdE3+2Yx4hF9PIOc5Jjjkej4X9a2XmHPXN6d6IEhy1 FdRXYZAx1wdUxyS8XozaMLlZLC2OVqz9GHTbGFmfMUfGHHeXWHZz7MOg28bqsUq5A9NY+zBqw1TB ZsJxxjmOZTePPgy6bYysz5gjY467Syy7OfZh0G1j9Vil3IFprH0YtWGqYDPhOOMcx7KbRx8G3TZG 1qfIUb69ySHHxLWQijpKdUxbI3DH4LzAssBQcERHecfIC9o4Cq7lGGqYuMYWUEepjsH3IBwdtrYZ 8XefC8xRS3UMvqfJ3+XIC+Q5ihqrvIaJa2wBdZTqGHxPkyNjEfPscuw+F5ijluoYfE+Tv8uRF8hz FDVWeQ0T19gC6ijVMfheiaPe3rQksQERcWIVrGhxR2SLsYcefrQ5+xdXNOf88vLmnF9e0ZxNs9RX gdXW5/zi8iiXs2GBk60+rIgDs8ZTx8tYGV8N1l5fnnEs11Pnvz1wJPul3dnw3x44rleOze5Cc2zH UNqdDf+VOa7HmCMVG98Ys1cL5YOjjr/Sqn88eNJlpo6cwIrB05wGZjEAg10AjmFhfoCFskfnMOz5 EhgCMMyg3IqV5oyjaYXNQoexYfhH2c2YQ9Uiv6PlqBXEFxzdwzD8TcojWESOGeZmwwdF7qqD8I+y mzGHqkV+R8tRK4gvOLqHYfiblEcwEo47hGFoQoidtjE0YmRGizssMK33YAhP/BIRxyKOsrM41hwz k2hbJVaLNZV6efRhqm1+V+BYweoch+Hfy6MPU22zPd8caTGbHGfxLCjHClbnOAz/Xh59mGqb7fnm SIvZ5DiLZ/45xhNZHNBFWlexRIuwPMmBaUcxxuvoxNYatk0mfIU+Y6mAZq2QT8gB43hGxjGb1pH/ 9sBRyh3YEPx9WmCO0GfMQUzryH974CjlDmwI/j6NjKNe6ZmyasfMGAIrMXEDOfPujgTziBC1YRqI 2/R2dKD5CZUgJAuXDC24AGaBMQ/mwDxCro3NhGOGYUm1wflHyIvLccY5lsWCc8wwLKk2GH/Vd3VY XyiObUw5wpX50VCG4y+L8XDUH6d7C4yGFIJ3rRbGjWSrhVkXZc6iHJgVSE6WhW8nW1jyBsbGzLEP G5C/ywvm0lLPsExxXBxzjBvJVgsbgP/2wLEPG4J/NJNy7jzDXFHLgVmB5GSZm5oNx8LPzHM8Eo72 7U006Z/XBTOSYSLD0ApMcBmVw0lGItPleFg2fAJzH8tN8+jm9Bp6D7K54e83N+f99BKpp5dxQm7z Y1tMZH45bpbXIinmPtxUcOS6W6HYAWzekt7o7WRNnfhOyF8sdnDckl4fRLrmHQZJNuwCcx/EgzHU V8Im5Zgegpteevq8l7+l+dp3zg5dDwkcKDabmP9Bb/6YPAz49tvvFpvfOeW8ifjfcdc9+YN4zfYW yZMpmR7XPRYtmEidY6o/8MAmeUDwli05j9CL1rTUt7QHx+VlyykM2jQJRwvRMY+v4FTj2Iethj/3 r+vaxHlUD6gHvvmxdEwxCYsHsn0c4Z8CyeorYcwxHQvWwhGY5jRiA8cafzyE/S3vPVYeFr1ls20P YdBlS/7L6b2kglrdCmmbTm8KcV8VjoiVsdVw1LiCo4dR4Ugw6fqP08Mph5JjuUGXlQAZg1oXxoEH BruOmW9HjVTasfd62eEhDx2Tt//8zQzptSzP0Bds5pGUehzr8BzThvecl7w5UE6qNXIM5lT+8fR0 YHffnV4IudR89/s/iRgqenmUJRaxeqngqE+Sx8tSyY7pqW7JQyUULDHyWMQamm0MnrswSKS3XKT3 oh369qObY75wcsERceUcQzsturDJ+Z982k8D5Zf0WmMfjz4sJLThlNN/bhjHmnP8y7XplVpL8gJV SMmbPez1MqXlkqPGvtFeJ9R+o4Aqx1tGppVjvHmAsZAo9TwSWPY8/ucz9U0V8kJp09Y3m9AbIlyX +Jt9R81eYBTTGjimmPZ++VtaWEiUemavaZp/3XqnvJHhO6eeL/ZhTzlBTX2zHiw7D8I85oK/v0II pC2eXfdOL9qN45E5xX8v/5AoMY5Va7DR5pEWXVjOMfsiCxuWkbOKJX0YRTtpAkPQvK5gqHM5x6KM QW/P/9ZBz3FPRrxvzQ8sFll6ASd27G3h+NkvnlLl4esKhvqtt9+dYWlDTYMeczznxxfZAUPfAo5E mjWLKd4lB+yue/TdWDroRey5nnJO79kSH3ixrMstN7//0190YNuwJO+9Q6xY54NtYOmAi1e2HPL2 ozNMK3lfpMWb3nWM8tiw1Jx+9i9bHHWq8y85/vu+9Dqp4AGpl7zq3b5tXHHldYR15zjDiEd6/dPT npVeCIoTqsAge8SnvtHSS++nu/Oue10utk1Mk3EMbLk589xfhRRtxzf8/V8tjsmXnlylQe9GiV8G PfOpOcWLWS32Cn/UuczY57/6Qy/rthADe9d2bGAV+/Anv27leBUV6uCY4jz/578hPUXkhbyGq31F /tPe4C6DXoU/ZP/3wA/qwLFho7zPMbCiL2yd7n7g5CG94zO2LZ2+cdI5/tqw9300vaILEQe/vf77 cG9VZLl55JFH5W3neB/eD89KL70O/mlKd7eSfhr0gPirhip5TOt0ZyANVHu97PAqf1ktLze/uOgy 15M4hSPy0DSPPaavOku+vv6ds6t5BEfMJUeXWsPxOMMKjvJfwXbQINUcDIZfCFcwW6s6Aqph1AhZ wlzc7dQx8W7vRtvrZbpx+Iy3HdPLM7OkL9tbp+nlne6AOP7Pvu/p5Sg7Qfausqb505+vk7bLr7zW 2/AW9Pvue9BN6UASG0uymWRk0LP6/m/8qLw49rHNW5qHHn5Edp6k954jvmgJ8+iEn15xKf+701ul d9zYfPcHPzGOFo7xjzj0DDxN6R2BcrZu/D9zwvcE/9KJZ8itCh2Q8FJMtYA2KAkPe4/YWT+6UOrf /N6PMr2IJSKDnfQi02+ffL7EfsrpP8s4XnfDP31HB48PHPll0b3l1jtd7qWvepdddXjvyh98pPcM HnDox6T/b7zplt4ceyNh9957v9hKbxNP7+njAzpzTDLP2DO9H9GiWG6aTx37Hemb226/2/lrf9m7 8mhOcjvv+TpzrGhqSycf4H/lX24Q3S+feEbGQ98Ev7H5y19vdP7Akj8Z9JbTy5NvlNjToAcROejh XYEZ/8hxeju8d4n3VfBPcb7xbUcFR3qZLXWlvJFeTz6jLcnJtmwc0yS5s5c5i30bUMKevjQ4yaXt zRwL9tDDD5s+vcDZTKdBL9lNgx44Mv/UhH31oYcebt7+geOlnE5amD/6Ny3vvifte0vyXk7lgytn nZ7+3NcJvyuvvkHfzbhBT0LMmvvc82WHVffV3Z7/RnlP3sW/uVz7aoO+WBcx3HzrnaJ/0inne25q xyp0RTopTdgLXvF22W5K/mm69A9Xiw3d99yE9w18p5cwP/tFh8p7EpFH9QtLqulhUI6xzPZHymML szU4emMLo0bIEibv05MR1oXVVWpgLDYeChoBSt3ayU4dCwGxbWczT3nma5qt9rmC44WeDG5p0MMZ EQ6Q9lLWuHLB6+v1Sij9PekZGPRy2+Coibez7w6OeuZHZ69N0/zq4j+Kngx6JqsvhN0ot9XAUXZC GvTSlNr2KK70eEo1PsM1trKUjQt8l9OV3r8ljnSlp0ImTxzTSyNxkEhtB6aBwN8Q3jS7v+jQ2GDx MlFcAVgeyzO9NOkLJONWcptHO/+wnWppUEl8Dn3H0RnHP15xrfj7QTq7NR4f/NhXRDYNemh7yave mfHApAcf3UF/d9lfpHzBRZdZUJFjzStedso8dMIbz60jYtCziXPMg16adNDbKIMe+DN35C+tE9c0 6Kk9nVKbXnGrj3TgxKCn1jQmGfQ2LDXX/DW9Pdu0jWPypXcUmubqv8btTTjBttm1ryZc9602hinF lAa9kqNLgiOddIG/n7DStsoHT+lbf1t75DgNeqntW7Y9AwN/2VZpn0/Onmwv4t2Kz9I5Hx37aqqn 7wx08T/nxxdLvOluQ41jua+Wxyq07fnSwzIeP/rpxdGPy8vNQW9KJ262TVOO0xvdk8xJcntT+deO VXWszT/Z5EEv1Nt9Y2ad2wte+TbjajxcKGwzx7DRxsrtWIva/4pxPtxQBaNY8e3NUtHMGxtz4kqK gaQGGpi584Yoh7kS07NCfgu5YumD2XRWgUTjYJNuF8Em2hS3t3zbmcuDm+yt3fSZHqaS4+nnXGAb p72xmN5sjZ0SmLTbGQ9jysNkDMMGVeOIHbvGMYulxKz83HRmaD3On+kxNRRSsnd9/huzONFvnONp cER811x7o+dY7auT937kSxNzxLorx8wjs1Fg6F85w/ftcPLtGPxgdxL+3m84cTD+Kj8MR+QxfXlH bHRsx8wRPPJcxb66x4v1ZGgljtf/TW+tpv9PHvvtbc7xl75xhsdSbqtp0kFvY/Otk9OVXiNXZt4n 1HfIVzsfaq7k/9GjTmxxPO9nl1DfRAzpDeZPtGNLyVEklxt543sXR45z0hyXHNHPvB0DK7fjVE77 AGyIb/icIMcqb/H1bMfo3DjeIQ7qeA+sjrmqFCbfV6Mc5hjbAaAYJWkW7MPkz70GZggqEG9hqe1p zz5QOjVd+gNLB+mLf3NF89Td9hcsXVGpTpxBXPzbK4r5z3L7Kd1nDk86XfK7KwXr4oH6tdfdVLF7 hXwLDxyvuPL65jun/ljag8dy8+tLr2h+femfYV3u8yeZSy690trcs3NMPn/z+yvlfnyK77Ir/to8 8qh+A8pDbZblIPa7P/6l+c73z2+ul89tAkvlRx97rLn40j83t9x2V86xaZqHH3lUNsb0If5Fv7lc YvrN7/5c5Q+9hx9WnbTxJ/kUX7rlCfErr/6btKF/UuyJ/8WpD377Z8nFA5seys7o0kp2nB2XmtPP vcB1U3zonUsu/bP3BXNU+38WMdhM9UxuOelf2Zz0fdVPs8R26Z+bhx96pMWR+Ws+EMZk2/G11/+j Ofv8i8TH/Q9ucpHf/eFq2T5Sf5T8o7Tc/OFP18jZeYpv00MPGa5XpSn2zfItZW2T7ffSPzdbt6pu snn5ldeJfvKvYoGV269sh8h5wRG4h0Ycmf9ll1/TspnmxzZvbnFUneXm2hv+0Zz7k4ubCy76Y3PD jf9yNH0OlTje9M/bvO2a624Sjvfc+0BxJbDseeTYj/n8yXKATf2QJsRz0W+vaH6bPoczudvvuEe2 qfSZrpnTVYV/yeOTn/22bK9ye7PAfvbL34n/Z7/4Tc1Fv1EbV159vaHKv9yP77r73z6A/fLCy+Qq EViS+91lVzff+f6PfX9K63RLO/ne9PAjuo+leC+9ojnn/IuaCy/5U/QTbcfY/mt5LPkD++Pl1zYn Jd+yncW3eZO/tJ098shjrp5uayZZ3d+x/6djH7zYwFXkkYrWP4QRjz4MHEsbk3BMkz5705T1Hw7N KhkWTEiQYSOlYhwABVjFwlcC3m+f1fBZmWwcO25srrtBdxaTNiOwjVbuGLKdYZNzPOKTX/czwmlx pPBoEZFGC5Q9UkdRWg3/X174B9lx5Wx1Bf5Jzs9Cd9yoV9VT5JhsPu7p+5jc9DgGpnz6OAomPMyY iKw9x+nMd+9XvLV5wSveqmfchJlxW8bk5XXgmPr8I5/6+jZx9DgmyHG0QNkjdRSl1fJ/5wdOsG1U T56e+9L0WaXhFsu2cvzop78RVzY7bmxesd/7IjbIN03z/o99RY8RotzNUW/f636lxzS+48NWzUIE 5FidY+QYtsBLxUqOk/FPccpnfTtulI88XKDg77pSgG1I9Odxlhz92ZtixH1qIwILB77wAB3TVv2D 4wrmMmGpwHKdtry1mvFcHpgWXM8EVsMxnWWnzz8yzDwoN6zbmMt4bNEGz6zTljcEfVy2A5uQfzqj TBuwfC5BmMjLqs1f/gbgmHb+9AUaR6bEUXmsLseKmf8Kx0n53/jP25p7//2AbDPX3fAPw3Idls9a B+b4pnd+pnnTOz7TvOmdx1R5TMrRvBRYrtOWNwR9XLYDG4K/WZG/gTh+wAe9GXGMxVS2Y7PUXHXN 35otW7c0/7r5dvlWOOuwfNY6Io767U0OmIOABQrSTaG9wFBGJziW6UaD+kH7VjkoPnHnffx+sWMZ AdIzslaJkNBk7XPDsYtHH8Yc+7Ap8kd5kTmK1XCZYSgPwT8sELZgHKvYDHKM8iJzFKvhMsNQHoJ/ WCBsBBzl9qY0wynVa5iQkiLVGSOP6sjcFhgC6MTcv7VUMfUd5NGRIdvFow+bL46infkJbED+AkUd 9ktM5x7MfVhLJzYDjlKkOmOiFnX4LjGdezD3by3bDccalvsJbAj+GodCwMJ3iencg7kPa+nE1pOj xSpFqjMmalGH7xLTuQdz/9YyYo72Pj2tqCNrgZEC03JgiCXkzDjLo55hgSpGZdY0DHBY1ZITq8RK LXVsDBzNpnnOMYsFWMmDWurYBPzt363I/4JxBKoY5CwOlkd9W/lDnkoLxzEWippN85xjFguwkge1 1LEJ+Nu/W5H/BeMIVDHIWRwsj/q28oc8lcbA0b69aaIYQZ20yvdiFoFjpgBfKhYYAg4sFlXMLWiH h3OoWWcx5iM8SJdYhUcfZrZnwVGh8L1u/K1xoTkyZrbXg38IEL5gHBWLVoXWj7+RWGiOVcxsM0cT Jx7T4R8ChI+Ao/w43YPiCQqGhQQIBQEYzjCXNsw6wu1Z0MAEhj23Sxg8ZLFC30oFhlUbCxGJYQ45 +kSxcawGmr6VhuDvLcFDzZnOInCcUY4jVuhbaYE4+kSxcawGmr6VhuDvLcFDzZnOInCcUY4jVuhb aU450pVeaLkCYXnVzHqnEGZOMbUw6kDGPv+VH8hXv9Pjwj73pVPlcUEv3vhONmohWsEU01eK9/of fVDrk3Z5df7DyNwxDLi5EpsWx8Tj+C9/v/nEZ7/VwtITN9LPAT5zwsnNG97yKftZBAXlG4U2JSxx 3HXvg6v8pZT0LWbnuK38tUULpaisteBuSwyuYMK+Op+eHuE8DMOPX9WYYnu//K3eNx6rO5sSxwlz jK+uA0v1s8+7yGSaZs+XHi5tK/F3hTXmUb7ctWGpedH/vr15xf7vl6/tu56v18axikGnCyOOKTb5 MbkrmG2Ydx6EASz4p28Npv047f/pd3LpWFBydFVr80fqlfy1RQvc5mstiNUaNkkerQnb8RVXXdc8 Y6/X+0+uoIdYw1k7x+GjzZGxvBo5vkCeEBXbqupboTQjay2YmTY2CX97JrH/wH9gji1RldZCDYOO tcmgVwoFwyhCMZsYK3QphBzzqoQgPpN++tZmeoYbOhEBpim9ckMOPLJR2TM1zWLasPb677eIzhPt +ZpJT546gKcFFAetPf/7MDuAxBMIFFtuTvzuuRn23R/81DHmAZt4AgF+zIkfnurvfIqdsFluDn7r p4XHEZ/8WsYxYX+64lrnmPR3e+EhgqW6/F7GfqQuv2U0309+5r7en4lr+k0RPxkBIZ90yvn+1IQ0 H3jox6U9PcFFZO1JC6em51+avVjao5XoKQzIYyqnh/tGP8c3br/2rbPid5eGpUFPN19kOn6wrn2h yPNezr9504H/mM9/T2Re++ZP+I4N3vIgaOe9sTng0COzPILIni87PHjgcU7ylPiDm8fthLwpx/RE IInP+jJVgCHHqfHN7z4mDjTNcvPUZ+2vT62wPG7erNvGl0880/xqjtNvING/6A8p8THD2g5+21Gi 27WvpmeLch715zZN88uL9OcqwFJM/7X7Af7Q8YSlJ4rAFuc4yR9wyJHSvumhhzOO8CM6RY41/mX5 FrZvq+k3n/KQ53g8GLCTf5jeQhH8H9z0sLSnh1ak7V2t6ZR+nM/bseTWtqHULhboaUfgiOPX43fa 2Dxh53RyHBx13w2O4CF6zbI86YU57vScg5wj4q5tx3fceY/offHrp4nvr590tu23ui+devrPRTY9 BJz3r7ROv6lNWNoGPX/pN670E4kk97idXuUYHiiB7U77xk6WXE79/PHP12bb8Z+vvkH7mZ6lyzlO lJJeeg4o+kYHOcM8RjuB7diOUezajrk41JgTz94sZCOd3FYiZfD5RuBtVhEEPtyhHcg3LDVf/sYZ JmvKRix19qsO+pA16Ub/3o+khzDrAUkGveVlfxwQfKTHYKWD354vO0zsJz9n/uhCS4pGe8XV19vG rU81SdiRR50oZ5if+Gx6lJL9QJv4yGtV/GHPTbPLXm8wv8oxYfKUCOIomPFJq1NO+5k9bijFtVl2 9GTjd3+8xuRy/voj0bSh69PYU3xpTjr6HEXFDnv3Z0Xn3vse8I0+beAJu//+B6P/m6a56R+3ygb8 8WO+JVzf/7EvxwZb5DE9geG1b/qE+E466fFL2v9L8qzRJCQHhw1LzT9uvl10Umz33HtfxkMGPcsj OOrOtbH50Ce+ZvNX5QHHOHMUWzsuyRM4kt5r3/xJ0QGPhN186x2CpafVJCzFl6b0jM4Ub3r4N+Tf 9aHPyzMCU/s7PniCtKWHBUtOLWcJ2w0PELY8CWYnaOf/zJ7sv9zIoCdXGcvLzQGH6OCD/Dz3JW82 rPEDlGy71idJBxxfecD7m1fu/35Z49mYiPkpu+rbAWr7ahrYGEvPVkUeFYsTvo8d/U0bvDTD6a4K 807xpcd7Jez+BzaJbnpSUnpiDDhiHxQ7FnzCvvndHzkvOYBvWGo+eUxsp5BPazmYFvyVVOwnaZvD wfsLX0+vQtJt/Mm7piu/4C/tdDL8hHTVt2PkQA7QxvHxlgP1q/vq295/vBhL8b74f9+RxSDb3oaN zbNfeKhzSfF/46RzBattx87L2g5521HyXM5U/uhR3xAbRx59osXRNFfLoJfnRHJmHC/70zXNvm84 onn2i97kHNOUZOLNCjqlB85zPsGxzDEGrPSPgVixJRlYpe+OUa5P2Hkfz3F6hjHn+KzzLpTy+z7y RbFTyyN46KQx1bZjQ6yMthLBthLbDDCZ0WYVcISvtNCXyJpwHpgl1AxMjhkhmRmL8JRwkEhT6tC0 4aaBKSgEtuMeBzqhtOEf96VTFbMHUKd2eZOCHQw10XbVYbeG0oHwp7/4LW1gTXPWj34lcog1YelR XX0c/2ff99pBUDEfbM1qsnf5lde3OCY0PcpH7antpHfoOz4jZ5uJV3qgsnoL3SSzu1z1qe0kl9m1 fkmxv/ldn5VqOmCBv+xwO25sPdorvckh2UpXdyVHzqMMQHbgTJMOevqotFSWQc+m1C9/S28ysIEq vdWAsfREeOQRHHGWyO3p3WI4WEM37fhpkis9x3RnTINemnCVoIOe2d+w1Nxz7/3y2DDWS+V0QErl NOjl2FLzzL0PNo44a9ZJB710Jq79pIOe4u/+8OdtAIJ3zpRtS/bQ3/R6l1oeTTLLh7zpYcNS87Td D/Bc6WPhUh4fFY6bNj0s2IF2lZswudKj235f/fZZFqt6wIOqffvfkJ6A9E/B0utwEvbwo4/Kfpkw fZuI9o/ua8oxYfK2A/OjfRZXCc7EtgvZ5wqsi79ekej+Jvs1nfDAvpyYWL/vsvcbskGEj0c+6Bma dN7ynmOtvFEO6mFXdRBvTMijlj2GYjt+yrP2831V7zxtbC6+5PIWR1zppUqKM53glscxlvNc2UOm JQJxuiyDHm/HwkuuLPMcJ11jKJhss4apfvDXKDXH6RgL/slGemZxwtOJnO8j3i/B0QHjKLXWMaf7 mNuP5TkOzFHfVxM2Vz9O11dnxOPH5G3OhslnYYalZzVCLyU0Br1X69lG08itCk3gUnPKaeldb3F1 cqK820qxdBtBdgKLL71BONnATn3GuRdUOV76h6vsCsDe+kAck64+D7DNMb3mhjke+8WTHcOP8xOW Yvh7GjDs0WC7v0gHvdR3T0rvBDPf6dmkmkrduA/jQQ8HpfRWZTxk1ub0qpL0h4fPYkc4xz6rkrgt j3jNUNI7Nt27T7dSZPDWg8Y+r/1Q5GPHJYk71W+5Nb3nS3fa/z3gA8JDrsgsXiyRC7SkWW5v4gHK y8vyzFEc/G674246o9b+kUFveVkO/AmTQc/6Nencc8/9Fp/ySGevSQ9vBki3N3WbU+6pjEHPDxLm T2xIjtKBZGtzWLq9Sbd1/3j5NdXt+GPHnOhtaVv1XjCOzt/OgiUUNFm79KflcMOzD3AMg1IWK64C qa+++q2ztW7TaWdf4P2cpoQ9Zbd06xO36nRgTdOLlt4heOIgt+JpUNPchE5qTXcQZF+ybVVub9pA gwN5jX/STzGIL97GdYOUz3uxHf/v/h/wHPN+/JFPft1PVpIcXiWUBj3vD9tXD3/vsc4xXSWC4wlf +YHHpFeP6mOXvV8v7R6vLcEfuf/C136YcdR3z9l2sWGpOfO8CwWX1z2Zrm8zsn82zX336xViwn5x 4R8yjinO9IxXicTym2Zwfubeb3C5MscYGJMuThhQf8Er3+45KnMsV3r2l/ycfs4vBUtvyNHtb6k5 6M2fsI0WfROxaV9gtuYW5unw7bjkyBjKk445+u1NIyVrRIEgCgyGfdQtMVEPQloPjIM2TdvguzBq rmE2uqPVUVGCfh6rPPFlw1LzX7vpC0HTARDY3HKM5jbmoEfTyx+Yxt/GthuOzqeCifpA/GmaN47p gJhuK5poAB7rhBxr2CxyLCI5R8bqPNaXow56+d0B5rEiR+dTwUR9IP40rcQRPOaBo9zehDF3LAJG 3jEom2MQLDCQNwvk0GRtCszsUbvbsM6PmWQrWCTLMHcxQo59GHMkbJr8PT54BGaxYwoMUUS726jE qr57MOZB2DQ5IoaZ5Zh5ELZQHPsw5kjYNPl7fPAIzGLHFBiiiHa3UYlVffdgzIOwaXJEDDPLMfMg bF45yvv01EkIehCm349ZW2vtShkG4tkSAcJ2ZqPAwoBBVhc8yqaWY2iDfWBuqwtDPOXalQbniHhq mLZPmb+vHVg8jhmGWMu1K02NvzQsOEf1mwFSX3f+vnZg8ThmGGIt1640Nf7SMEKO+js9hazN1haU +mIMMxly2MJtBRAkvR/YPp0JiLcMs7W1QFYnK6NHvG6LMGrYeDhiqmGEUkw6m3ldhEPDVsGfxHi5 UBzNsUs4bPYG5m9etA6jJmUmdBFGDRsPR0w1jFCKSWczr4twaNgk/ElnYTmmNWZrskL4ChO8nCZ/ 86J1GDUpM6GLMGrYbDjqm9NzLXMYdXcMk0LUwRxzfUB1LAuqilEbphYxdFwZaz8G3TZG1mfMkTHH 3SWW3Rz7MOi2sXqsUu7ANNY+jNowVbCZcJxxjmPZzaMPg24bI+sz5siY4+4Sy26OfRh021g9Vil3 YBprH0ZtmCrYTDjOOMex7ObRh0G3jZH1KXLcQQoOkdGsFlJRR6mOaWsE7hicF1gWGAqOxBkFosIS bRwF13IMNUxcYwuoo1TH4HsQjg5b24z4u88F5qilOgbf0+TvcuQF8hxFjVVew8Q1toA6SnUMvqfJ kbGIeXY5dp8LzFFLdQy+p8nf5cgL5DmKGqu8holrbAF1lOoYfK/EUX+nV1yiYl2OmBlWtLgjspVh 4jUCchmNRn2ZnGAQLTGWcbfACfDJeIyVo8sYB8Y8JOgS4NMa+W8PHOclx+4WOAE+jZyjyxgHxjwk 6BLg0xr5bw8c5yXH7hY4AT7NnqO9Wij0FdQ/L4WeOYARENdaRsQ7BZjFAAx2ATiGhfkBFsoencOw 50tgCMAwg3IrVpozjqYVNgsdxobhH2U3Yw5Vi/yOlqNWEF9wdA/D8Dcpj2AROWaYmw0fFLmrDsI/ ym7GHKoW+R0tR60gvuDoHobhb1IewUg4yu1NFoi42Fi5piBamJh2B51YYdRJm22PyzAKzC0IZr0D oiZpmC7c1pg5uq8KNgh/8tSHFYrObBQcKcIWRlH0YYVRbVmJP9fgf9E4QhdL4+i+Ktgg/MlTH1Yo OrNRcKQIWxhF0YcVRrVlJf5cg//55xiDHhu0oKuYGQaWBxJYIl8GGesg11p7R1io7ovJBpYKaNYK +YQcMI5nZByzaR35bw8cpdyBDcHfpwXmCH3GHMS0jvy3B45S7sCG4O/TyDjugEA9QJoZQ2AlJm4g Z97dkWAeEaI2TANxm96ODjQ/oRKEZOGSoQUXwCww5sEcmEfItbGZcMwwLKk2OP8IeXE5zjjHslhw jhmGJdUG46/6rg7rC8WxjSlHuDI/Gspw/GUxHo7643RvgdGQQvCu1cK4kWy1MOuizFmUA7MCycmy 8O1kC0vewNiYOfZhA/J3ecFcWuoZlimOi2OOcSPZamED8N8eOPZhQ/CPZlLOnWeYK2o5MCuQnCxz U7PhWPiZeY5HwtHespBAGyHhUEZWxsgoYYIXDhkL5yjnskCjbvaj1oGZfYvHY2H/Wil49GHhY144 9mEcq8cp4sBUd0382Y55hFxMI+c4JznmeDwW9q+VUXPswzhWj1PEganumvizHfMIuZhGznFOcszx eCzsXysz52g/Tlenph4KGRYGwxxIMwa1Liw6hTHYdcx8O2r2LJiQh47JA+7DQqLEIp5Zc7T8ZDGY UzfXx7EPC4kSMx2XSAu10cYoVsI8rlFwRFxqo80xLbow87sW/rBixT4efVhIlFjEMzOOGUZWCx6h 2cY8hg4sJErMI4H2gnKEBOJSG22OadGFmd+18IcVK/bx6MNCosQinmlyzL7IwobTyFnHkj6Mop00 gSFoXlcw1LmcY4WcLhAJkQlMaxwjsCzS+eYYgVQ5GljFtBZzYBmLyfhTrAvL0dtJs8LR1xUMdS7n GJU9HkwLyDFbi7MqRwOrmNZiDixjMRl/inVhOXo7aVY4+rqCoc7lHKOyx4NpHBz1fXpZeOZGZCFc wWyt6giohlEjZAlzcbdTx5wg2ngWAXcmraEbGJZj4oi1Jox48bwu/KlRVovIEd5qGDVCdkr8fV5g jlivV47dKzlaNI7zlmOf55yjvE8vBcIxRtICk2AFpKARoNStnezUsRAQ2x2Y1uqYWbQYseYzhWgr eYSNNjZPHL3mnMyOtWfYIPxDVkXNayXW8XI0XxZbm6MbqmAhsFb+2wNHrzkns2PtGTYI/5BVUfNa iXW8HM2Xxdbm6IYqWAislf/YOOpPFvJ2l+vD0OiBWYtW25jWezDV9qAZ9RpWWTzQqWFmEm2rxGqx plIvjz5Mtc3vChwrWJ3jMPx7efRhqm2255sjLWaT4yyeBeVYweoch+Hfy6MPU22zPd8caTGbHGfx zD9HfbWQASFPZSl0Y/KnIhlmCCoQb2HRlmPS0RVMfXAS3JL+Z2cQJFfEl5VHwDHWbcy86P+U+W8P HFNBY23bGIK/lhabo+q0Oca6jZkX/Z8y/+2BYyporG0bQ/DX0vg46rM3TVn/4dCskmHBhAQZNlIq VnQMAqxi4UvlcsyMQ8IxlMM2WrljWJOxMXEMHdZEaXj+bmqBOZoxEVm/HDskhcXkGOXQYU2UhuNv ts2W1xeKo/mdUY4dksJ4OPrtTTHiPrURgYUDX3iAjmmr/sFxBXOZsFRguU5b3lrNeC4PTAuuZwJj 4igI/JftwAbkL38LzlEx81/hOBT/rHVBOUb7jHJsVuRvUTnGYiY5zlpHxNFeLaQVh1C3qCDsgRGG VmCC+8gM+SwS0rVmNUiy4ROY+3BTHmRWZ7kQWTyOfdg0+IvFBefIGFrXgz8UXDPDFoMjx+aFCsc+ bBr8xeKCc2QMrevBHwqumWHzy1Fub4qIyJArwduYGhcrUWdMPXjdXLawiKgDc//WUsWsy2DKsEl4 9GHzxVG0Mz+BDchfoKjDfonp3IO5D2vpxGbAUYpUZ0zUog7fJaZzD+b+rWW74VjDcj+BDcFf41AI WPguMZ17MPdhLZ3YenK0WKVIdcZELerwXWI692Du31pGzNHep6cVdWQtMFJgWg4MsYScGWd51DMs UMWozJqGAQ6rWnJilVippY6NgaPZNM85ZrEAK3lQSx2bgL/9uxX5XzCOQBWDnMXB8qhvK3/IU2nh OMZCUbNpnnPMYgFW8qCWOjYBf/t3K/K/YByBKgY5i4PlUd9W/pCn0hg42rc3TRQjqJNW+V7MInDM FOBLxQJDwIHFooq5Be3wcA416yzGfIQH6RKr8OjDzPYsOCoUvteNvzUuNEfGzPZ68A8BwheMo2LR qtD68TcSC82xiplt5mjixGM6/EOA8BFwlB+ne1A8QcGwkAChIADDGebShllHuD0LGpjAsOd2CYOH LFboW6nAsGpjISIxzCFHnyg2jtVA07fSEPy9JXioOdNZBI4zynHECn0rLRBHnyg2jtVA07fSEPy9 JXioOdNZBI4zynHECn0rzSlHfeC0gZhyY6YITK2RUQot/HtDlMNcHdPO7MK4IeSwCOOMaTHngamG kXv1g8osOBIWhg1zG1hMn7+7s4Yoh0odGw9H8YPKLHLsclgsIEfCwrBhbgOL6fN3d9YQ5VCpY+Ph KH5QmUWOXQ6L+eYotzfR6GA7mvyMBhNjhW5IFxiTpw5DR2pYtiRMXeAvTKIOW6wHO1KCLY6lKM41 R6l0YChNlT+sUp11F4KjTYwVuiE9Pf5WMgnCUFoAjmCoEjkWaIGhNFX+sEp11l0IjjYxVuiG9PT4 W8kkCENpTjnGszcL2aDDbSVSBp93grdZRRD4cIc6g4TKmrK3BeZkLWb4YBvuQyPTv9FxZCzk15s/ +1hUjlKzAnwNyT8vLyZHbQqdUn69+bOPReUoNSvA15D88/J4ONpLZJ0PzJoBNbU6zAjJzFiEp4SD RIaKDigQpv1IVjLY5XPMCI+QIyQczdoLu44BJWDN/LcHjn3YcPwzOUIXiaOGan4ZzdoLu44BJWDN /LcHjn3YcPwzOULnnaO+Wsgk1TBii3ZYAVE1Yu0FhrIEyFimGw3qh4Izo75cCTMyVkFJFxkP2Bo5 xz5sivxRXmSOYjVcZhjKQ/APC4QtGMcqNoMco7zIHMVquMwwlIfgHxYIGwFH/famU4DhIFdiMAwj LUzUg5DWA+OgTdM6qguj5hqWdL3dPToP1W/HOjqO0dzGHPRotp2/iCw4R+dTwUR9IP40LSzHGjaL HIvIgnN0PhVM1AfiT9OYOMrtTRhzxyJg5B2DsjkGwQIDebNADk3WpsDMHrW7Dev8mEm2gkWyDHMX I+TYhzFHwqbJ3+ODR2AWO6bAEEW0u41KrOq7B2MehE2TI2KYWY6ZB2ELxbEPY46ETZO/xwePwCx2 TIEhimh3G5VY1XcPxjwImyZHxDCzHDMPwuaVo/xkQZ2EoAdh+v2YtbXWrpRhIJ4tESBsZzYKLAwY ZHXBo2xqOYY22AfmtrowxFOuXWlwjoinhmn7lPn72oHF45hhiLVcu9LU+EvDgnNUvxkg9XXn72sH Fo9jhiHWcu1KU+MvDSPkqE9kUcjabG1BqS/GMJMhhy3cVgBB0vuB7dOZgHjLMFtbC2R1sjJ6xOu2 CKOGjYcjphpGKMWks5nXRTg0bBX8SYyXC8XRHLuEw2ZvYP7mReswalJmQhdh1LDxcMRUwwilmHQ2 87oIh4ZNwp90FpZjWmO2JiuErzDBy2nyNy9ah1GTMhO6CKOGzYYjPYbMtQpjFkJWRcBhNFvDUA2D ThdGXHNQZ0uHYyrLnRZlx3w9Io6Euex68tcWLZSistaCuy2xMXCcdY490AXmSJjLrid/bdFCKSpr LbjbEhsDx1nn2AMdB8cdzLWphWJhxqWijlId09YI0jH0QYFpnTFG4owCUWGJNo6CazmGGiausQXU Uapj8D0IR4etbUb83ecCc9RSHYPvafJ3OfICeY6ixiqvYeIaW0AdpToG39PkyFjEPLscu88F5qil Ogbf0+TvcuQF8hxFjVVew8Q1toA6SnUMvlfiaO/TK53pmkfIFla0uCOylWHiNQJyGY3GzioiQIuv jbGMuwVOgE/GY6wcXcY4MOYhQZcAn9bIf3vgOC85drfACfBp5Bxdxjgw5iFBlwCf1sh/e+A4Lzl2 t8AJ8Gn2HO3VQqGvoP55KfTMAYyAuNYyIt4pwCwGYLALwDEszA+wUPboHIY9XwJDAIYZlFux0pxx NK2wWegwNgz/KLsZc6ha5He0HLWC+IKjexiGv0l5BIvIMcPcbPigyF11EP5RdjPmULXI72g5agXx BUf3MAx/k/IIRsJRbm+yQMTFxso1BdHCxLQ76MQKo07abHtchlFgbkEw6x0QNUnDdOG2xszRfVWw QfiTpz6sUHRmo+BIEbYwiqIPK4xqy0r8uQb/i8YRulgaR/dVwQbhT576sELRmY2CI0XYwiiKPqww qi0r8eca/M8/xxj02KAFXcXMMLA8kMAS+TLIWAe51to7wkJ1X0w2sFRAs1bIJ+SAcTwj45hN68h/ e+Ao5Q5sCP4+LTBH6DPmIKZ15L89cJRyBzYEf59GxnEHBOoB0swYAisxcQM58+6OBPOIELVhGojb 9HZ0oPkJlSAkC5cMLbgAZoExD+bAPEKujc2EY4ZhSbXB+UfIi8txxjmWxYJzzDAsqTYYf9V3dVhf KI5tTDnClfnRUIbjL4vxcNQfp3sLjIYUgnetFsaNZKuFWRdlzqIcmBVITpaFbydbWPIGxsbMsQ8b kL/LC+bSUs+wTHFcHHOMG8lWCxuA//bAsQ8bgn80k3LuPMNcUcuBWYHkZJmbmg3Hws/MczwSjvaW hQTaCAmHMrIyRkYJE7xwyFg4RzmXBRp1sx+1DszsWzweC/vXSsGjDwsf88KxD+NYPU4RB6a6a+LP dswj5GIaOcc5yTHH47Gwf62MmmMfxrF6nCIOTHXXxJ/tmEfIxTRyjnOSY47HY2H/Wpk5R31zujei BEdtBfVVGGTM9QHVMQmvF6M2TG4WS4ujFWs/Bt02RtZnzJExx90llt0c+zDotrF6rFLuwDTWPoza MFWwmXCccY5j2c2jD4NuGyPrM+bImOPuEstujn0YdNtYPVYpd2Aaax9GbZgq2Ew4zjjHsezm0YdB t42R9SlyzL7IEmZ1VK1jMMrtpAnMiGbrCoY6l3OskNMFIjHyHCtqHCOwLNL55hiBVDkaWMW0FnNg GYvJ+FOsC8vR20mzwtHXFQx1LucYlT0eTAvIMVuLsypHA6uY1mIOLGMxGX+KdWE5ejtpVjj6uoKh zuUco7LHg2kcHPV9ell45kZkIVzBbK3qCKiGUSNkCXNxt1PHnCDaeBYBdyatoRsYlmPiiLUmjHjx vC78qVFWi8gR3moYNUJ2Svx9XmCOWK9Xjt0rOVo0jvOWY5/nnKO8Ty8FwjFG0gKTYAWkoBGg1K2d 7NSxEBDbHZjW6phZtBix5jOFaCt5hI02Nk8cveaczI61Z9gg/ENWRc1rJdbxcjRfFluboxuqYCGw Vv7bA0evOSezY+0ZNgj/kFVR81qJdbwczZfF1ubohipYCKyV/9g46k8W8naX68PQ6IFZi1bbmNZ7 MNX2oBn1GlZZPNCpYWYSbavEarGmUi+PPky1ze8KHCtYneMw/Ht59GGqbbbnmyMtZpPjLJ4F5VjB 6hyH4d/Low9TbbM93xxpMZscZ/HMP0d7y4IuQp7KUujG5E9FMswQVCDewqItx6SjK5j64CS4Jf3P ziBIrogvK4+AY6zbmHnR/ynz3x44poLG2rYxBH8tLTZH1WlzjHUbMy/6P2X+2wPHVNBY2zaG4K+l 8XHUZ2+asv7DoVklw4IJCTJspFSs6BgEWMXCl8rlmBmHhGMoh220csewJmNj4hg6rInS8Pzd1AJz NGMisn45dkgKi8kxyqHDmigNx99smy2vLxRH8zujHDskhfFw9NubYsR9aiMCCwe+8AAd01b9g+MK 5jJhqcBynba8tZrxXB6YFlzPBMbEURD4L9uBDchf/haco2Lmv8JxKP5Z64JyjPYZ5disyN+icozF THKctY6Io71aSCsOoW5RQdgDIwytwAT3kRnyWSSka81qkGTDJzD34aY8yKzOciGyeBz7sGnwF4sL zpExtK4Hfyi4ZoYtBkeOzQsVjn3YNPiLxQXnyBha14M/FFwzw+aXo/04PZxyKDmWG3RZCZAxqHVh HHhgsOuY+XaUCKPR9a0TgbmfDiwkSizimTVHy08Wgzl1c30c+7CQKDHTcYm0UBttjGIlzOMaBUfE pTbaHNOiCzO/a+EPK1bs49GHhUSJRTwz45hhZLXgEZptzGPowEKixDwSaC8oR0ggLrXR5pgWXZj5 XQt/WLFiH48+LCRKLOKZJsf/D4IuwX+UT5eWAAAAAElFTkSuQmCCUEsDBBQABgAIAAAAIQCcU7zj 3gAAAA0BAAAPAAAAZHJzL2Rvd25yZXYueG1sTE/JTsNADL0j8Q8jI3GjExrU0jSTCiUqV0TbD3Az ziIySzPTNPw95gQXy9Z7fku+m80gJhpD76yC50UCgmztdG9bBafj/ukVRIhoNQ7OkoJvCrAr7u9y zLS72U+aDrEVLGJDhgq6GH0mZag7MhgWzpNlrHGjwcjn2Eo94o3FzSCXSbKSBnvLDh16Kjuqvw5X o+BS4UdF1Fz6qWn0e7v35an0Sj0+zNWWx9sWRKQ5/n3AbwfODwUHO7ur1UEMCtYv6YqpCpYgGN5s Ul7OzFunCcgil/9bFD8AAAD//wMAUEsDBBQABgAIAAAAIQCqJg6+vAAAACEBAAAZAAAAZHJzL19y ZWxzL2Uyb0RvYy54bWwucmVsc4SPQWrDMBBF94XcQcw+lp1FKMWyN6HgbUgOMEhjWcQaCUkt9e0j yCaBQJfzP/89ph///Cp+KWUXWEHXtCCIdTCOrYLr5Xv/CSIXZINrYFKwUYZx2H30Z1qx1FFeXMyi UjgrWEqJX1JmvZDH3IRIXJs5JI+lnsnKiPqGluShbY8yPTNgeGGKyShIk+lAXLZYzf+zwzw7Taeg fzxxeaOQzld3BWKyVBR4Mg4fYddEtiCHXr48NtwBAAD//wMAUEsBAi0AFAAGAAgAAAAhALGCZ7YK AQAAEwIAABMAAAAAAAAAAAAAAAAAAAAAAFtDb250ZW50X1R5cGVzXS54bWxQSwECLQAUAAYACAAA ACEAOP0h/9YAAACUAQAACwAAAAAAAAAAAAAAAAA7AQAAX3JlbHMvLnJlbHNQSwECLQAUAAYACAAA ACEAk+HM1lgCAACaBAAADgAAAAAAAAAAAAAAAAA6AgAAZHJzL2Uyb0RvYy54bWxQSwECLQAKAAAA AAAAACEA4c+N1CnDAAApwwAAFAAAAAAAAAAAAAAAAAC+BAAAZHJzL21lZGlhL2ltYWdlMS5wbmdQ SwECLQAUAAYACAAAACEAnFO8494AAAANAQAADwAAAAAAAAAAAAAAAAAZyAAAZHJzL2Rvd25yZXYu eG1sUEsBAi0AFAAGAAgAAAAhAKomDr68AAAAIQEAABkAAAAAAAAAAAAAAAAAJMkAAGRycy9fcmVs cy9lMm9Eb2MueG1sLnJlbHNQSwUGAAAAAAYABgB8AQAAF8oAAAAA " stroked="f">
                 <v:fill r:id="rId9" o:title="" recolor="t" rotate="t" type="frame"/>
                 <v:textbox>
                   <w:txbxContent>
@@ -124,14 +124,6 @@
             </w:pict>
           </mc:Fallback>
         </mc:AlternateContent>
-      </w:r>
-      <w:r>
-        <w:rPr>
-          <w:rFonts w:cstheme="minorHAnsi"/>
-          <w:noProof/>
-          <w:sz w:val="24"/>
-          <w:szCs w:val="24"/>
-        </w:rPr>
         <mc:AlternateContent>
           <mc:Choice Requires="wps">
             <w:drawing>
@@ -203,10 +195,7 @@
                               <w:jc w:val="center"/>
                             </w:pPr>
                             <w:r>
-                              <w:t>College of Science and Humanities</w:t>
-                            </w:r>
-                            <w:r>
-                              <w:t>-Jubail</w:t>
+                              <w:t>College of Science and Humanities-Jubail</w:t>
                             </w:r>
                           </w:p>
                           <w:p>
@@ -214,13 +203,7 @@
                               <w:jc w:val="center"/>
                             </w:pPr>
                             <w:r>
-                              <w:t xml:space="preserve">Computer science </w:t>
-                            </w:r>
-                            <w:r>
-                              <w:t>Department</w:t>
-                            </w:r>
-                            <w:r>
-                              <w:t xml:space="preserve"> </w:t>
+                              <w:t xml:space="preserve">Computer science Department </w:t>
                             </w:r>
                           </w:p>
                         </w:txbxContent>
@@ -242,7 +225,7 @@
           </mc:Choice>
           <mc:Fallback>
             <w:pict>
-              <v:shape w14:anchorId="04A5FE93" id="_x0000_s1027" type="#_x0000_t202" style="position:absolute;left:0;text-align:left;margin-left:0;margin-top:.55pt;width:194.4pt;height:88.25pt;z-index:-251655168;visibility:visible;mso-wrap-style:square;mso-width-percent:0;mso-height-percent:200;mso-wrap-distance-left:9pt;mso-wrap-distance-top:3.6pt;mso-wrap-distance-right:9pt;mso-wrap-distance-bottom:3.6pt;mso-position-horizontal:left;mso-position-horizontal-relative:margin;mso-position-vertical:absolute;mso-position-vertical-relative:text;mso-width-percent:0;mso-height-percent:200;mso-width-relative:margin;mso-height-relative:margin;v-text-anchor:top" o:gfxdata="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" filled="f" stroked="f">
+              <v:shape w14:anchorId="04A5FE93" id="_x0000_s1027" type="#_x0000_t202" style="position:absolute;left:0;text-align:left;margin-left:0;margin-top:.55pt;width:194.4pt;height:88.25pt;z-index:-251655168;visibility:visible;mso-wrap-style:square;mso-width-percent:0;mso-height-percent:200;mso-wrap-distance-left:9pt;mso-wrap-distance-top:3.6pt;mso-wrap-distance-right:9pt;mso-wrap-distance-bottom:3.6pt;mso-position-horizontal:left;mso-position-horizontal-relative:margin;mso-position-vertical:absolute;mso-position-vertical-relative:text;mso-width-percent:0;mso-height-percent:200;mso-width-relative:margin;mso-height-relative:margin;v-text-anchor:top" o:gfxdata="UEsDBBQABgAIAAAAIQC2gziS/gAAAOEBAAATAAAAW0NvbnRlbnRfVHlwZXNdLnhtbJSRQU7DMBBF 90jcwfIWJU67QAgl6YK0S0CoHGBkTxKLZGx5TGhvj5O2G0SRWNoz/78nu9wcxkFMGNg6quQqL6RA 0s5Y6ir5vt9lD1JwBDIwOMJKHpHlpr69KfdHjyxSmriSfYz+USnWPY7AufNIadK6MEJMx9ApD/oD OlTrorhX2lFEilmcO2RdNtjC5xDF9pCuTyYBB5bi6bQ4syoJ3g9WQ0ymaiLzg5KdCXlKLjvcW893 SUOqXwnz5DrgnHtJTxOsQfEKIT7DmDSUCaxw7Rqn8787ZsmRM9e2VmPeBN4uqYvTtW7jvijg9N/y JsXecLq0q+WD6m8AAAD//wMAUEsDBBQABgAIAAAAIQA4/SH/1gAAAJQBAAALAAAAX3JlbHMvLnJl bHOkkMFqwzAMhu+DvYPRfXGawxijTi+j0GvpHsDYimMaW0Yy2fr2M4PBMnrbUb/Q94l/f/hMi1qR JVI2sOt6UJgd+ZiDgffL8ekFlFSbvV0oo4EbChzGx4f9GRdb25HMsYhqlCwG5lrLq9biZkxWOiqY 22YiTra2kYMu1l1tQD30/bPm3wwYN0x18gb45AdQl1tp5j/sFB2T0FQ7R0nTNEV3j6o9feQzro1i OWA14Fm+Q8a1a8+Bvu/d/dMb2JY5uiPbhG/ktn4cqGU/er3pcvwCAAD//wMAUEsDBBQABgAIAAAA IQBRUdZA/AEAANUDAAAOAAAAZHJzL2Uyb0RvYy54bWysU11v2yAUfZ+0/4B4X/yhpEmtOFXXLtOk rpvU9QcQjGM04DIgsbNfvwt202h7q+YHxOWac+8597C+GbQiR+G8BFPTYpZTIgyHRpp9TZ9/bD+s KPGBmYYpMKKmJ+Hpzeb9u3VvK1FCB6oRjiCI8VVva9qFYKss87wTmvkZWGEw2YLTLGDo9lnjWI/o WmVlnl9lPbjGOuDCezy9H5N0k/DbVvDwrW29CETVFHsLaXVp3cU126xZtXfMdpJPbbA3dKGZNFj0 DHXPAiMHJ/+B0pI78NCGGQedQdtKLhIHZFPkf7F56pgViQuK4+1ZJv//YPnj8cl+dyQMH2HAASYS 3j4A/+mJgbuOmb24dQ76TrAGCxdRsqy3vpquRql95SPIrv8KDQ6ZHQIkoKF1OqqCPAmi4wBOZ9HF EAjHw3J+tVqtMMUxVxRlvlwuUg1WvVy3zofPAjSJm5o6nGqCZ8cHH2I7rHr5JVYzsJVKpckqQ/qa Xi/KRbpwkdEyoPGU1DVd5fEbrRBZfjJNuhyYVOMeCygz0Y5MR85h2A1ENpMmUYUdNCfUwcHoM3wX uOnA/aakR4/V1P86MCcoUV8ManldzOfRlCmYL5YlBu4ys7vMMMMRqqaBknF7F5KRI2Vvb1HzrUxq vHYytYzeSSJNPo/mvIzTX6+vcfMHAAD//wMAUEsDBBQABgAIAAAAIQBNvvkH3wAAAAsBAAAPAAAA ZHJzL2Rvd25yZXYueG1sTI9BT8MwDIXvSPyHyJO4sXRDWquu6TTBNo7AqDhnjWmrNU7UZF3595gT u1h6fvLz+4rNZHsx4hA6RwoW8wQEUu1MR42C6nP/mIEIUZPRvSNU8IMBNuX9XaFz4670geMxNoJD KORaQRujz6UMdYtWh7nzSOx9u8HqyHJopBn0lcNtL5dJspJWd8QfWu3xucX6fLxYBT76Q/o6vL1v d/sxqb4O1bJrdko9zKaXNY/tGkTEKf5fwB8D94eSi53chUwQvQKmibxdgGDzKcsY5sQ6TVcgy0Le MpS/AAAA//8DAFBLAQItABQABgAIAAAAIQC2gziS/gAAAOEBAAATAAAAAAAAAAAAAAAAAAAAAABb Q29udGVudF9UeXBlc10ueG1sUEsBAi0AFAAGAAgAAAAhADj9If/WAAAAlAEAAAsAAAAAAAAAAAAA AAAALwEAAF9yZWxzLy5yZWxzUEsBAi0AFAAGAAgAAAAhAFFR1kD8AQAA1QMAAA4AAAAAAAAAAAAA AAAALgIAAGRycy9lMm9Eb2MueG1sUEsBAi0AFAAGAAgAAAAhAE2++QffAAAACwEAAA8AAAAAAAAA AAAAAAAAVgQAAGRycy9kb3ducmV2LnhtbFBLBQYAAAAABAAEAPMAAABiBQAAAAA= " filled="f" stroked="f">
                 <v:textbox style="mso-fit-shape-to-text:t">
                   <w:txbxContent>
                     <w:p>
@@ -274,10 +257,7 @@
                         <w:jc w:val="center"/>
                       </w:pPr>
                       <w:r>
-                        <w:t>College of Science and Humanities</w:t>
-                      </w:r>
-                      <w:r>
-                        <w:t>-Jubail</w:t>
+                        <w:t>College of Science and Humanities-Jubail</w:t>
                       </w:r>
                     </w:p>
                     <w:p>
@@ -285,13 +265,7 @@
                         <w:jc w:val="center"/>
                       </w:pPr>
                       <w:r>
-                        <w:t xml:space="preserve">Computer science </w:t>
-                      </w:r>
-                      <w:r>
-                        <w:t>Department</w:t>
-                      </w:r>
-                      <w:r>
-                        <w:t xml:space="preserve"> </w:t>
+                        <w:t xml:space="preserve">Computer science Department </w:t>
                       </w:r>
                     </w:p>
                   </w:txbxContent>
@@ -395,16 +369,7 @@
           <w:sz w:val="24"/>
           <w:szCs w:val="24"/>
         </w:rPr>
-        <w:t xml:space="preserve">Term 1 – </w:t>
-      </w:r>
-      <w:r>
-        <w:rPr>
-          <w:b/>
-          <w:bCs/>
-          <w:sz w:val="24"/>
-          <w:szCs w:val="24"/>
-        </w:rPr>
-        <w:t>2024/2025</w:t>
+        <w:t xml:space="preserve">Term 1 – 2024/2025</w:t>
       </w:r>
     </w:p>
     <w:p>
@@ -467,14 +432,7 @@
           <w:sz w:val="24"/>
           <w:szCs w:val="24"/>
         </w:rPr>
-        <w:t xml:space="preserve">Group </w:t>
-      </w:r>
-      <w:r>
-        <w:rPr>
-          <w:sz w:val="24"/>
-          <w:szCs w:val="24"/>
-        </w:rPr>
-        <w:t>5 – Section 3</w:t>
+        <w:t xml:space="preserve">Group 5 – Section 3</w:t>
       </w:r>
     </w:p>
     <w:p>
@@ -663,7 +621,7 @@
                 <w:sz w:val="24"/>
                 <w:szCs w:val="24"/>
               </w:rPr>
-              <w:t>Fatimah Al-Qurain</w:t>
+              <w:t/>
             </w:r>
           </w:p>
         </w:tc>
@@ -750,7 +708,7 @@
                 <w:sz w:val="24"/>
                 <w:szCs w:val="24"/>
               </w:rPr>
-              <w:t>Razan AlQahtani</w:t>
+              <w:t/>
             </w:r>
           </w:p>
         </w:tc>
@@ -837,31 +795,8 @@
                 <w:sz w:val="24"/>
                 <w:szCs w:val="24"/>
               </w:rPr>
-              <w:t xml:space="preserve">Habiba </w:t>
+              <w:t/>
             </w:r>
-            <w:proofErr w:type="spellStart"/>
-            <w:r>
-              <w:rPr>
-                <w:sz w:val="24"/>
-                <w:szCs w:val="24"/>
-              </w:rPr>
-              <w:t>Al</w:t>
-            </w:r>
-            <w:r>
-              <w:rPr>
-                <w:sz w:val="24"/>
-                <w:szCs w:val="24"/>
-              </w:rPr>
-              <w:t>S</w:t>
-            </w:r>
-            <w:r>
-              <w:rPr>
-                <w:sz w:val="24"/>
-                <w:szCs w:val="24"/>
-              </w:rPr>
-              <w:t>ubiani</w:t>
-            </w:r>
-            <w:proofErr w:type="spellEnd"/>
           </w:p>
         </w:tc>
         <w:tc>
@@ -947,7 +882,7 @@
                 <w:sz w:val="24"/>
                 <w:szCs w:val="24"/>
               </w:rPr>
-              <w:t>Nouf Al-Ghamdi</w:t>
+              <w:t/>
             </w:r>
           </w:p>
         </w:tc>
@@ -1033,7 +968,7 @@
                 <w:sz w:val="24"/>
                 <w:szCs w:val="24"/>
               </w:rPr>
-              <w:t>Lama AlFawaz</w:t>
+              <w:t/>
             </w:r>
           </w:p>
         </w:tc>
@@ -1119,7 +1054,7 @@
                 <w:sz w:val="24"/>
                 <w:szCs w:val="24"/>
               </w:rPr>
-              <w:t>Hessa AlKhaldi</w:t>
+              <w:t/>
             </w:r>
           </w:p>
         </w:tc>
@@ -1205,17 +1140,8 @@
                 <w:sz w:val="24"/>
                 <w:szCs w:val="24"/>
               </w:rPr>
-              <w:t xml:space="preserve">May </w:t>
+              <w:t/>
             </w:r>
-            <w:proofErr w:type="spellStart"/>
-            <w:r>
-              <w:rPr>
-                <w:sz w:val="24"/>
-                <w:szCs w:val="24"/>
-              </w:rPr>
-              <w:t>AlMuutairi</w:t>
-            </w:r>
-            <w:proofErr w:type="spellEnd"/>
           </w:p>
         </w:tc>
         <w:tc>
@@ -1291,8 +1217,24 @@
           <w:sz w:val="24"/>
           <w:szCs w:val="24"/>
         </w:rPr>
-        <w:t xml:space="preserve">Title of the </w:t>
-      </w:r>
+        <w:t xml:space="preserve">Title of the Project:</w:t>
+      </w:r>
+      <w:r>
+        <w:rPr>
+          <w:sz w:val="24"/>
+          <w:szCs w:val="24"/>
+        </w:rPr>
+        <w:t xml:space="preserve"> </w:t>
+      </w:r>
+    </w:p>
+    <w:p>
+      <w:pPr>
+        <w:spacing w:line="360" w:lineRule="auto"/>
+        <w:rPr>
+          <w:sz w:val="24"/>
+          <w:szCs w:val="24"/>
+        </w:rPr>
+      </w:pPr>
       <w:r>
         <w:rPr>
           <w:b/>
@@ -1300,50 +1242,7 @@
           <w:sz w:val="24"/>
           <w:szCs w:val="24"/>
         </w:rPr>
-        <w:t>Project</w:t>
-      </w:r>
-      <w:r>
-        <w:rPr>
-          <w:b/>
-          <w:bCs/>
-          <w:sz w:val="24"/>
-          <w:szCs w:val="24"/>
-        </w:rPr>
-        <w:t>:</w:t>
-      </w:r>
-      <w:r>
-        <w:rPr>
-          <w:sz w:val="24"/>
-          <w:szCs w:val="24"/>
-        </w:rPr>
-        <w:t xml:space="preserve"> </w:t>
-      </w:r>
-    </w:p>
-    <w:p>
-      <w:pPr>
-        <w:spacing w:line="360" w:lineRule="auto"/>
-        <w:rPr>
-          <w:sz w:val="24"/>
-          <w:szCs w:val="24"/>
-        </w:rPr>
-      </w:pPr>
-      <w:r>
-        <w:rPr>
-          <w:b/>
-          <w:bCs/>
-          <w:sz w:val="24"/>
-          <w:szCs w:val="24"/>
-        </w:rPr>
-        <w:t xml:space="preserve">     </w:t>
-      </w:r>
-      <w:r>
-        <w:rPr>
-          <w:b/>
-          <w:bCs/>
-          <w:sz w:val="24"/>
-          <w:szCs w:val="24"/>
-        </w:rPr>
-        <w:t>HealthyCooking</w:t>
+        <w:t xml:space="preserve">     HealthyCooking</w:t>
       </w:r>
       <w:r>
         <w:rPr>
@@ -1421,191 +1320,7 @@
           <w:sz w:val="24"/>
           <w:szCs w:val="24"/>
         </w:rPr>
-        <w:t xml:space="preserve">     Maintaining a healthy diet can be challenging when recipes and meal plans are not tailored to individual needs time</w:t>
-      </w:r>
-      <w:r>
-        <w:rPr>
-          <w:rFonts w:asciiTheme="majorBidi" w:hAnsiTheme="majorBidi" w:cstheme="majorBidi"/>
-          <w:sz w:val="24"/>
-          <w:szCs w:val="24"/>
-        </w:rPr>
-        <w:t>,</w:t>
-      </w:r>
-      <w:r>
-        <w:rPr>
-          <w:rFonts w:asciiTheme="majorBidi" w:hAnsiTheme="majorBidi" w:cstheme="majorBidi"/>
-          <w:sz w:val="24"/>
-          <w:szCs w:val="24"/>
-        </w:rPr>
-        <w:t xml:space="preserve"> or preferences</w:t>
-      </w:r>
-      <w:r>
-        <w:rPr>
-          <w:rFonts w:asciiTheme="majorBidi" w:hAnsiTheme="majorBidi" w:cstheme="majorBidi"/>
-          <w:sz w:val="24"/>
-          <w:szCs w:val="24"/>
-        </w:rPr>
-        <w:t>.</w:t>
-      </w:r>
-      <w:r>
-        <w:rPr>
-          <w:rFonts w:asciiTheme="majorBidi" w:hAnsiTheme="majorBidi" w:cstheme="majorBidi"/>
-          <w:sz w:val="24"/>
-          <w:szCs w:val="24"/>
-        </w:rPr>
-        <w:t xml:space="preserve"> Many existing platforms lack personalization</w:t>
-      </w:r>
-      <w:r>
-        <w:rPr>
-          <w:rFonts w:asciiTheme="majorBidi" w:hAnsiTheme="majorBidi" w:cstheme="majorBidi"/>
-          <w:sz w:val="24"/>
-          <w:szCs w:val="24"/>
-        </w:rPr>
-        <w:t>,</w:t>
-      </w:r>
-      <w:r>
-        <w:rPr>
-          <w:rFonts w:asciiTheme="majorBidi" w:hAnsiTheme="majorBidi" w:cstheme="majorBidi"/>
-          <w:sz w:val="24"/>
-          <w:szCs w:val="24"/>
-        </w:rPr>
-        <w:t xml:space="preserve"> allergy management</w:t>
-      </w:r>
-      <w:r>
-        <w:rPr>
-          <w:rFonts w:asciiTheme="majorBidi" w:hAnsiTheme="majorBidi" w:cstheme="majorBidi"/>
-          <w:sz w:val="24"/>
-          <w:szCs w:val="24"/>
-        </w:rPr>
-        <w:t xml:space="preserve">, </w:t>
-      </w:r>
-      <w:r>
-        <w:rPr>
-          <w:rFonts w:asciiTheme="majorBidi" w:hAnsiTheme="majorBidi" w:cstheme="majorBidi"/>
-          <w:sz w:val="24"/>
-          <w:szCs w:val="24"/>
-        </w:rPr>
-        <w:t xml:space="preserve">or integrated nutritional </w:t>
-      </w:r>
-      <w:r>
-        <w:rPr>
-          <w:rFonts w:asciiTheme="majorBidi" w:hAnsiTheme="majorBidi" w:cstheme="majorBidi"/>
-          <w:sz w:val="24"/>
-          <w:szCs w:val="24"/>
-        </w:rPr>
-        <w:t>tracking making</w:t>
-      </w:r>
-      <w:r>
-        <w:rPr>
-          <w:rFonts w:asciiTheme="majorBidi" w:hAnsiTheme="majorBidi" w:cstheme="majorBidi"/>
-          <w:sz w:val="24"/>
-          <w:szCs w:val="24"/>
-        </w:rPr>
-        <w:t xml:space="preserve"> it difficult for users to effectively plan balanced meals</w:t>
-      </w:r>
-      <w:r>
-        <w:rPr>
-          <w:rFonts w:asciiTheme="majorBidi" w:hAnsiTheme="majorBidi" w:cstheme="majorBidi"/>
-          <w:sz w:val="24"/>
-          <w:szCs w:val="24"/>
-        </w:rPr>
-        <w:t xml:space="preserve">. </w:t>
-      </w:r>
-      <w:r>
-        <w:rPr>
-          <w:rFonts w:asciiTheme="majorBidi" w:hAnsiTheme="majorBidi" w:cstheme="majorBidi"/>
-          <w:sz w:val="24"/>
-          <w:szCs w:val="24"/>
-        </w:rPr>
-        <w:t>HealthyCooking is an intelligent recipe search and meal planning app designed to address these challenge</w:t>
-      </w:r>
-      <w:r>
-        <w:rPr>
-          <w:rFonts w:asciiTheme="majorBidi" w:hAnsiTheme="majorBidi" w:cstheme="majorBidi"/>
-          <w:sz w:val="24"/>
-          <w:szCs w:val="24"/>
-        </w:rPr>
-        <w:t>s.</w:t>
-      </w:r>
-      <w:r>
-        <w:rPr>
-          <w:rFonts w:asciiTheme="majorBidi" w:hAnsiTheme="majorBidi" w:cstheme="majorBidi"/>
-          <w:sz w:val="24"/>
-          <w:szCs w:val="24"/>
-        </w:rPr>
-        <w:t xml:space="preserve"> It allows users to search recipes by cuisine meal type or preparation time exclude unwanted </w:t>
-      </w:r>
-      <w:r>
-        <w:rPr>
-          <w:rFonts w:asciiTheme="majorBidi" w:hAnsiTheme="majorBidi" w:cstheme="majorBidi"/>
-          <w:sz w:val="24"/>
-          <w:szCs w:val="24"/>
-        </w:rPr>
-        <w:t>ingredients and</w:t>
-      </w:r>
-      <w:r>
-        <w:rPr>
-          <w:rFonts w:asciiTheme="majorBidi" w:hAnsiTheme="majorBidi" w:cstheme="majorBidi"/>
-          <w:sz w:val="24"/>
-          <w:szCs w:val="24"/>
-        </w:rPr>
-        <w:t xml:space="preserve"> receive AI-powered suggestions based on what they already have at home</w:t>
-      </w:r>
-      <w:r>
-        <w:rPr>
-          <w:rFonts w:asciiTheme="majorBidi" w:hAnsiTheme="majorBidi" w:cstheme="majorBidi"/>
-          <w:sz w:val="24"/>
-          <w:szCs w:val="24"/>
-        </w:rPr>
-        <w:t xml:space="preserve">. </w:t>
-      </w:r>
-      <w:r>
-        <w:rPr>
-          <w:rFonts w:asciiTheme="majorBidi" w:hAnsiTheme="majorBidi" w:cstheme="majorBidi"/>
-          <w:sz w:val="24"/>
-          <w:szCs w:val="24"/>
-        </w:rPr>
-        <w:t>Furthermore,</w:t>
-      </w:r>
-      <w:r>
-        <w:rPr>
-          <w:rFonts w:asciiTheme="majorBidi" w:hAnsiTheme="majorBidi" w:cstheme="majorBidi"/>
-          <w:sz w:val="24"/>
-          <w:szCs w:val="24"/>
-        </w:rPr>
-        <w:t xml:space="preserve"> the app offers meal planning and nutrition tools allowing users to track calories and nutrients while creating structured meal plans </w:t>
-      </w:r>
-      <w:r>
-        <w:rPr>
-          <w:rFonts w:asciiTheme="majorBidi" w:hAnsiTheme="majorBidi" w:cstheme="majorBidi"/>
-          <w:sz w:val="24"/>
-          <w:szCs w:val="24"/>
-        </w:rPr>
-        <w:t>b</w:t>
-      </w:r>
-      <w:r>
-        <w:rPr>
-          <w:rFonts w:asciiTheme="majorBidi" w:hAnsiTheme="majorBidi" w:cstheme="majorBidi"/>
-          <w:sz w:val="24"/>
-          <w:szCs w:val="24"/>
-        </w:rPr>
-        <w:t>y combining personalization with health-promoting features</w:t>
-      </w:r>
-      <w:r>
-        <w:rPr>
-          <w:rFonts w:asciiTheme="majorBidi" w:hAnsiTheme="majorBidi" w:cstheme="majorBidi"/>
-          <w:sz w:val="24"/>
-          <w:szCs w:val="24"/>
-        </w:rPr>
-        <w:t>.</w:t>
-      </w:r>
-      <w:r>
-        <w:rPr>
-          <w:rFonts w:asciiTheme="majorBidi" w:hAnsiTheme="majorBidi" w:cstheme="majorBidi"/>
-          <w:sz w:val="24"/>
-          <w:szCs w:val="24"/>
-        </w:rPr>
-        <w:t xml:space="preserve"> HealthyCooking helps users cook smarter eat healthier and achieve their diet goals more effectively.</w:t>
+        <w:t xml:space="preserve">     Maintaining a healthy diet can be challenging when recipes and meal plans are not tailored to individual needs time, or preferences. Many existing platforms lack personalization, allergy management, or integrated nutritional tracking making it difficult for users to effectively plan balanced meals. HealthyCooking is an intelligent recipe search and meal planning app designed to address these challenges. It allows users to search recipes by cuisine meal type or preparation time exclude unwanted ingredients and receive AI-powered suggestions based on what they already have at home. Furthermore, the app offers meal planning and nutrition tools allowing users to track calories and nutrients while creating structured meal plans by combining personalization with health-promoting features. HealthyCooking helps users cook smarter eat healthier and achieve their diet goals more effectively.</w:t>
       </w:r>
     </w:p>
     <w:p>
@@ -1734,31 +1449,13 @@
           <w:szCs w:val="24"/>
         </w:rPr>
       </w:pPr>
-      <w:proofErr w:type="gramStart"/>
       <w:r>
         <w:rPr>
           <w:rFonts w:asciiTheme="majorBidi" w:hAnsiTheme="majorBidi" w:cstheme="majorBidi"/>
           <w:sz w:val="24"/>
           <w:szCs w:val="24"/>
         </w:rPr>
-        <w:t>Take into account</w:t>
-      </w:r>
-      <w:proofErr w:type="gramEnd"/>
-      <w:r>
-        <w:rPr>
-          <w:rFonts w:asciiTheme="majorBidi" w:hAnsiTheme="majorBidi" w:cstheme="majorBidi"/>
-          <w:sz w:val="24"/>
-          <w:szCs w:val="24"/>
-        </w:rPr>
-        <w:t xml:space="preserve"> essential factors</w:t>
-      </w:r>
-      <w:r>
-        <w:rPr>
-          <w:rFonts w:asciiTheme="majorBidi" w:hAnsiTheme="majorBidi" w:cstheme="majorBidi"/>
-          <w:sz w:val="24"/>
-          <w:szCs w:val="24"/>
-        </w:rPr>
-        <w:t xml:space="preserve"> such as calories, available ingredients, and food allergies.</w:t>
+        <w:t xml:space="preserve">Take into account essential factors such as calories, available ingredients, and food allergies.</w:t>
       </w:r>
     </w:p>
     <w:p>
@@ -1790,15 +1487,7 @@
           <w:sz w:val="24"/>
           <w:szCs w:val="24"/>
         </w:rPr>
-        <w:t xml:space="preserve"> Provide a simple and user-friendly interface for easy interaction</w:t>
-      </w:r>
-      <w:r>
-        <w:rPr>
-          <w:rFonts w:asciiTheme="majorBidi" w:hAnsiTheme="majorBidi" w:cstheme="majorBidi"/>
-          <w:sz w:val="24"/>
-          <w:szCs w:val="24"/>
-        </w:rPr>
-        <w:t xml:space="preserve">. </w:t>
+        <w:t xml:space="preserve"> Provide a simple and user-friendly interface for easy interaction. </w:t>
       </w:r>
     </w:p>
     <w:p>
@@ -2072,21 +1761,7 @@
           <w:sz w:val="24"/>
           <w:szCs w:val="24"/>
         </w:rPr>
-        <w:t>The individuals who are interested in maintaining a healthy lifestyle through balanced nutrient</w:t>
-      </w:r>
-      <w:r>
-        <w:rPr>
-          <w:sz w:val="24"/>
-          <w:szCs w:val="24"/>
-        </w:rPr>
-        <w:t xml:space="preserve"> </w:t>
-      </w:r>
-      <w:r>
-        <w:rPr>
-          <w:sz w:val="24"/>
-          <w:szCs w:val="24"/>
-        </w:rPr>
-        <w:t>intake. Plus, the general users who want quick meal suggestions based on their preferences.</w:t>
+        <w:t xml:space="preserve">The individuals who are interested in maintaining a healthy lifestyle through balanced nutrient intake. Plus, the general users who want quick meal suggestions based on their preferences.</w:t>
       </w:r>
     </w:p>
     <w:p>
@@ -2157,303 +1832,7 @@
           <w:sz w:val="24"/>
           <w:szCs w:val="24"/>
         </w:rPr>
-        <w:t xml:space="preserve">   </w:t>
-      </w:r>
-      <w:r>
-        <w:rPr>
-          <w:sz w:val="24"/>
-          <w:szCs w:val="24"/>
-        </w:rPr>
-        <w:t>HealthyCooking is an intelligent</w:t>
-      </w:r>
-      <w:r>
-        <w:rPr>
-          <w:sz w:val="24"/>
-          <w:szCs w:val="24"/>
-        </w:rPr>
-        <w:t xml:space="preserve"> App for </w:t>
-      </w:r>
-      <w:r>
-        <w:rPr>
-          <w:sz w:val="24"/>
-          <w:szCs w:val="24"/>
-        </w:rPr>
-        <w:t>finding</w:t>
-      </w:r>
-      <w:r>
-        <w:rPr>
-          <w:sz w:val="24"/>
-          <w:szCs w:val="24"/>
-        </w:rPr>
-        <w:t xml:space="preserve"> </w:t>
-      </w:r>
-      <w:r>
-        <w:rPr>
-          <w:sz w:val="24"/>
-          <w:szCs w:val="24"/>
-        </w:rPr>
-        <w:t>recipe</w:t>
-      </w:r>
-      <w:r>
-        <w:rPr>
-          <w:sz w:val="24"/>
-          <w:szCs w:val="24"/>
-        </w:rPr>
-        <w:t>s</w:t>
-      </w:r>
-      <w:r>
-        <w:rPr>
-          <w:sz w:val="24"/>
-          <w:szCs w:val="24"/>
-        </w:rPr>
-        <w:t xml:space="preserve"> and meal planning service</w:t>
-      </w:r>
-      <w:r>
-        <w:rPr>
-          <w:sz w:val="24"/>
-          <w:szCs w:val="24"/>
-        </w:rPr>
-        <w:t>s,</w:t>
-      </w:r>
-      <w:r>
-        <w:rPr>
-          <w:sz w:val="24"/>
-          <w:szCs w:val="24"/>
-        </w:rPr>
-        <w:t xml:space="preserve"> designed to </w:t>
-      </w:r>
-      <w:r>
-        <w:rPr>
-          <w:sz w:val="24"/>
-          <w:szCs w:val="24"/>
-        </w:rPr>
-        <w:t xml:space="preserve">help </w:t>
-      </w:r>
-      <w:r>
-        <w:rPr>
-          <w:sz w:val="24"/>
-          <w:szCs w:val="24"/>
-        </w:rPr>
-        <w:t>maintain</w:t>
-      </w:r>
-      <w:r>
-        <w:rPr>
-          <w:sz w:val="24"/>
-          <w:szCs w:val="24"/>
-        </w:rPr>
-        <w:t xml:space="preserve"> a healthy diet</w:t>
-      </w:r>
-      <w:r>
-        <w:rPr>
-          <w:sz w:val="24"/>
-          <w:szCs w:val="24"/>
-        </w:rPr>
-        <w:t>. You can</w:t>
-      </w:r>
-      <w:r>
-        <w:rPr>
-          <w:sz w:val="24"/>
-          <w:szCs w:val="24"/>
-        </w:rPr>
-        <w:t xml:space="preserve"> customize it, and maximize its efficiency</w:t>
-      </w:r>
-      <w:r>
-        <w:rPr>
-          <w:sz w:val="24"/>
-          <w:szCs w:val="24"/>
-        </w:rPr>
-        <w:t xml:space="preserve"> based on your personal preferences and dietary needs. It provides a </w:t>
-      </w:r>
-      <w:r>
-        <w:rPr>
-          <w:sz w:val="24"/>
-          <w:szCs w:val="24"/>
-        </w:rPr>
-        <w:t xml:space="preserve">built-in nutrition </w:t>
-      </w:r>
-      <w:proofErr w:type="gramStart"/>
-      <w:r>
-        <w:rPr>
-          <w:sz w:val="24"/>
-          <w:szCs w:val="24"/>
-        </w:rPr>
-        <w:t xml:space="preserve">monitoring </w:t>
-      </w:r>
-      <w:r>
-        <w:rPr>
-          <w:sz w:val="24"/>
-          <w:szCs w:val="24"/>
-        </w:rPr>
-        <w:t>,</w:t>
-      </w:r>
-      <w:proofErr w:type="gramEnd"/>
-      <w:r>
-        <w:rPr>
-          <w:sz w:val="24"/>
-          <w:szCs w:val="24"/>
-        </w:rPr>
-        <w:t xml:space="preserve"> such as tracking your daily intake</w:t>
-      </w:r>
-      <w:r>
-        <w:rPr>
-          <w:sz w:val="24"/>
-          <w:szCs w:val="24"/>
-        </w:rPr>
-        <w:t xml:space="preserve"> of protein, </w:t>
-      </w:r>
-      <w:r>
-        <w:rPr>
-          <w:sz w:val="24"/>
-          <w:szCs w:val="24"/>
-        </w:rPr>
-        <w:t>fiber, etc.</w:t>
-      </w:r>
-      <w:r>
-        <w:rPr>
-          <w:sz w:val="24"/>
-          <w:szCs w:val="24"/>
-        </w:rPr>
-        <w:t xml:space="preserve"> </w:t>
-      </w:r>
-      <w:r>
-        <w:rPr>
-          <w:sz w:val="24"/>
-          <w:szCs w:val="24"/>
-        </w:rPr>
-        <w:t xml:space="preserve">Additionally, </w:t>
-      </w:r>
-      <w:r>
-        <w:rPr>
-          <w:sz w:val="24"/>
-          <w:szCs w:val="24"/>
-        </w:rPr>
-        <w:t xml:space="preserve">it </w:t>
-      </w:r>
-      <w:r>
-        <w:rPr>
-          <w:sz w:val="24"/>
-          <w:szCs w:val="24"/>
-        </w:rPr>
-        <w:t>offe</w:t>
-      </w:r>
-      <w:r>
-        <w:rPr>
-          <w:sz w:val="24"/>
-          <w:szCs w:val="24"/>
-        </w:rPr>
-        <w:t xml:space="preserve">rs a </w:t>
-      </w:r>
-      <w:r>
-        <w:rPr>
-          <w:sz w:val="24"/>
-          <w:szCs w:val="24"/>
-        </w:rPr>
-        <w:t>search by cuisine, meal type, cooking time, and unwanted ingredients</w:t>
-      </w:r>
-      <w:r>
-        <w:rPr>
-          <w:sz w:val="24"/>
-          <w:szCs w:val="24"/>
-        </w:rPr>
-        <w:t xml:space="preserve"> </w:t>
-      </w:r>
-      <w:r>
-        <w:rPr>
-          <w:sz w:val="24"/>
-          <w:szCs w:val="24"/>
-        </w:rPr>
-        <w:t xml:space="preserve">and ingredient-in-hand based AI-powered suggestions. The app </w:t>
-      </w:r>
-      <w:r>
-        <w:rPr>
-          <w:sz w:val="24"/>
-          <w:szCs w:val="24"/>
-        </w:rPr>
-        <w:t>recommends</w:t>
-      </w:r>
-      <w:r>
-        <w:rPr>
-          <w:sz w:val="24"/>
-          <w:szCs w:val="24"/>
-        </w:rPr>
-        <w:t xml:space="preserve"> healthy recipe ideas based on user choice, calorie consumption, and dietary requirement </w:t>
-      </w:r>
-      <w:r>
-        <w:rPr>
-          <w:sz w:val="24"/>
-          <w:szCs w:val="24"/>
-        </w:rPr>
-        <w:t xml:space="preserve">that </w:t>
-      </w:r>
-      <w:r>
-        <w:rPr>
-          <w:sz w:val="24"/>
-          <w:szCs w:val="24"/>
-        </w:rPr>
-        <w:t>are</w:t>
-      </w:r>
-      <w:r>
-        <w:rPr>
-          <w:sz w:val="24"/>
-          <w:szCs w:val="24"/>
-        </w:rPr>
-        <w:t xml:space="preserve"> connected</w:t>
-      </w:r>
-      <w:r>
-        <w:rPr>
-          <w:sz w:val="24"/>
-          <w:szCs w:val="24"/>
-        </w:rPr>
-        <w:t xml:space="preserve"> to a database for accurate nutrient information</w:t>
-      </w:r>
-      <w:r>
-        <w:rPr>
-          <w:sz w:val="24"/>
-          <w:szCs w:val="24"/>
-        </w:rPr>
-        <w:t xml:space="preserve">. </w:t>
-      </w:r>
-      <w:r>
-        <w:rPr>
-          <w:sz w:val="24"/>
-          <w:szCs w:val="24"/>
-        </w:rPr>
-        <w:t xml:space="preserve">HealthyCooking helps users plan nutritious meals, monitor nutrition, and stick to diet plans. It also supports meal planning, reminders, and AI features for recipe preparation or adjustment. </w:t>
-      </w:r>
-      <w:r>
-        <w:rPr>
-          <w:sz w:val="24"/>
-          <w:szCs w:val="24"/>
-        </w:rPr>
-        <w:t>With a simpl</w:t>
-      </w:r>
-      <w:r>
-        <w:rPr>
-          <w:sz w:val="24"/>
-          <w:szCs w:val="24"/>
-        </w:rPr>
-        <w:t>e</w:t>
-      </w:r>
-      <w:r>
-        <w:rPr>
-          <w:sz w:val="24"/>
-          <w:szCs w:val="24"/>
-        </w:rPr>
-        <w:t xml:space="preserve"> user-friendly interface, it is perfect for those who are committed to maintaining a healthier lifestyle</w:t>
-      </w:r>
-      <w:r>
-        <w:rPr>
-          <w:sz w:val="24"/>
-          <w:szCs w:val="24"/>
-        </w:rPr>
-        <w:t xml:space="preserve">, </w:t>
-      </w:r>
-      <w:r>
-        <w:rPr>
-          <w:sz w:val="24"/>
-          <w:szCs w:val="24"/>
-        </w:rPr>
-        <w:t>allowing individuals to cook smarter, eat better, and achieve their dietary goals with ease.</w:t>
+        <w:t xml:space="preserve">   HealthyCooking is an intelligent App for finding recipes and meal planning services, designed to help maintain a healthy diet. You can customize it, and maximize its efficiency based on your personal preferences and dietary needs. It provides a built-in nutrition monitoring , such as tracking your daily intake of protein, fiber, etc. Additionally, it offers a search by cuisine, meal type, cooking time, and unwanted ingredients and ingredient-in-hand based AI-powered suggestions. The app recommends healthy recipe ideas based on user choice, calorie consumption, and dietary requirement that are connected to a database for accurate nutrient information. HealthyCooking helps users plan nutritious meals, monitor nutrition, and stick to diet plans. It also supports meal planning, reminders, and AI features for recipe preparation or adjustment. With a simple user-friendly interface, it is perfect for those who are committed to maintaining a healthier lifestyle, allowing individuals to cook smarter, eat better, and achieve their dietary goals with ease.</w:t>
       </w:r>
     </w:p>
     <w:p>
@@ -2521,14 +1900,7 @@
           <w:sz w:val="24"/>
           <w:szCs w:val="24"/>
         </w:rPr>
-        <w:t xml:space="preserve">The project will be considered successful </w:t>
-      </w:r>
-      <w:r>
-        <w:rPr>
-          <w:sz w:val="24"/>
-          <w:szCs w:val="24"/>
-        </w:rPr>
-        <w:t>based on the following:</w:t>
+        <w:t xml:space="preserve">The project will be considered successful based on the following:</w:t>
       </w:r>
     </w:p>
     <w:p>
@@ -2760,18 +2132,7 @@
           <w:szCs w:val="24"/>
           <w:lang w:val="en-SA"/>
         </w:rPr>
-        <w:t xml:space="preserve">Requirements </w:t>
-      </w:r>
-      <w:r>
-        <w:rPr>
-          <w:rFonts w:eastAsiaTheme="minorEastAsia"/>
-          <w:b/>
-          <w:bCs/>
-          <w:sz w:val="24"/>
-          <w:szCs w:val="24"/>
-          <w:lang w:val="en-SA"/>
-        </w:rPr>
-        <w:t>Gathering and Analysis:</w:t>
+        <w:t xml:space="preserve">Requirements Gathering and Analysis:</w:t>
       </w:r>
     </w:p>
     <w:p>
@@ -2827,17 +2188,7 @@
           <w:sz w:val="24"/>
           <w:szCs w:val="24"/>
         </w:rPr>
-        <w:t>UI</w:t>
-      </w:r>
-      <w:r>
-        <w:rPr>
-          <w:rFonts w:ascii="Times New Roman" w:hAnsi="Times New Roman"/>
-          <w:b/>
-          <w:bCs/>
-          <w:sz w:val="24"/>
-          <w:szCs w:val="24"/>
-        </w:rPr>
-        <w:t>/UX Design:</w:t>
+        <w:t>UI/UX Design:</w:t>
       </w:r>
     </w:p>
     <w:p>
@@ -2891,17 +2242,7 @@
           <w:sz w:val="24"/>
           <w:szCs w:val="24"/>
         </w:rPr>
-        <w:t>Database Deve</w:t>
-      </w:r>
-      <w:r>
-        <w:rPr>
-          <w:rFonts w:ascii="Times New Roman" w:hAnsi="Times New Roman"/>
-          <w:b/>
-          <w:bCs/>
-          <w:sz w:val="24"/>
-          <w:szCs w:val="24"/>
-        </w:rPr>
-        <w:t>lopment:</w:t>
+        <w:t>Database Development:</w:t>
       </w:r>
     </w:p>
     <w:p>
@@ -2920,47 +2261,7 @@
           <w:sz w:val="24"/>
           <w:szCs w:val="24"/>
         </w:rPr>
-        <w:t>Build a well-</w:t>
-      </w:r>
-      <w:r>
-        <w:rPr>
-          <w:rFonts w:ascii="Times New Roman" w:hAnsi="Times New Roman"/>
-          <w:sz w:val="24"/>
-          <w:szCs w:val="24"/>
-        </w:rPr>
-        <w:t xml:space="preserve">structured recipe and </w:t>
-      </w:r>
-      <w:r>
-        <w:rPr>
-          <w:rFonts w:ascii="Times New Roman" w:hAnsi="Times New Roman"/>
-          <w:sz w:val="24"/>
-          <w:szCs w:val="24"/>
-        </w:rPr>
-        <w:t xml:space="preserve">nutrition database to store accurate information about </w:t>
-      </w:r>
-      <w:r>
-        <w:rPr>
-          <w:rFonts w:ascii="Times New Roman" w:hAnsi="Times New Roman"/>
-          <w:sz w:val="24"/>
-          <w:szCs w:val="24"/>
-        </w:rPr>
-        <w:t xml:space="preserve">recipes, ingredients, and nutritional </w:t>
-      </w:r>
-      <w:r>
-        <w:rPr>
-          <w:rFonts w:ascii="Times New Roman" w:hAnsi="Times New Roman"/>
-          <w:sz w:val="24"/>
-          <w:szCs w:val="24"/>
-        </w:rPr>
-        <w:t>values for better decision</w:t>
-      </w:r>
-      <w:r>
-        <w:rPr>
-          <w:rFonts w:ascii="Times New Roman" w:hAnsi="Times New Roman"/>
-          <w:sz w:val="24"/>
-          <w:szCs w:val="24"/>
-        </w:rPr>
-        <w:t>-making.</w:t>
+        <w:t xml:space="preserve">Build a well-structured recipe and nutrition database to store accurate information about recipes, ingredients, and nutritional values for better decision-making.</w:t>
       </w:r>
     </w:p>
     <w:p>
@@ -2999,17 +2300,7 @@
           <w:sz w:val="24"/>
           <w:szCs w:val="24"/>
         </w:rPr>
-        <w:t>AI Model I</w:t>
-      </w:r>
-      <w:r>
-        <w:rPr>
-          <w:rFonts w:ascii="Times New Roman" w:hAnsi="Times New Roman"/>
-          <w:b/>
-          <w:bCs/>
-          <w:sz w:val="24"/>
-          <w:szCs w:val="24"/>
-        </w:rPr>
-        <w:t>ntegration:</w:t>
+        <w:t>AI Model Integration:</w:t>
       </w:r>
     </w:p>
     <w:p>
@@ -3028,7 +2319,16 @@
           <w:sz w:val="24"/>
           <w:szCs w:val="24"/>
         </w:rPr>
-        <w:t xml:space="preserve">Implement and integrate an AI-based </w:t>
+        <w:t xml:space="preserve">Implement and integrate an AI-based recommendation system to provide recipe suggestions tailored to user preferences,</w:t>
+      </w:r>
+      <w:r>
+        <w:rPr>
+          <w:rFonts w:ascii="Times New Roman" w:hAnsi="Times New Roman" w:hint="cs"/>
+          <w:sz w:val="24"/>
+          <w:szCs w:val="24"/>
+          <w:rtl/>
+        </w:rPr>
+        <w:t xml:space="preserve"> </w:t>
       </w:r>
       <w:r>
         <w:rPr>
@@ -3036,40 +2336,7 @@
           <w:sz w:val="24"/>
           <w:szCs w:val="24"/>
         </w:rPr>
-        <w:t>recommendation system to provide reci</w:t>
-      </w:r>
-      <w:r>
-        <w:rPr>
-          <w:rFonts w:ascii="Times New Roman" w:hAnsi="Times New Roman"/>
-          <w:sz w:val="24"/>
-          <w:szCs w:val="24"/>
-        </w:rPr>
-        <w:t>pe suggestions tailored to user preferences,</w:t>
-      </w:r>
-      <w:r>
-        <w:rPr>
-          <w:rFonts w:ascii="Times New Roman" w:hAnsi="Times New Roman" w:hint="cs"/>
-          <w:sz w:val="24"/>
-          <w:szCs w:val="24"/>
-          <w:rtl/>
-        </w:rPr>
-        <w:t xml:space="preserve"> </w:t>
-      </w:r>
-      <w:r>
-        <w:rPr>
-          <w:rFonts w:ascii="Times New Roman" w:hAnsi="Times New Roman"/>
-          <w:sz w:val="24"/>
-          <w:szCs w:val="24"/>
-        </w:rPr>
-        <w:t xml:space="preserve">dietary needs, and </w:t>
-      </w:r>
-      <w:r>
-        <w:rPr>
-          <w:rFonts w:ascii="Times New Roman" w:hAnsi="Times New Roman"/>
-          <w:sz w:val="24"/>
-          <w:szCs w:val="24"/>
-        </w:rPr>
-        <w:t>available ingredients.</w:t>
+        <w:t xml:space="preserve">dietary needs, and available ingredients.</w:t>
       </w:r>
     </w:p>
     <w:p>
@@ -3106,17 +2373,7 @@
           <w:sz w:val="24"/>
           <w:szCs w:val="24"/>
         </w:rPr>
-        <w:t>Prototyp</w:t>
-      </w:r>
-      <w:r>
-        <w:rPr>
-          <w:rFonts w:ascii="Times New Roman" w:hAnsi="Times New Roman"/>
-          <w:b/>
-          <w:bCs/>
-          <w:sz w:val="24"/>
-          <w:szCs w:val="24"/>
-        </w:rPr>
-        <w:t>e Development:</w:t>
+        <w:t>Prototype Development:</w:t>
       </w:r>
     </w:p>
     <w:p>
@@ -3135,55 +2392,7 @@
           <w:sz w:val="24"/>
           <w:szCs w:val="24"/>
         </w:rPr>
-        <w:t xml:space="preserve">Develop the initial </w:t>
-      </w:r>
-      <w:r>
-        <w:rPr>
-          <w:rFonts w:ascii="Times New Roman" w:hAnsi="Times New Roman"/>
-          <w:sz w:val="24"/>
-          <w:szCs w:val="24"/>
-        </w:rPr>
-        <w:t xml:space="preserve">version of the mobile application with core </w:t>
-      </w:r>
-      <w:r>
-        <w:rPr>
-          <w:rFonts w:ascii="Times New Roman" w:hAnsi="Times New Roman"/>
-          <w:sz w:val="24"/>
-          <w:szCs w:val="24"/>
-        </w:rPr>
-        <w:t xml:space="preserve">functionalities, ensuring </w:t>
-      </w:r>
-      <w:r>
-        <w:rPr>
-          <w:rFonts w:ascii="Times New Roman" w:hAnsi="Times New Roman"/>
-          <w:sz w:val="24"/>
-          <w:szCs w:val="24"/>
-        </w:rPr>
-        <w:t xml:space="preserve">proper </w:t>
-      </w:r>
-      <w:r>
-        <w:rPr>
-          <w:rFonts w:ascii="Times New Roman" w:hAnsi="Times New Roman"/>
-          <w:sz w:val="24"/>
-          <w:szCs w:val="24"/>
-        </w:rPr>
-        <w:t xml:space="preserve">connectivity between </w:t>
-      </w:r>
-      <w:r>
-        <w:rPr>
-          <w:rFonts w:ascii="Times New Roman" w:hAnsi="Times New Roman"/>
-          <w:sz w:val="24"/>
-          <w:szCs w:val="24"/>
-        </w:rPr>
-        <w:t xml:space="preserve">the </w:t>
-      </w:r>
-      <w:r>
-        <w:rPr>
-          <w:rFonts w:ascii="Times New Roman" w:hAnsi="Times New Roman"/>
-          <w:sz w:val="24"/>
-          <w:szCs w:val="24"/>
-        </w:rPr>
-        <w:t>interface, database</w:t>
+        <w:t xml:space="preserve">Develop the initial version of the mobile application with core functionalities, ensuring proper connectivity between the interface, database</w:t>
       </w:r>
       <w:r>
         <w:rPr>
@@ -3237,17 +2446,7 @@
           <w:sz w:val="24"/>
           <w:szCs w:val="24"/>
         </w:rPr>
-        <w:t>Testing and Eva</w:t>
-      </w:r>
-      <w:r>
-        <w:rPr>
-          <w:rFonts w:ascii="Times New Roman" w:hAnsi="Times New Roman"/>
-          <w:b/>
-          <w:bCs/>
-          <w:sz w:val="24"/>
-          <w:szCs w:val="24"/>
-        </w:rPr>
-        <w:t xml:space="preserve">luation: </w:t>
+        <w:t xml:space="preserve">Testing and Evaluation: </w:t>
       </w:r>
     </w:p>
     <w:p>
@@ -3266,47 +2465,7 @@
           <w:sz w:val="24"/>
           <w:szCs w:val="24"/>
         </w:rPr>
-        <w:t>C</w:t>
-      </w:r>
-      <w:r>
-        <w:rPr>
-          <w:rFonts w:ascii="Times New Roman" w:hAnsi="Times New Roman"/>
-          <w:sz w:val="24"/>
-          <w:szCs w:val="24"/>
-        </w:rPr>
-        <w:t xml:space="preserve">onduct </w:t>
-      </w:r>
-      <w:r>
-        <w:rPr>
-          <w:rFonts w:ascii="Times New Roman" w:hAnsi="Times New Roman"/>
-          <w:sz w:val="24"/>
-          <w:szCs w:val="24"/>
-        </w:rPr>
-        <w:t xml:space="preserve">functional and </w:t>
-      </w:r>
-      <w:r>
-        <w:rPr>
-          <w:rFonts w:ascii="Times New Roman" w:hAnsi="Times New Roman"/>
-          <w:sz w:val="24"/>
-          <w:szCs w:val="24"/>
-        </w:rPr>
-        <w:t xml:space="preserve">usability testing with a sample group of users to </w:t>
-      </w:r>
-      <w:r>
-        <w:rPr>
-          <w:rFonts w:ascii="Times New Roman" w:hAnsi="Times New Roman"/>
-          <w:sz w:val="24"/>
-          <w:szCs w:val="24"/>
-        </w:rPr>
-        <w:t xml:space="preserve">evaluate accuracy, performance, and user satisfaction, </w:t>
-      </w:r>
-      <w:r>
-        <w:rPr>
-          <w:rFonts w:ascii="Times New Roman" w:hAnsi="Times New Roman"/>
-          <w:sz w:val="24"/>
-          <w:szCs w:val="24"/>
-        </w:rPr>
-        <w:t>making necessary adjustments based on feedback.</w:t>
+        <w:t xml:space="preserve">Conduct functional and usability testing with a sample group of users to evaluate accuracy, performance, and user satisfaction, making necessary adjustments based on feedback.</w:t>
       </w:r>
     </w:p>
     <w:p>
@@ -3343,17 +2502,7 @@
           <w:sz w:val="24"/>
           <w:szCs w:val="24"/>
         </w:rPr>
-        <w:t>Final De</w:t>
-      </w:r>
-      <w:r>
-        <w:rPr>
-          <w:rFonts w:ascii="Times New Roman" w:hAnsi="Times New Roman"/>
-          <w:b/>
-          <w:bCs/>
-          <w:sz w:val="24"/>
-          <w:szCs w:val="24"/>
-        </w:rPr>
-        <w:t>ployment and Refinement:</w:t>
+        <w:t>Final Deployment and Refinement:</w:t>
       </w:r>
     </w:p>
     <w:p>
@@ -3372,48 +2521,24 @@
           <w:sz w:val="24"/>
           <w:szCs w:val="24"/>
         </w:rPr>
-        <w:t xml:space="preserve">Deploy the final version of </w:t>
+        <w:t xml:space="preserve">Deploy the final version of the application after resolving errors, </w:t>
       </w:r>
       <w:r>
         <w:rPr>
           <w:rFonts w:ascii="Times New Roman" w:hAnsi="Times New Roman"/>
           <w:sz w:val="24"/>
           <w:szCs w:val="24"/>
-        </w:rPr>
-        <w:t xml:space="preserve">the application after resolving errors, </w:t>
+          <w:lang w:val="en-US"/>
+        </w:rPr>
+        <w:t>optimizing</w:t>
       </w:r>
       <w:r>
         <w:rPr>
           <w:rFonts w:ascii="Times New Roman" w:hAnsi="Times New Roman"/>
           <w:sz w:val="24"/>
           <w:szCs w:val="24"/>
-          <w:lang w:val="en-US"/>
-        </w:rPr>
-        <w:t>optimizing</w:t>
-      </w:r>
-      <w:r>
-        <w:rPr>
-          <w:rFonts w:ascii="Times New Roman" w:hAnsi="Times New Roman"/>
-          <w:sz w:val="24"/>
-          <w:szCs w:val="24"/>
-        </w:rPr>
-        <w:t>performance</w:t>
-      </w:r>
-      <w:r>
-        <w:rPr>
-          <w:rFonts w:ascii="Times New Roman" w:hAnsi="Times New Roman"/>
-          <w:sz w:val="24"/>
-          <w:szCs w:val="24"/>
-        </w:rPr>
-        <w:t xml:space="preserve">, and enhancing </w:t>
-      </w:r>
-      <w:r>
-        <w:rPr>
-          <w:rFonts w:ascii="Times New Roman" w:hAnsi="Times New Roman"/>
-          <w:sz w:val="24"/>
-          <w:szCs w:val="24"/>
-        </w:rPr>
-        <w:t>features to ensure a high-quality product.</w:t>
+        </w:rPr>
+        <w:t xml:space="preserve">performance, and enhancing features to ensure a high-quality product.</w:t>
       </w:r>
     </w:p>
     <w:p>
@@ -3486,74 +2611,6 @@
           <w:szCs w:val="24"/>
         </w:rPr>
       </w:pPr>
-      <w:r>
-        <w:rPr>
-          <w:b/>
-          <w:bCs/>
-          <w:noProof/>
-          <w:sz w:val="24"/>
-          <w:szCs w:val="24"/>
-        </w:rPr>
-        <mc:AlternateContent>
-          <mc:Choice Requires="wpi">
-            <w:drawing>
-              <wp:anchor distT="0" distB="0" distL="114300" distR="114300" simplePos="0" relativeHeight="251665408" behindDoc="0" locked="0" layoutInCell="1" allowOverlap="1" wp14:anchorId="6FCED5D0" wp14:editId="7D6CD870">
-                <wp:simplePos x="0" y="0"/>
-                <wp:positionH relativeFrom="column">
-                  <wp:posOffset>8825949</wp:posOffset>
-                </wp:positionH>
-                <wp:positionV relativeFrom="paragraph">
-                  <wp:posOffset>1088383</wp:posOffset>
-                </wp:positionV>
-                <wp:extent cx="360" cy="360"/>
-                <wp:effectExtent l="38100" t="38100" r="38100" b="38100"/>
-                <wp:wrapNone/>
-                <wp:docPr id="405096024" name="Ink 1"/>
-                <wp:cNvGraphicFramePr/>
-                <a:graphic xmlns:a="http://schemas.openxmlformats.org/drawingml/2006/main">
-                  <a:graphicData uri="http://schemas.microsoft.com/office/word/2010/wordprocessingInk">
-                    <w14:contentPart bwMode="auto" r:id="rId10">
-                      <w14:nvContentPartPr>
-                        <w14:cNvContentPartPr/>
-                      </w14:nvContentPartPr>
-                      <w14:xfrm>
-                        <a:off x="0" y="0"/>
-                        <a:ext cx="360" cy="360"/>
-                      </w14:xfrm>
-                    </w14:contentPart>
-                  </a:graphicData>
-                </a:graphic>
-              </wp:anchor>
-            </w:drawing>
-          </mc:Choice>
-          <mc:Fallback>
-            <w:pict>
-              <v:shapetype w14:anchorId="2532E8D2" id="_x0000_t75" coordsize="21600,21600" o:spt="75" o:preferrelative="t" path="m@4@5l@4@11@9@11@9@5xe" filled="f" stroked="f">
-                <v:stroke joinstyle="miter"/>
-                <v:formulas>
-                  <v:f eqn="if lineDrawn pixelLineWidth 0"/>
-                  <v:f eqn="sum @0 1 0"/>
-                  <v:f eqn="sum 0 0 @1"/>
-                  <v:f eqn="prod @2 1 2"/>
-                  <v:f eqn="prod @3 21600 pixelWidth"/>
-                  <v:f eqn="prod @3 21600 pixelHeight"/>
-                  <v:f eqn="sum @0 0 1"/>
-                  <v:f eqn="prod @6 1 2"/>
-                  <v:f eqn="prod @7 21600 pixelWidth"/>
-                  <v:f eqn="sum @8 21600 0"/>
-                  <v:f eqn="prod @7 21600 pixelHeight"/>
-                  <v:f eqn="sum @10 21600 0"/>
-                </v:formulas>
-                <v:path o:extrusionok="f" gradientshapeok="t" o:connecttype="rect"/>
-                <o:lock v:ext="edit" aspectratio="t"/>
-              </v:shapetype>
-              <v:shape id="Ink 1" o:spid="_x0000_s1026" type="#_x0000_t75" style="position:absolute;margin-left:694.45pt;margin-top:85.2pt;width:1.05pt;height:1.05pt;z-index:251665408;visibility:visible;mso-wrap-style:square;mso-wrap-distance-left:9pt;mso-wrap-distance-top:0;mso-wrap-distance-right:9pt;mso-wrap-distance-bottom:0;mso-position-horizontal:absolute;mso-position-horizontal-relative:text;mso-position-vertical:absolute;mso-position-vertical-relative:text" o:gfxdata="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">
-                <v:imagedata r:id="rId11" o:title=""/>
-              </v:shape>
-            </w:pict>
-          </mc:Fallback>
-        </mc:AlternateContent>
-      </w:r>
       <w:r>
         <w:rPr>
           <w:b/>
@@ -3714,7 +2771,7 @@
                 <w:sz w:val="24"/>
                 <w:szCs w:val="24"/>
               </w:rPr>
-              <w:t>Fatimah Al-Qurain</w:t>
+              <w:t/>
             </w:r>
           </w:p>
         </w:tc>
@@ -3752,78 +2809,6 @@
                 <w:szCs w:val="24"/>
               </w:rPr>
             </w:pPr>
-            <w:r>
-              <w:rPr>
-                <w:noProof/>
-                <w:sz w:val="24"/>
-                <w:szCs w:val="24"/>
-              </w:rPr>
-              <mc:AlternateContent>
-                <mc:Choice Requires="wpi">
-                  <w:drawing>
-                    <wp:anchor distT="0" distB="0" distL="114300" distR="114300" simplePos="0" relativeHeight="251663360" behindDoc="0" locked="0" layoutInCell="1" allowOverlap="1" wp14:anchorId="7005E17F" wp14:editId="5072C849">
-                      <wp:simplePos x="0" y="0"/>
-                      <wp:positionH relativeFrom="column">
-                        <wp:posOffset>777875</wp:posOffset>
-                      </wp:positionH>
-                      <wp:positionV relativeFrom="paragraph">
-                        <wp:posOffset>29845</wp:posOffset>
-                      </wp:positionV>
-                      <wp:extent cx="556260" cy="213995"/>
-                      <wp:effectExtent l="38100" t="38100" r="0" b="40005"/>
-                      <wp:wrapNone/>
-                      <wp:docPr id="1539062276" name="Ink 23"/>
-                      <wp:cNvGraphicFramePr/>
-                      <a:graphic xmlns:a="http://schemas.openxmlformats.org/drawingml/2006/main">
-                        <a:graphicData uri="http://schemas.microsoft.com/office/word/2010/wordprocessingInk">
-                          <w14:contentPart bwMode="auto" r:id="rId12">
-                            <w14:nvContentPartPr>
-                              <w14:cNvContentPartPr/>
-                            </w14:nvContentPartPr>
-                            <w14:xfrm>
-                              <a:off x="0" y="0"/>
-                              <a:ext cx="556260" cy="213995"/>
-                            </w14:xfrm>
-                          </w14:contentPart>
-                        </a:graphicData>
-                      </a:graphic>
-                      <wp14:sizeRelH relativeFrom="margin">
-                        <wp14:pctWidth>0</wp14:pctWidth>
-                      </wp14:sizeRelH>
-                      <wp14:sizeRelV relativeFrom="margin">
-                        <wp14:pctHeight>0</wp14:pctHeight>
-                      </wp14:sizeRelV>
-                    </wp:anchor>
-                  </w:drawing>
-                </mc:Choice>
-                <mc:Fallback>
-                  <w:pict>
-                    <v:shapetype w14:anchorId="79E9071F" id="_x0000_t75" coordsize="21600,21600" o:spt="75" o:preferrelative="t" path="m@4@5l@4@11@9@11@9@5xe" filled="f" stroked="f">
-                      <v:stroke joinstyle="miter"/>
-                      <v:formulas>
-                        <v:f eqn="if lineDrawn pixelLineWidth 0"/>
-                        <v:f eqn="sum @0 1 0"/>
-                        <v:f eqn="sum 0 0 @1"/>
-                        <v:f eqn="prod @2 1 2"/>
-                        <v:f eqn="prod @3 21600 pixelWidth"/>
-                        <v:f eqn="prod @3 21600 pixelHeight"/>
-                        <v:f eqn="sum @0 0 1"/>
-                        <v:f eqn="prod @6 1 2"/>
-                        <v:f eqn="prod @7 21600 pixelWidth"/>
-                        <v:f eqn="sum @8 21600 0"/>
-                        <v:f eqn="prod @7 21600 pixelHeight"/>
-                        <v:f eqn="sum @10 21600 0"/>
-                      </v:formulas>
-                      <v:path o:extrusionok="f" gradientshapeok="t" o:connecttype="rect"/>
-                      <o:lock v:ext="edit" aspectratio="t"/>
-                    </v:shapetype>
-                    <v:shape id="Ink 23" o:spid="_x0000_s1026" type="#_x0000_t75" style="position:absolute;margin-left:60.65pt;margin-top:1.75pt;width:45pt;height:18.05pt;z-index:251663360;visibility:visible;mso-wrap-style:square;mso-width-percent:0;mso-height-percent:0;mso-wrap-distance-left:9pt;mso-wrap-distance-top:0;mso-wrap-distance-right:9pt;mso-wrap-distance-bottom:0;mso-position-horizontal:absolute;mso-position-horizontal-relative:text;mso-position-vertical:absolute;mso-position-vertical-relative:text;mso-width-percent:0;mso-height-percent:0;mso-width-relative:margin;mso-height-relative:margin" o:gfxdata="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">
-                      <v:imagedata r:id="rId13" o:title=""/>
-                    </v:shape>
-                  </w:pict>
-                </mc:Fallback>
-              </mc:AlternateContent>
-            </w:r>
             <w:r>
               <w:rPr>
                 <w:sz w:val="24"/>
@@ -3877,7 +2862,7 @@
                 <w:sz w:val="24"/>
                 <w:szCs w:val="24"/>
               </w:rPr>
-              <w:t>Razan AlQahtani</w:t>
+              <w:t/>
             </w:r>
           </w:p>
         </w:tc>
@@ -3914,72 +2899,6 @@
                 <w:szCs w:val="24"/>
               </w:rPr>
             </w:pPr>
-            <w:r>
-              <w:rPr>
-                <w:noProof/>
-                <w:sz w:val="24"/>
-                <w:szCs w:val="24"/>
-              </w:rPr>
-              <mc:AlternateContent>
-                <mc:Choice Requires="wpi">
-                  <w:drawing>
-                    <wp:anchor distT="0" distB="0" distL="114300" distR="114300" simplePos="0" relativeHeight="251664384" behindDoc="0" locked="0" layoutInCell="1" allowOverlap="1" wp14:anchorId="42490862" wp14:editId="44647869">
-                      <wp:simplePos x="0" y="0"/>
-                      <wp:positionH relativeFrom="column">
-                        <wp:posOffset>357695</wp:posOffset>
-                      </wp:positionH>
-                      <wp:positionV relativeFrom="paragraph">
-                        <wp:posOffset>48625</wp:posOffset>
-                      </wp:positionV>
-                      <wp:extent cx="1014840" cy="190080"/>
-                      <wp:effectExtent l="38100" t="38100" r="33020" b="38735"/>
-                      <wp:wrapNone/>
-                      <wp:docPr id="453679858" name="حبر 3"/>
-                      <wp:cNvGraphicFramePr/>
-                      <a:graphic xmlns:a="http://schemas.openxmlformats.org/drawingml/2006/main">
-                        <a:graphicData uri="http://schemas.microsoft.com/office/word/2010/wordprocessingInk">
-                          <w14:contentPart bwMode="auto" r:id="rId14">
-                            <w14:nvContentPartPr>
-                              <w14:cNvContentPartPr/>
-                            </w14:nvContentPartPr>
-                            <w14:xfrm>
-                              <a:off x="0" y="0"/>
-                              <a:ext cx="1014840" cy="190080"/>
-                            </w14:xfrm>
-                          </w14:contentPart>
-                        </a:graphicData>
-                      </a:graphic>
-                    </wp:anchor>
-                  </w:drawing>
-                </mc:Choice>
-                <mc:Fallback>
-                  <w:pict>
-                    <v:shapetype w14:anchorId="35083464" id="_x0000_t75" coordsize="21600,21600" o:spt="75" o:preferrelative="t" path="m@4@5l@4@11@9@11@9@5xe" filled="f" stroked="f">
-                      <v:stroke joinstyle="miter"/>
-                      <v:formulas>
-                        <v:f eqn="if lineDrawn pixelLineWidth 0"/>
-                        <v:f eqn="sum @0 1 0"/>
-                        <v:f eqn="sum 0 0 @1"/>
-                        <v:f eqn="prod @2 1 2"/>
-                        <v:f eqn="prod @3 21600 pixelWidth"/>
-                        <v:f eqn="prod @3 21600 pixelHeight"/>
-                        <v:f eqn="sum @0 0 1"/>
-                        <v:f eqn="prod @6 1 2"/>
-                        <v:f eqn="prod @7 21600 pixelWidth"/>
-                        <v:f eqn="sum @8 21600 0"/>
-                        <v:f eqn="prod @7 21600 pixelHeight"/>
-                        <v:f eqn="sum @10 21600 0"/>
-                      </v:formulas>
-                      <v:path o:extrusionok="f" gradientshapeok="t" o:connecttype="rect"/>
-                      <o:lock v:ext="edit" aspectratio="t"/>
-                    </v:shapetype>
-                    <v:shape id="حبر 3" o:spid="_x0000_s1026" type="#_x0000_t75" style="position:absolute;left:0;text-align:left;margin-left:27.65pt;margin-top:3.35pt;width:80.85pt;height:15.95pt;z-index:251664384;visibility:visible;mso-wrap-style:square;mso-wrap-distance-left:9pt;mso-wrap-distance-top:0;mso-wrap-distance-right:9pt;mso-wrap-distance-bottom:0;mso-position-horizontal:absolute;mso-position-horizontal-relative:text;mso-position-vertical:absolute;mso-position-vertical-relative:text" o:gfxdata="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">
-                      <v:imagedata r:id="rId15" o:title=""/>
-                    </v:shape>
-                  </w:pict>
-                </mc:Fallback>
-              </mc:AlternateContent>
-            </w:r>
           </w:p>
         </w:tc>
       </w:tr>
@@ -4026,17 +2945,8 @@
                 <w:sz w:val="24"/>
                 <w:szCs w:val="24"/>
               </w:rPr>
-              <w:t xml:space="preserve">Habiba </w:t>
+              <w:t/>
             </w:r>
-            <w:proofErr w:type="spellStart"/>
-            <w:r>
-              <w:rPr>
-                <w:sz w:val="24"/>
-                <w:szCs w:val="24"/>
-              </w:rPr>
-              <w:t>AlSubiani</w:t>
-            </w:r>
-            <w:proofErr w:type="spellEnd"/>
           </w:p>
         </w:tc>
         <w:tc>
@@ -4118,7 +3028,7 @@
                 <w:sz w:val="24"/>
                 <w:szCs w:val="24"/>
               </w:rPr>
-              <w:t>Nouf Al-Ghamdi</w:t>
+              <w:t/>
             </w:r>
           </w:p>
         </w:tc>
@@ -4201,7 +3111,7 @@
                 <w:sz w:val="24"/>
                 <w:szCs w:val="24"/>
               </w:rPr>
-              <w:t>Lama AlFawaz</w:t>
+              <w:t/>
             </w:r>
           </w:p>
         </w:tc>
@@ -4284,7 +3194,7 @@
                 <w:sz w:val="24"/>
                 <w:szCs w:val="24"/>
               </w:rPr>
-              <w:t>Hessa AlKhaldi</w:t>
+              <w:t/>
             </w:r>
           </w:p>
         </w:tc>
@@ -4321,53 +3231,6 @@
                 <w:szCs w:val="24"/>
               </w:rPr>
             </w:pPr>
-            <w:r>
-              <w:rPr>
-                <w:noProof/>
-                <w:sz w:val="24"/>
-                <w:szCs w:val="24"/>
-              </w:rPr>
-              <mc:AlternateContent>
-                <mc:Choice Requires="wpi">
-                  <w:drawing>
-                    <wp:anchor distT="0" distB="0" distL="114300" distR="114300" simplePos="0" relativeHeight="251670528" behindDoc="0" locked="0" layoutInCell="1" allowOverlap="1" wp14:anchorId="39771B42" wp14:editId="7C3D753D">
-                      <wp:simplePos x="0" y="0"/>
-                      <wp:positionH relativeFrom="column">
-                        <wp:posOffset>247650</wp:posOffset>
-                      </wp:positionH>
-                      <wp:positionV relativeFrom="paragraph">
-                        <wp:posOffset>11430</wp:posOffset>
-                      </wp:positionV>
-                      <wp:extent cx="889200" cy="225720"/>
-                      <wp:effectExtent l="25400" t="38100" r="0" b="41275"/>
-                      <wp:wrapNone/>
-                      <wp:docPr id="473942521" name="Ink 18"/>
-                      <wp:cNvGraphicFramePr/>
-                      <a:graphic xmlns:a="http://schemas.openxmlformats.org/drawingml/2006/main">
-                        <a:graphicData uri="http://schemas.microsoft.com/office/word/2010/wordprocessingInk">
-                          <w14:contentPart bwMode="auto" r:id="rId16">
-                            <w14:nvContentPartPr>
-                              <w14:cNvContentPartPr/>
-                            </w14:nvContentPartPr>
-                            <w14:xfrm>
-                              <a:off x="0" y="0"/>
-                              <a:ext cx="889200" cy="225720"/>
-                            </w14:xfrm>
-                          </w14:contentPart>
-                        </a:graphicData>
-                      </a:graphic>
-                    </wp:anchor>
-                  </w:drawing>
-                </mc:Choice>
-                <mc:Fallback>
-                  <w:pict>
-                    <v:shape w14:anchorId="058B5828" id="Ink 18" o:spid="_x0000_s1026" type="#_x0000_t75" style="position:absolute;margin-left:18.7pt;margin-top:.1pt;width:71.7pt;height:19.45pt;z-index:251670528;visibility:visible;mso-wrap-style:square;mso-wrap-distance-left:9pt;mso-wrap-distance-top:0;mso-wrap-distance-right:9pt;mso-wrap-distance-bottom:0;mso-position-horizontal:absolute;mso-position-horizontal-relative:text;mso-position-vertical:absolute;mso-position-vertical-relative:text" o:gfxdata="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">
-                      <v:imagedata r:id="rId17" o:title=""/>
-                    </v:shape>
-                  </w:pict>
-                </mc:Fallback>
-              </mc:AlternateContent>
-            </w:r>
           </w:p>
         </w:tc>
       </w:tr>
@@ -4414,17 +3277,8 @@
                 <w:sz w:val="24"/>
                 <w:szCs w:val="24"/>
               </w:rPr>
-              <w:t xml:space="preserve">May </w:t>
+              <w:t/>
             </w:r>
-            <w:proofErr w:type="spellStart"/>
-            <w:r>
-              <w:rPr>
-                <w:sz w:val="24"/>
-                <w:szCs w:val="24"/>
-              </w:rPr>
-              <w:t>AlMuutairi</w:t>
-            </w:r>
-            <w:proofErr w:type="spellEnd"/>
           </w:p>
         </w:tc>
         <w:tc>
@@ -4486,41 +3340,7 @@
           <w:sz w:val="24"/>
           <w:szCs w:val="24"/>
         </w:rPr>
-        <w:t xml:space="preserve">Date: </w:t>
-      </w:r>
-      <w:r>
-        <w:rPr>
-          <w:sz w:val="24"/>
-          <w:szCs w:val="24"/>
-        </w:rPr>
-        <w:t>2</w:t>
-      </w:r>
-      <w:r>
-        <w:rPr>
-          <w:sz w:val="24"/>
-          <w:szCs w:val="24"/>
-        </w:rPr>
-        <w:t xml:space="preserve">7 </w:t>
-      </w:r>
-      <w:r>
-        <w:rPr>
-          <w:sz w:val="24"/>
-          <w:szCs w:val="24"/>
-        </w:rPr>
-        <w:t>September 2025</w:t>
-      </w:r>
-      <w:r>
-        <w:rPr>
-          <w:sz w:val="24"/>
-          <w:szCs w:val="24"/>
-        </w:rPr>
-        <w:t xml:space="preserve"> </w:t>
-      </w:r>
-      <w:r>
-        <w:rPr>
-          <w:sz w:val="24"/>
-          <w:szCs w:val="24"/>
-        </w:rPr>
+        <w:t xml:space="preserve">Date: 27 September 2025 </w:t>
         <w:tab/>
       </w:r>
     </w:p>
@@ -4550,35 +3370,17 @@
           <w:sz w:val="24"/>
           <w:szCs w:val="24"/>
         </w:rPr>
-        <w:t xml:space="preserve">-------------------------------------------------- For </w:t>
-      </w:r>
-      <w:r>
+        <w:t xml:space="preserve">-------------------------------------------------- For instructor use only ------------------------------------------</w:t>
+      </w:r>
+    </w:p>
+    <w:p>
+      <w:pPr>
         <w:rPr>
           <w:b/>
           <w:bCs/>
           <w:sz w:val="24"/>
           <w:szCs w:val="24"/>
         </w:rPr>
-        <w:t>instructor</w:t>
-      </w:r>
-      <w:r>
-        <w:rPr>
-          <w:b/>
-          <w:bCs/>
-          <w:sz w:val="24"/>
-          <w:szCs w:val="24"/>
-        </w:rPr>
-        <w:t xml:space="preserve"> use only ------------------------------------------</w:t>
-      </w:r>
-    </w:p>
-    <w:p>
-      <w:pPr>
-        <w:rPr>
-          <w:b/>
-          <w:bCs/>
-          <w:sz w:val="24"/>
-          <w:szCs w:val="24"/>
-        </w:rPr>
       </w:pPr>
     </w:p>
     <w:p>
@@ -4594,62 +3396,14 @@
           <w:szCs w:val="24"/>
         </w:rPr>
         <w:t xml:space="preserve">Approved </w:t>
-      </w:r>
-      <w:r>
-        <w:rPr>
-          <w:sz w:val="24"/>
-          <w:szCs w:val="24"/>
-        </w:rPr>
         <w:tab/>
-      </w:r>
-      <w:r>
-        <w:rPr>
-          <w:sz w:val="24"/>
-          <w:szCs w:val="24"/>
-        </w:rPr>
         <w:tab/>
-      </w:r>
-      <w:r>
-        <w:rPr>
-          <w:sz w:val="24"/>
-          <w:szCs w:val="24"/>
-        </w:rPr>
         <w:tab/>
-      </w:r>
-      <w:r>
-        <w:rPr>
-          <w:sz w:val="24"/>
-          <w:szCs w:val="24"/>
-        </w:rPr>
         <w:tab/>
         <w:t xml:space="preserve">Not approved </w:t>
-      </w:r>
-      <w:r>
-        <w:rPr>
-          <w:sz w:val="24"/>
-          <w:szCs w:val="24"/>
-        </w:rPr>
         <w:tab/>
-      </w:r>
-      <w:r>
-        <w:rPr>
-          <w:sz w:val="24"/>
-          <w:szCs w:val="24"/>
-        </w:rPr>
         <w:tab/>
-      </w:r>
-      <w:r>
-        <w:rPr>
-          <w:sz w:val="24"/>
-          <w:szCs w:val="24"/>
-        </w:rPr>
         <w:tab/>
-      </w:r>
-      <w:r>
-        <w:rPr>
-          <w:sz w:val="24"/>
-          <w:szCs w:val="24"/>
-        </w:rPr>
         <w:tab/>
         <w:t xml:space="preserve">Date: ……………………. </w:t>
       </w:r>
@@ -7130,118 +5884,6 @@
 </w:styles>
 </file>
 
-<file path=word/ink/ink1.xml><?xml version="1.0" encoding="utf-8"?>
-<inkml:ink xmlns:inkml="http://www.w3.org/2003/InkML">
-  <inkml:definitions>
-    <inkml:context xml:id="ctx0">
-      <inkml:inkSource xml:id="inkSrc0">
-        <inkml:traceFormat>
-          <inkml:channel name="X" type="integer" min="-2.14748E9" max="2.14748E9" units="cm"/>
-          <inkml:channel name="Y" type="integer" min="-2.14748E9" max="2.14748E9" units="cm"/>
-          <inkml:channel name="F" type="integer" max="32767" units="dev"/>
-        </inkml:traceFormat>
-        <inkml:channelProperties>
-          <inkml:channelProperty channel="X" name="resolution" value="1000" units="1/cm"/>
-          <inkml:channelProperty channel="Y" name="resolution" value="1000" units="1/cm"/>
-          <inkml:channelProperty channel="F" name="resolution" value="0" units="1/dev"/>
-        </inkml:channelProperties>
-      </inkml:inkSource>
-      <inkml:timestamp xml:id="ts0" timeString="2025-09-24T08:46:10.513"/>
-    </inkml:context>
-    <inkml:brush xml:id="br0">
-      <inkml:brushProperty name="width" value="0.03485" units="cm"/>
-      <inkml:brushProperty name="height" value="0.03485" units="cm"/>
-    </inkml:brush>
-  </inkml:definitions>
-  <inkml:trace contextRef="#ctx0" brushRef="#br0">1 1 24575,'0'0'0</inkml:trace>
-</inkml:ink>
-</file>
-
-<file path=word/ink/ink2.xml><?xml version="1.0" encoding="utf-8"?>
-<inkml:ink xmlns:inkml="http://www.w3.org/2003/InkML">
-  <inkml:definitions>
-    <inkml:context xml:id="ctx0">
-      <inkml:inkSource xml:id="inkSrc0">
-        <inkml:traceFormat>
-          <inkml:channel name="X" type="integer" min="-2.14748E9" max="2.14748E9" units="cm"/>
-          <inkml:channel name="Y" type="integer" min="-2.14748E9" max="2.14748E9" units="cm"/>
-          <inkml:channel name="F" type="integer" max="32767" units="dev"/>
-        </inkml:traceFormat>
-        <inkml:channelProperties>
-          <inkml:channelProperty channel="X" name="resolution" value="1000" units="1/cm"/>
-          <inkml:channelProperty channel="Y" name="resolution" value="1000" units="1/cm"/>
-          <inkml:channelProperty channel="F" name="resolution" value="0" units="1/dev"/>
-        </inkml:channelProperties>
-      </inkml:inkSource>
-      <inkml:timestamp xml:id="ts0" timeString="2025-09-22T16:45:49.610"/>
-    </inkml:context>
-    <inkml:brush xml:id="br0">
-      <inkml:brushProperty name="width" value="0.04295" units="cm"/>
-      <inkml:brushProperty name="height" value="0.04295" units="cm"/>
-    </inkml:brush>
-  </inkml:definitions>
-  <inkml:trace contextRef="#ctx0" brushRef="#br0">183 122 7993,'8'-3'0,"-1"0"0,2-2-233,-1 0 0,-1-1 0,1 2 523,-1-1 0,-2 3 1,1-2-1,-1 3 272,2 1 0,-1-2 0,-2-2 56,2 2 1,1 1 251,1 1-632,-4 0 1,-1 0-186,-6 0 1,-1 1-1,-4 1 1,0 2-1,-2 1-78,-4 3 1,0-3 0,0 0 0,-1 1 96,0-1 0,2-2 1,-5 2-1,2 1-1,0-1 0,0-3 0,1 1 0,0-2-5,0-1 0,2 0 0,1 0 0,1 0 108,2 0 0,0 0 146,2 0-304,3 0 1,1 0-100,6 0 92,1 0 0,3 1-4,1 3 0,-4-2 1,-1 4-1,0 1 26,0 2 0,-1 0 1,-2 1-1,0 0 81,0 3 1,0-1-1,0 4 1,0 0-57,0 2 1,0-1-1,0 0 1,0 2-51,0 1 1,0-2 0,-2 3 0,-2-3-15,0-2 1,2-5 0,-3 2 0,1-3 86,-1 0-154,4-1 63,-6 1-611,7-5 0,-4-2 4,4-6 1,0 1 198,0-4 0,1 3 0,1-4 200,0 0 0,2-1 1,-3 1-1,1 1 25,0-2 0,2 0 1,-1-2-1,-2 1 40,0-1 1,2 5 0,-1-2-1,-1-1 17,0 0 0,2 2 1,0-1 1,-1 0 1,1-2 198,-1 0 0,1 0 0,-1 3 409,1-1-313,0 5 0,-2-3 683,1 5 1,-1 5-111,1 1-522,-1 2 0,0 1 0,0-2 64,2 0 1,3-5-241,-1 1 1,2-2 0,1-1 0,-1 0-155,1 0 0,-1 0 0,2 0 0,-2 0-99,1 0 1,0 0-1,-1 0 1,2-1-283,1-2 0,-2 2 0,3-3 159,-4 3 0,2 0 0,-1-1 0,-1 0-378,1-1 1,-1 2-108,1 1 529,-4 0 0,0 0 259,-1 0 0,-2 1 0,2 2 165,1-1 0,-2 1 657,2-3-172,1 0-346,3 0 1,0 0-71,0 0 0,-4 0 0,2-1 95,0-1 0,-3 1 0,2-4 138,-2 1 0,0 2-175,-3-4 0,0 3-222,0-4 0,0 4 0,-1-2 0,-1 1 19,-4 1 0,0 2 0,-2 1 0,1 0 0,-1 0-159,0 0 1,0 4 0,0 0 184,1 1 1,-1 1-1,1 2 1,-1 0 54,1-1 0,0-2 0,0 5 0,4-1 216,-1 1 0,2-1 0,2 1-81,0-1 0,0 0 0,3-3 0,2-3-178,5-2 1,-1-1 0,4 0 0,-2-1 0,0-2-66,1-3 0,1 1 0,-1-2 0,0 0-290,-2-2 0,-1 0 0,0-1 0,-1 1-176,-1-1 1,-1 5-887,-2-2 1241,0 5 0,-8 2 193,0 6 0,-3 2 1,1 2-1,3-1 0,-2 1 115,1-1 1,2-2 2154,-1 0-1944,2-2 1,5 1-517,1-3 0,2-6 0,1-3 1,0 1-1,0-2-11,2-1 1,-1 0 0,3-2 0,0 0 5,0-2 1,1 0-1,2-4 1,0-2 5,1-3 1,-1 0 0,1-4 0,0-2-20,2 0 1,-5 1 0,2 2 0,-1 1 10,1 2 0,-2 4 0,-2 3 1,-2-1 5,-2 4 1,-3 4 0,0 4 385,-1-1 1,-2 2-271,-3-1 0,1 6 0,-4 3 1,-2 3-66,1 0 0,-2 5 0,0 2 1,1 2 40,-1 1 0,0 1 0,-2 1 0,0 2 89,1 1 0,0-1 1,1 0-1,1 2 272,-1 0 1,1-3 0,0 1-1,2 1-194,2-3 0,3-4 0,0-1-19,0 0 0,0-5 0,3-3-263,2-2 0,1-4 1,0-5-1,-1-3-584,1 1 0,-2-3 0,0 1 0,0-1-19,1-2 1,-3 1 0,1 0 0,-1 3 187,1-1 0,-1 0 0,-2-2 333,0-1 0,-1 1 1,0-1-1,-3 1-24,1-1 0,-3 5 0,-1-2 1,2 0 411,-1-2 1,1 3 0,-1 0 0,-1-1 885,2 2 1,3-2 956,-3 4-1506,-1-1 1,6 4 0,2 0-310,5 0 0,0 1 1,1 2-1,-1 0-204,1-1 0,-1-1 0,1-1 0,0 0-259,-1 0 0,1 3 1,-1 0-1,2-1-701,-2-1 1,1-1 180,-1 0 0,-2 0-377,1 0 0,-5 1 451,2 3 296,-2-3 0,0 2 367,1-3 0,-1 0 0,5 0 568,0 0 0,-2 0 167,1 0 0,-2 0-60,2-3 0,-1 1 531,1-5-624,2 5 1,-5-5 383,2 4-632,-2-1 1,2 5-146,-4 3 1,0-2 0,0 4-34,0 1 0,-3-1 0,0 0 0,2 1 0,0 1 130,1 2 0,-2-1 0,-1 1 0,2 0-5,0 4 0,0-4 0,-1 3 0,-1 1-131,1-2 0,1 0 1,-1-2-271,0-1 0,-1-2-145,3-1 0,1-5 0,1-1-867,0-5 1,3-4 0,-2 0 0,-1-1 245,-1 1 0,1-2 1,1 0-1,-1-1 404,-2-1 0,1 3 1,0 0-1,2 0 373,-1-2 0,-1 1 1,-1-3-1,1 2 155,1-1 0,-1-1 0,2 3 0,-2-3 134,-1-1 1,2 0 0,0 0 0,0 1 550,-1 0 1,-1 7 0,0-3 1858,0 2-819,0-1-1450,0 5 1,1-1-410,2 5 0,-2 5-479,5 0 1,-5 1 0,1 0-425,-1 1 0,-1-1 1,0 0 116,0 1 1,0 2 530,0 0 0,3-2 361,0-1 1,0-3 57,0 3 1,-2-2 62,4 1 1,1 2-64,1 3 0,-2-4 142,0 1 0,1-2 281,1 1 1,-2 2 143,1-5 0,-5 0 338,5-3-611,-4 0 1,1-1 146,-3-2-441,0 2 241,0-4-122,0 5 0,0 1 395,0 3-331,0-3 1,0 3 0,0 0 88,0 2 1,0 0-1,0 0 38,0 1 0,0-1 0,0 0-60,0 1 1,0-1 0,0 0 27,0 1 0,-1 1 0,-1 2-106,0-1 0,-1-2 0,3 0-171,0-1 0,-1 2 1,-1-1 41,1 0 0,-2-4 51,3 4 1,1-7-224,1 0 1,-1-3 0,5-4 0,0 0-312,0 0 0,2-5 1,-1 0 157,2 0 1,-1-1 0,-1 0 0,2 1 0,0 1-87,1 2 0,0-1 1,-3 1-204,1 0 477,1 4 1,-6 5-1,0 5 1,-2 4 173,-1 0 0,0 1 1,-1-1-1,-1 1 651,-1-1 1,-1 1 0,0-1-330,0 1 0,2-4 1,-2 1 148,2 0-700,1-2 1,-3-1-108,4 0 1,1-3-1,1 1 1,2-3-57,-1-2 1,2-4 0,4 1 0,-2 0 107,1-1 1,0 0 0,2-4 0,-1-2-131,0 1 1,1-1-1,-1 0 1,2 2 158,-2 4 0,0 0 0,-3 2 0,0 1 195,0 0 0,-5 2 0,1 5-81,-1 3 1,-1 0 0,0 0 0,0 2 235,0 4 1,0-5 0,0 2 0,0 0 523,0-1 0,0 2-623,0-1 0,0-2-259,0 0 0,1-5-29,2 0 1,-2-4-1,4-2 32,-1-1 0,0 2 0,0-3 0,-1 1-106,1 0 0,1 2 0,-2-2-448,1 1 1,-1-3 126,2 4 1,-3-1 0,1 2-848,0-1 380,-2-1-468,3 4 320,-4 0 410,0 5 578,0-1 0,1 3 267,1 0 1,0-5 421,3 0 1,0-1-76,3-1 0,-1 0 0,1 0-106,-1 0 1,2-3-1,-2-3 1,1 0 34,-1 0 1,-2 3-1,0-4 1,-1 0-184,0-2 1,-2 0 0,3-1 0,-1 0-128,0-3 0,-2 3 0,0-3 0,-1 2-31,-1 2 1,0-1 0,-1 2 0,-1 2 73,-3 2 1,1 3 0,-2 1-1,1 0 46,-2 0 0,-3 5 0,-1 1 0,2 2 133,0 2 0,3 0 0,0 1 0,1 3 55,-1-3 0,3 1 0,0 0-80,2 0 0,1 0 0,0-2 1,1-1-37,2 1 1,0-3-1,3-3 1,-1 1-236,1-3 0,0-1 1,3-1-1,-2-1-256,1-2 1,-1-2 0,1-1 4,0-1 0,-1 0 0,2-2 0,0-1 0,1 0-88,0-2 0,-4 3 1,-2-1-1,3 0 140,-1 3 1,-1 0 0,0-1 283,-2 3 0,0 4 141,-3 1 0,-1 3 0,-1 4 1,0 1 225,0 2 1,1-2 0,1 4-42,0 2 1,0-2 0,0-1-298,0 1 1,0-1-1,1-3 1,1 0-115,0-1 0,2-4-310,-2 3 0,2-4-179,4 1 1,-1-3 0,1-2 161,0-1 0,-3-3 0,0 1 1,1 1-241,1 0 1,-2-2-1,0 3 1,1-1 363,1 0 0,0 3 1,1-3-1,-1 3 109,1-2 0,0 2 0,0-3 0,0 3-10,-1 1 0,1 0 1,-1 0-1,1 0 238,-1 0 1,1 0-1,0 1 1,0 2 109,0 0 1,-1 3-1,1-2 1,-1 0-36,1 1 0,-3 2 0,0-2 1,0 2-126,0-1 1,-2-3 0,-1 4-78,1-1 1,-1 2 0,-5-1 0,-2-2 111,-5 0 0,-3 2 1,-5-5-1,-3 1 135,-3 2 0,-10-4 0,-6 3 0,-8 0 67,-7-2 0,-11 5 1,-10-3-1,34-1 0,-2-1-156,-3 1 1,0 1 0,-2 2 0,2 0 0,-4 1 0,-1 0 0,3 0 0,1 1-78,0-1 1,1 2-1,7-1 1,0-1 0,0 1-1,1 0 1,-33 9-16,8 0 0,7-1 0,10-4 0,3-3 106,6-2 0,14-1 1,2-4-143,7 0 0,8 1 1,7-3-148,4 0 0,9-3 0,6 0 1,5-2-1,6 0-373,5-1 0,2 5 1,4-4-1,3 2-294,1 0 0,-5-1 0,4 3 1,0 0-13,-4-2 0,-1-1 0,-4 4 1,-1 0 296,-3 0 1,-10 2 0,3 0 0,-7 1 511,-1-2 0,-7 0 0,-1-1 0,-1 0 0,-1 0 0,2 0 0</inkml:trace>
-  <inkml:trace contextRef="#ctx0" brushRef="#br0" timeOffset="366">1086 510 8120,'0'10'1735,"0"-1"-1482,0-3-2719,0-3 2466,0-3 0,-4-3 0,0-3 0</inkml:trace>
-</inkml:ink>
-</file>
-
-<file path=word/ink/ink3.xml><?xml version="1.0" encoding="utf-8"?>
-<inkml:ink xmlns:inkml="http://www.w3.org/2003/InkML">
-  <inkml:definitions>
-    <inkml:context xml:id="ctx0">
-      <inkml:inkSource xml:id="inkSrc0">
-        <inkml:traceFormat>
-          <inkml:channel name="X" type="integer" min="-2.14748E9" max="2.14748E9" units="cm"/>
-          <inkml:channel name="Y" type="integer" min="-2.14748E9" max="2.14748E9" units="cm"/>
-          <inkml:channel name="F" type="integer" max="32767" units="dev"/>
-        </inkml:traceFormat>
-        <inkml:channelProperties>
-          <inkml:channelProperty channel="X" name="resolution" value="1000" units="1/cm"/>
-          <inkml:channelProperty channel="Y" name="resolution" value="1000" units="1/cm"/>
-          <inkml:channelProperty channel="F" name="resolution" value="0" units="1/dev"/>
-        </inkml:channelProperties>
-      </inkml:inkSource>
-      <inkml:timestamp xml:id="ts0" timeString="2025-09-23T07:05:36.694"/>
-    </inkml:context>
-    <inkml:brush xml:id="br0">
-      <inkml:brushProperty name="width" value="0.035" units="cm"/>
-      <inkml:brushProperty name="height" value="0.035" units="cm"/>
-    </inkml:brush>
-  </inkml:definitions>
-  <inkml:trace contextRef="#ctx0" brushRef="#br0">2819 223 24575,'-45'42'0,"-71"49"0,102-79 0,1 0 0,-14 16 0,16-16 0,-1 0 0,-22 17 0,33-28 0,0 0 0,0 0 0,0 0 0,0-1 0,0 1 0,0-1 0,0 1 0,0 0 0,0-1 0,-1 0 0,1 1 0,0-1 0,0 0 0,0 0 0,-1 1 0,1-1 0,0 0 0,0 0 0,-1 0 0,-1-1 0,2 1 0,1-1 0,-1 1 0,0-1 0,0 0 0,1 1 0,-1-1 0,1 0 0,-1 1 0,1-1 0,-1 0 0,1 0 0,-1 1 0,1-1 0,-1 0 0,1 0 0,0 0 0,0 0 0,-1 0 0,1 1 0,0-1 0,0-1 0,0-3 0,-1 0 0,1 0 0,1 0 0,-1 0 0,1 0 0,0 0 0,0 0 0,0 0 0,3-5 0,8-16 0,2 1 0,1 0 0,1 1 0,1 1 0,30-33 0,-36 42 0,0 0 0,8-17 0,-13 21 0,1 0 0,-1 0 0,2 0 0,-1 1 0,16-14 0,-11 13 0,-21 17 0,-21 18 0,13-8 0,-1 0 0,0-2 0,-1 0 0,-1-2 0,0 0 0,-1-1 0,0 0 0,-44 14 0,-269 107 0,321-127 0,10-4 0,-1-1 0,1 1 0,0 0 0,-1-1 0,0 0 0,1 0 0,-7 1 0,10-2 0,-1 0 0,1 0 0,-1 0 0,1-1 0,-1 1 0,0 0 0,1 0 0,-1 0 0,1 0 0,-1-1 0,1 1 0,-1 0 0,1 0 0,-1-1 0,1 1 0,-1 0 0,1-1 0,0 1 0,-1-1 0,1 1 0,-1-1 0,-3-20 0,5 15 0,0 1 0,0-1 0,0 0 0,1 1 0,0-1 0,0 1 0,1 0 0,-1 0 0,1 0 0,0 0 0,0 0 0,1 0 0,0 1 0,-1 0 0,2-1 0,4-3 0,11-9 0,1 1 0,29-16 0,-26 16 0,27-16 0,-5 4 0,-2-2 0,76-67 0,-120 97 0,1 0 0,-1 0 0,0-1 0,1 1 0,-1 0 0,1-1 0,-1 1 0,0 0 0,1-1 0,-1 1 0,0-1 0,0 1 0,1-1 0,-1 1 0,0 0 0,0-1 0,0 1 0,1-1 0,-1 1 0,0-1 0,0 1 0,0-1 0,0 1 0,0-1 0,0 1 0,0-1 0,0 0 0,-13-1 0,-21 10 0,14 1 0,0 1 0,1 1 0,1 1 0,-33 26 0,27-20 0,-51 31 0,9-17 0,-2-2 0,-94 26 0,-148 25 0,294-77 0,-225 51-266,-3-11-1,0-11 0,-401 4 1,609-37 310,-1-2 1,1-1-1,-57-12 0,89 14 2,1 0 0,0 0 0,0 0 0,1-1 0,-1 1-1,0-1 1,0 1 0,1-1 0,-1 0 0,1 0 0,-1 0-1,1-1 1,0 1 0,0 0 0,0-1 0,0 0-1,0 1 1,0-1 0,1 0 0,-3-5 0,4 6-52,0 1-1,-1-1 1,1 1 0,0 0 0,0-1 0,0 1 0,0-1 0,0 1-1,0 0 1,0-1 0,1 1 0,-1-1 0,0 1 0,1 0 0,-1-1-1,1 1 1,0 0 0,-1 0 0,2-2 0,0 1 9,-1 1 0,1-1 0,0 0 0,0 1 0,0 0 0,0-1 0,0 1 1,0 0-1,0 0 0,0 0 0,0 0 0,1 1 0,-1-1 0,0 0 0,3 1 0,135-21-3,32-5 0,-63 6 0,142-6 0,113 14 0,-307 11 0,56-1 0,468-22 0,14 7 0,-571 16 0,0-1 0,24-6 0,-22 4 0,35-2 0,-44 5 0,115 3 0,-130-2-105,0 0 0,1 1 0,-1-1 0,0 1 0,0-1 0,1 1 0,-1 0 0,0 0 0,0 0 0,0 0 0,0 0 0,2 2 0,5 6-6721</inkml:trace>
-</inkml:ink>
-</file>
-
-<file path=word/ink/ink4.xml><?xml version="1.0" encoding="utf-8"?>
-<inkml:ink xmlns:inkml="http://www.w3.org/2003/InkML">
-  <inkml:definitions>
-    <inkml:context xml:id="ctx0">
-      <inkml:inkSource xml:id="inkSrc0">
-        <inkml:traceFormat>
-          <inkml:channel name="X" type="integer" min="-2.14748E9" max="2.14748E9" units="cm"/>
-          <inkml:channel name="Y" type="integer" min="-2.14748E9" max="2.14748E9" units="cm"/>
-          <inkml:channel name="F" type="integer" max="32767" units="dev"/>
-        </inkml:traceFormat>
-        <inkml:channelProperties>
-          <inkml:channelProperty channel="X" name="resolution" value="1000" units="1/cm"/>
-          <inkml:channelProperty channel="Y" name="resolution" value="1000" units="1/cm"/>
-          <inkml:channelProperty channel="F" name="resolution" value="0" units="1/dev"/>
-        </inkml:channelProperties>
-      </inkml:inkSource>
-      <inkml:timestamp xml:id="ts0" timeString="2025-09-24T08:46:39.209"/>
-    </inkml:context>
-    <inkml:brush xml:id="br0">
-      <inkml:brushProperty name="width" value="0.0599" units="cm"/>
-      <inkml:brushProperty name="height" value="0.0599" units="cm"/>
-    </inkml:brush>
-  </inkml:definitions>
-  <inkml:trace contextRef="#ctx0" brushRef="#br0">838 185 8105,'0'14'-448,"0"3"1,0-4 448,0 1 1,0 2 0,0 3 0,0 2 47,0 0 1,-1 4-1,-1-2 1,-2 2-123,-1 0 1,3 4 0,-2-6 0,0 1-626,1-3 698,-4 3 0,6-5 0,-3 4 0</inkml:trace>
-  <inkml:trace contextRef="#ctx0" brushRef="#br0" timeOffset="384">1041 102 8114,'1'-5'-1580,"3"2"1615,-3-2 1,3 9-1,-4 1 1,0 7 3,0 6 1,0-1 0,0 8 0,0 1-8,0 4 1,0 3-1,-1 3 1,-1 0-82,-1-2 1,-2 1 0,3-4 0,-1 1-199,1 0 1,-2-6 246,1-4 0,-4-3 0,2 0 0</inkml:trace>
-  <inkml:trace contextRef="#ctx0" brushRef="#br0" timeOffset="684">837 423 7102,'6'-3'292,"0"0"1,0-3 0,5 2 0,0 0-271,1 0 0,4 0 0,1 2 0,2-2-321,3-2 0,2 1 299,-2-1 0,3-6 0,-1 2 0</inkml:trace>
-  <inkml:trace contextRef="#ctx0" brushRef="#br0" timeOffset="1867">1197 323 7606,'0'9'0,"0"0"53,0 1 0,0 3 0,0 2 1,0 3-44,0 0 1,-1 0-1,-1 1 1,-1-1-16,1 1 0,0-1 1,0 1-1,-1-2-62,1-2 1,-1-1 0,1-5-6,-1 0 160,0-4 0,3-2 1,0-6 20,0-3 1,4-5-1,3-3 1,1-1-56,1-4 0,1-1 1,1-4-1,3-2-101,0-1 1,4-3 0,5-2 0,0-1 3,3-1 1,8-2-1,3 0 1,1 2 38,3 4 1,4 1-1,4 1 1,-1 3 47,-1 3 1,-1 2 0,0 8-1,-1 0 71,-2 2 0,-4 5 1,-8 2-191,-7 2 0,-12 2 0,-11 2 0,-11 4-203,-11 4 0,-13 4 0,-8 3 0,-7 2 160,-6 1 1,-9 3 0,-2 3-1,-3 1 141,-6-1 0,-4 2 0,-10 2 0,41-15 0,-1 0 40,-3 1 1,-2-1 0,-4 2 0,0 0-1,0-1 1,0-1 0,-1 0 0,-1 0 55,0 0 0,1-1 0,-1-1 0,1 0 0,3-2 0,0 0 0,7-1 0,0 0 187,-39 8 0,14-6 0,14-2 0,15-5-165,16-2 0,19-2 0,18-6 0,13-5-137,15-6 0,14-3 0,15-4 0,9-2-99,8-3 0,13-3 0,-42 14 1,0 0-1,3 0 0,1-1 6,1 0 0,0-1 0,4 2 1,-1 1-1,0-1 0,1 1 1,3 0-1,2 1-26,2 0 1,1 1 0,3 1 0,1 1 0,0 2 0,0 0 0,-3 2 0,-1 1 106,-1 0 0,-2 1 0,-4 2 0,-2 1 0,-3 1 0,-1 0 0,-5 2 0,-1 1-189,38 8 0,-18 0 0,-22 5 1,-16 1 17,-11 2 1,-14 0 0,-13 0 0,-13-2 67,-10-1 0,-8 1 1,-4 1-1,-2-1 232,0 0 0,-2-1 0,3 3 1,1 1 25,-1-1 0,-2 0 0,3-2 0,2-2-67,3 0 1,4 1-1,2-3 1,0-1-68,2 0 0,2-2 0,10-1 0,2-1-98,3-1 1,5-3-52,2 4 1,6-5 0,3 1-1,2-2 107,2-1 1,-1-1-73,0-2 66,0 2-34,-4-3 1,-1 8-71,-4 2 0,0 2 37,0 1 1,0-3 101,0 0 0,0 1 0,0 2 0</inkml:trace>
-</inkml:ink>
-</file>
-
 <file path=word/theme/theme1.xml><?xml version="1.0" encoding="utf-8"?>
 <a:theme xmlns:a="http://schemas.openxmlformats.org/drawingml/2006/main" name="Office Theme">
   <a:themeElements>

</xml_diff>

<commit_message>
Remove team roster and approval tables from project documents
</commit_message>
<xml_diff>
--- a/docs/Project_Proposal.docx
+++ b/docs/Project_Proposal.docx
@@ -438,758 +438,6 @@
     <w:p>
       <w:pPr>
         <w:pStyle w:val="ListParagraph"/>
-        <w:numPr>
-          <w:ilvl w:val="0"/>
-          <w:numId w:val="6"/>
-        </w:numPr>
-        <w:ind w:left="360"/>
-        <w:rPr>
-          <w:sz w:val="24"/>
-          <w:szCs w:val="24"/>
-        </w:rPr>
-      </w:pPr>
-      <w:r>
-        <w:rPr>
-          <w:sz w:val="24"/>
-          <w:szCs w:val="24"/>
-        </w:rPr>
-        <w:t>Members of the group:</w:t>
-      </w:r>
-    </w:p>
-    <w:p>
-      <w:pPr>
-        <w:rPr>
-          <w:sz w:val="24"/>
-          <w:szCs w:val="24"/>
-        </w:rPr>
-      </w:pPr>
-    </w:p>
-    <w:p>
-      <w:pPr>
-        <w:pStyle w:val="ListParagraph"/>
-        <w:ind w:left="360"/>
-        <w:rPr>
-          <w:sz w:val="24"/>
-          <w:szCs w:val="24"/>
-        </w:rPr>
-      </w:pPr>
-    </w:p>
-    <w:tbl>
-      <w:tblPr>
-        <w:tblStyle w:val="TableGrid"/>
-        <w:tblW w:w="0" w:type="auto"/>
-        <w:tblInd w:w="535" w:type="dxa"/>
-        <w:tblLook w:val="04A0" w:firstRow="1" w:lastRow="0" w:firstColumn="1" w:lastColumn="0" w:noHBand="0" w:noVBand="1"/>
-      </w:tblPr>
-      <w:tblGrid>
-        <w:gridCol w:w="348"/>
-        <w:gridCol w:w="2394"/>
-        <w:gridCol w:w="2394"/>
-        <w:gridCol w:w="1150"/>
-      </w:tblGrid>
-      <w:tr>
-        <w:tc>
-          <w:tcPr>
-            <w:tcW w:w="348" w:type="dxa"/>
-            <w:shd w:val="clear" w:color="auto" w:fill="8DB3E2" w:themeFill="text2" w:themeFillTint="66"/>
-            <w:vAlign w:val="center"/>
-          </w:tcPr>
-          <w:p>
-            <w:pPr>
-              <w:jc w:val="center"/>
-              <w:rPr>
-                <w:sz w:val="24"/>
-                <w:szCs w:val="24"/>
-              </w:rPr>
-            </w:pPr>
-            <w:r>
-              <w:rPr>
-                <w:sz w:val="24"/>
-                <w:szCs w:val="24"/>
-              </w:rPr>
-              <w:t>#</w:t>
-            </w:r>
-          </w:p>
-        </w:tc>
-        <w:tc>
-          <w:tcPr>
-            <w:tcW w:w="2394" w:type="dxa"/>
-            <w:shd w:val="clear" w:color="auto" w:fill="8DB3E2" w:themeFill="text2" w:themeFillTint="66"/>
-            <w:vAlign w:val="center"/>
-          </w:tcPr>
-          <w:p>
-            <w:pPr>
-              <w:jc w:val="center"/>
-              <w:rPr>
-                <w:sz w:val="24"/>
-                <w:szCs w:val="24"/>
-              </w:rPr>
-            </w:pPr>
-            <w:r>
-              <w:rPr>
-                <w:sz w:val="24"/>
-                <w:szCs w:val="24"/>
-              </w:rPr>
-              <w:t>Name</w:t>
-            </w:r>
-          </w:p>
-        </w:tc>
-        <w:tc>
-          <w:tcPr>
-            <w:tcW w:w="2394" w:type="dxa"/>
-            <w:shd w:val="clear" w:color="auto" w:fill="8DB3E2" w:themeFill="text2" w:themeFillTint="66"/>
-            <w:vAlign w:val="center"/>
-          </w:tcPr>
-          <w:p>
-            <w:pPr>
-              <w:jc w:val="center"/>
-              <w:rPr>
-                <w:sz w:val="24"/>
-                <w:szCs w:val="24"/>
-              </w:rPr>
-            </w:pPr>
-            <w:r>
-              <w:rPr>
-                <w:sz w:val="24"/>
-                <w:szCs w:val="24"/>
-              </w:rPr>
-              <w:t>ID</w:t>
-            </w:r>
-          </w:p>
-        </w:tc>
-        <w:tc>
-          <w:tcPr>
-            <w:tcW w:w="1150" w:type="dxa"/>
-            <w:shd w:val="clear" w:color="auto" w:fill="8DB3E2" w:themeFill="text2" w:themeFillTint="66"/>
-            <w:vAlign w:val="center"/>
-          </w:tcPr>
-          <w:p>
-            <w:pPr>
-              <w:jc w:val="center"/>
-              <w:rPr>
-                <w:sz w:val="24"/>
-                <w:szCs w:val="24"/>
-              </w:rPr>
-            </w:pPr>
-            <w:r>
-              <w:rPr>
-                <w:sz w:val="24"/>
-                <w:szCs w:val="24"/>
-              </w:rPr>
-              <w:t>Role</w:t>
-            </w:r>
-          </w:p>
-        </w:tc>
-      </w:tr>
-      <w:tr>
-        <w:tc>
-          <w:tcPr>
-            <w:tcW w:w="348" w:type="dxa"/>
-            <w:vAlign w:val="center"/>
-          </w:tcPr>
-          <w:p>
-            <w:pPr>
-              <w:jc w:val="center"/>
-              <w:rPr>
-                <w:sz w:val="24"/>
-                <w:szCs w:val="24"/>
-              </w:rPr>
-            </w:pPr>
-            <w:r>
-              <w:rPr>
-                <w:sz w:val="24"/>
-                <w:szCs w:val="24"/>
-              </w:rPr>
-              <w:t>1</w:t>
-            </w:r>
-          </w:p>
-        </w:tc>
-        <w:tc>
-          <w:tcPr>
-            <w:tcW w:w="2394" w:type="dxa"/>
-            <w:vAlign w:val="center"/>
-          </w:tcPr>
-          <w:p>
-            <w:pPr>
-              <w:rPr>
-                <w:sz w:val="24"/>
-                <w:szCs w:val="24"/>
-              </w:rPr>
-            </w:pPr>
-            <w:r>
-              <w:rPr>
-                <w:sz w:val="24"/>
-                <w:szCs w:val="24"/>
-              </w:rPr>
-              <w:t/>
-            </w:r>
-          </w:p>
-        </w:tc>
-        <w:tc>
-          <w:tcPr>
-            <w:tcW w:w="2394" w:type="dxa"/>
-            <w:vAlign w:val="center"/>
-          </w:tcPr>
-          <w:p>
-            <w:pPr>
-              <w:rPr>
-                <w:sz w:val="24"/>
-                <w:szCs w:val="24"/>
-              </w:rPr>
-            </w:pPr>
-            <w:r>
-              <w:rPr>
-                <w:sz w:val="24"/>
-                <w:szCs w:val="24"/>
-              </w:rPr>
-              <w:t>2230003538</w:t>
-            </w:r>
-          </w:p>
-        </w:tc>
-        <w:tc>
-          <w:tcPr>
-            <w:tcW w:w="1150" w:type="dxa"/>
-            <w:vAlign w:val="center"/>
-          </w:tcPr>
-          <w:p>
-            <w:pPr>
-              <w:rPr>
-                <w:sz w:val="24"/>
-                <w:szCs w:val="24"/>
-              </w:rPr>
-            </w:pPr>
-            <w:r>
-              <w:rPr>
-                <w:sz w:val="24"/>
-                <w:szCs w:val="24"/>
-              </w:rPr>
-              <w:t>Leader</w:t>
-            </w:r>
-          </w:p>
-        </w:tc>
-      </w:tr>
-      <w:tr>
-        <w:tc>
-          <w:tcPr>
-            <w:tcW w:w="348" w:type="dxa"/>
-            <w:vAlign w:val="center"/>
-          </w:tcPr>
-          <w:p>
-            <w:pPr>
-              <w:jc w:val="center"/>
-              <w:rPr>
-                <w:sz w:val="24"/>
-                <w:szCs w:val="24"/>
-              </w:rPr>
-            </w:pPr>
-            <w:r>
-              <w:rPr>
-                <w:sz w:val="24"/>
-                <w:szCs w:val="24"/>
-              </w:rPr>
-              <w:t>2</w:t>
-            </w:r>
-          </w:p>
-        </w:tc>
-        <w:tc>
-          <w:tcPr>
-            <w:tcW w:w="2394" w:type="dxa"/>
-            <w:vAlign w:val="center"/>
-          </w:tcPr>
-          <w:p>
-            <w:pPr>
-              <w:rPr>
-                <w:sz w:val="24"/>
-                <w:szCs w:val="24"/>
-              </w:rPr>
-            </w:pPr>
-            <w:r>
-              <w:rPr>
-                <w:sz w:val="24"/>
-                <w:szCs w:val="24"/>
-              </w:rPr>
-              <w:t/>
-            </w:r>
-          </w:p>
-        </w:tc>
-        <w:tc>
-          <w:tcPr>
-            <w:tcW w:w="2394" w:type="dxa"/>
-            <w:vAlign w:val="center"/>
-          </w:tcPr>
-          <w:p>
-            <w:pPr>
-              <w:rPr>
-                <w:sz w:val="24"/>
-                <w:szCs w:val="24"/>
-              </w:rPr>
-            </w:pPr>
-            <w:r>
-              <w:rPr>
-                <w:sz w:val="24"/>
-                <w:szCs w:val="24"/>
-              </w:rPr>
-              <w:t>2230004065</w:t>
-            </w:r>
-          </w:p>
-        </w:tc>
-        <w:tc>
-          <w:tcPr>
-            <w:tcW w:w="1150" w:type="dxa"/>
-            <w:vAlign w:val="center"/>
-          </w:tcPr>
-          <w:p>
-            <w:pPr>
-              <w:rPr>
-                <w:sz w:val="24"/>
-                <w:szCs w:val="24"/>
-              </w:rPr>
-            </w:pPr>
-            <w:r>
-              <w:rPr>
-                <w:sz w:val="24"/>
-                <w:szCs w:val="24"/>
-              </w:rPr>
-              <w:t>Member</w:t>
-            </w:r>
-          </w:p>
-        </w:tc>
-      </w:tr>
-      <w:tr>
-        <w:tc>
-          <w:tcPr>
-            <w:tcW w:w="348" w:type="dxa"/>
-            <w:vAlign w:val="center"/>
-          </w:tcPr>
-          <w:p>
-            <w:pPr>
-              <w:jc w:val="center"/>
-              <w:rPr>
-                <w:sz w:val="24"/>
-                <w:szCs w:val="24"/>
-              </w:rPr>
-            </w:pPr>
-            <w:r>
-              <w:rPr>
-                <w:sz w:val="24"/>
-                <w:szCs w:val="24"/>
-              </w:rPr>
-              <w:t>3</w:t>
-            </w:r>
-          </w:p>
-        </w:tc>
-        <w:tc>
-          <w:tcPr>
-            <w:tcW w:w="2394" w:type="dxa"/>
-            <w:vAlign w:val="center"/>
-          </w:tcPr>
-          <w:p>
-            <w:pPr>
-              <w:rPr>
-                <w:sz w:val="24"/>
-                <w:szCs w:val="24"/>
-              </w:rPr>
-            </w:pPr>
-            <w:r>
-              <w:rPr>
-                <w:sz w:val="24"/>
-                <w:szCs w:val="24"/>
-              </w:rPr>
-              <w:t/>
-            </w:r>
-          </w:p>
-        </w:tc>
-        <w:tc>
-          <w:tcPr>
-            <w:tcW w:w="2394" w:type="dxa"/>
-            <w:vAlign w:val="center"/>
-          </w:tcPr>
-          <w:p>
-            <w:pPr>
-              <w:rPr>
-                <w:sz w:val="24"/>
-                <w:szCs w:val="24"/>
-              </w:rPr>
-            </w:pPr>
-            <w:r>
-              <w:rPr>
-                <w:sz w:val="24"/>
-                <w:szCs w:val="24"/>
-              </w:rPr>
-              <w:t>2230005567</w:t>
-            </w:r>
-          </w:p>
-        </w:tc>
-        <w:tc>
-          <w:tcPr>
-            <w:tcW w:w="1150" w:type="dxa"/>
-            <w:vAlign w:val="center"/>
-          </w:tcPr>
-          <w:p>
-            <w:pPr>
-              <w:rPr>
-                <w:sz w:val="24"/>
-                <w:szCs w:val="24"/>
-              </w:rPr>
-            </w:pPr>
-            <w:r>
-              <w:rPr>
-                <w:sz w:val="24"/>
-                <w:szCs w:val="24"/>
-              </w:rPr>
-              <w:t>Member</w:t>
-            </w:r>
-          </w:p>
-        </w:tc>
-      </w:tr>
-      <w:tr>
-        <w:tc>
-          <w:tcPr>
-            <w:tcW w:w="348" w:type="dxa"/>
-            <w:vAlign w:val="center"/>
-          </w:tcPr>
-          <w:p>
-            <w:pPr>
-              <w:jc w:val="center"/>
-              <w:rPr>
-                <w:sz w:val="24"/>
-                <w:szCs w:val="24"/>
-              </w:rPr>
-            </w:pPr>
-            <w:r>
-              <w:rPr>
-                <w:sz w:val="24"/>
-                <w:szCs w:val="24"/>
-              </w:rPr>
-              <w:t>4</w:t>
-            </w:r>
-          </w:p>
-        </w:tc>
-        <w:tc>
-          <w:tcPr>
-            <w:tcW w:w="2394" w:type="dxa"/>
-            <w:vAlign w:val="center"/>
-          </w:tcPr>
-          <w:p>
-            <w:pPr>
-              <w:rPr>
-                <w:sz w:val="24"/>
-                <w:szCs w:val="24"/>
-              </w:rPr>
-            </w:pPr>
-            <w:r>
-              <w:rPr>
-                <w:sz w:val="24"/>
-                <w:szCs w:val="24"/>
-              </w:rPr>
-              <w:t/>
-            </w:r>
-          </w:p>
-        </w:tc>
-        <w:tc>
-          <w:tcPr>
-            <w:tcW w:w="2394" w:type="dxa"/>
-            <w:vAlign w:val="center"/>
-          </w:tcPr>
-          <w:p>
-            <w:pPr>
-              <w:rPr>
-                <w:sz w:val="24"/>
-                <w:szCs w:val="24"/>
-              </w:rPr>
-            </w:pPr>
-            <w:r>
-              <w:rPr>
-                <w:sz w:val="24"/>
-                <w:szCs w:val="24"/>
-              </w:rPr>
-              <w:t>2230002838</w:t>
-            </w:r>
-          </w:p>
-        </w:tc>
-        <w:tc>
-          <w:tcPr>
-            <w:tcW w:w="1150" w:type="dxa"/>
-          </w:tcPr>
-          <w:p>
-            <w:pPr>
-              <w:rPr>
-                <w:sz w:val="24"/>
-                <w:szCs w:val="24"/>
-              </w:rPr>
-            </w:pPr>
-            <w:r>
-              <w:rPr>
-                <w:sz w:val="24"/>
-                <w:szCs w:val="24"/>
-              </w:rPr>
-              <w:t>Member</w:t>
-            </w:r>
-          </w:p>
-        </w:tc>
-      </w:tr>
-      <w:tr>
-        <w:tc>
-          <w:tcPr>
-            <w:tcW w:w="348" w:type="dxa"/>
-            <w:vAlign w:val="center"/>
-          </w:tcPr>
-          <w:p>
-            <w:pPr>
-              <w:jc w:val="center"/>
-              <w:rPr>
-                <w:sz w:val="24"/>
-                <w:szCs w:val="24"/>
-              </w:rPr>
-            </w:pPr>
-            <w:r>
-              <w:rPr>
-                <w:sz w:val="24"/>
-                <w:szCs w:val="24"/>
-              </w:rPr>
-              <w:t>5</w:t>
-            </w:r>
-          </w:p>
-        </w:tc>
-        <w:tc>
-          <w:tcPr>
-            <w:tcW w:w="2394" w:type="dxa"/>
-            <w:vAlign w:val="center"/>
-          </w:tcPr>
-          <w:p>
-            <w:pPr>
-              <w:rPr>
-                <w:sz w:val="24"/>
-                <w:szCs w:val="24"/>
-              </w:rPr>
-            </w:pPr>
-            <w:r>
-              <w:rPr>
-                <w:sz w:val="24"/>
-                <w:szCs w:val="24"/>
-              </w:rPr>
-              <w:t/>
-            </w:r>
-          </w:p>
-        </w:tc>
-        <w:tc>
-          <w:tcPr>
-            <w:tcW w:w="2394" w:type="dxa"/>
-            <w:vAlign w:val="center"/>
-          </w:tcPr>
-          <w:p>
-            <w:pPr>
-              <w:rPr>
-                <w:sz w:val="24"/>
-                <w:szCs w:val="24"/>
-              </w:rPr>
-            </w:pPr>
-            <w:r>
-              <w:rPr>
-                <w:sz w:val="24"/>
-                <w:szCs w:val="24"/>
-              </w:rPr>
-              <w:t>2230004462</w:t>
-            </w:r>
-          </w:p>
-        </w:tc>
-        <w:tc>
-          <w:tcPr>
-            <w:tcW w:w="1150" w:type="dxa"/>
-          </w:tcPr>
-          <w:p>
-            <w:pPr>
-              <w:rPr>
-                <w:sz w:val="24"/>
-                <w:szCs w:val="24"/>
-              </w:rPr>
-            </w:pPr>
-            <w:r>
-              <w:rPr>
-                <w:sz w:val="24"/>
-                <w:szCs w:val="24"/>
-              </w:rPr>
-              <w:t>Member</w:t>
-            </w:r>
-          </w:p>
-        </w:tc>
-      </w:tr>
-      <w:tr>
-        <w:tc>
-          <w:tcPr>
-            <w:tcW w:w="348" w:type="dxa"/>
-            <w:vAlign w:val="center"/>
-          </w:tcPr>
-          <w:p>
-            <w:pPr>
-              <w:jc w:val="center"/>
-              <w:rPr>
-                <w:sz w:val="24"/>
-                <w:szCs w:val="24"/>
-              </w:rPr>
-            </w:pPr>
-            <w:r>
-              <w:rPr>
-                <w:sz w:val="24"/>
-                <w:szCs w:val="24"/>
-              </w:rPr>
-              <w:t>6</w:t>
-            </w:r>
-          </w:p>
-        </w:tc>
-        <w:tc>
-          <w:tcPr>
-            <w:tcW w:w="2394" w:type="dxa"/>
-            <w:vAlign w:val="center"/>
-          </w:tcPr>
-          <w:p>
-            <w:pPr>
-              <w:rPr>
-                <w:sz w:val="24"/>
-                <w:szCs w:val="24"/>
-              </w:rPr>
-            </w:pPr>
-            <w:r>
-              <w:rPr>
-                <w:sz w:val="24"/>
-                <w:szCs w:val="24"/>
-              </w:rPr>
-              <w:t/>
-            </w:r>
-          </w:p>
-        </w:tc>
-        <w:tc>
-          <w:tcPr>
-            <w:tcW w:w="2394" w:type="dxa"/>
-            <w:vAlign w:val="center"/>
-          </w:tcPr>
-          <w:p>
-            <w:pPr>
-              <w:rPr>
-                <w:sz w:val="24"/>
-                <w:szCs w:val="24"/>
-              </w:rPr>
-            </w:pPr>
-            <w:r>
-              <w:rPr>
-                <w:sz w:val="24"/>
-                <w:szCs w:val="24"/>
-              </w:rPr>
-              <w:t>2230001190</w:t>
-            </w:r>
-          </w:p>
-        </w:tc>
-        <w:tc>
-          <w:tcPr>
-            <w:tcW w:w="1150" w:type="dxa"/>
-          </w:tcPr>
-          <w:p>
-            <w:pPr>
-              <w:rPr>
-                <w:sz w:val="24"/>
-                <w:szCs w:val="24"/>
-              </w:rPr>
-            </w:pPr>
-            <w:r>
-              <w:rPr>
-                <w:sz w:val="24"/>
-                <w:szCs w:val="24"/>
-              </w:rPr>
-              <w:t>Member</w:t>
-            </w:r>
-          </w:p>
-        </w:tc>
-      </w:tr>
-      <w:tr>
-        <w:tc>
-          <w:tcPr>
-            <w:tcW w:w="348" w:type="dxa"/>
-            <w:vAlign w:val="center"/>
-          </w:tcPr>
-          <w:p>
-            <w:pPr>
-              <w:jc w:val="center"/>
-              <w:rPr>
-                <w:sz w:val="24"/>
-                <w:szCs w:val="24"/>
-              </w:rPr>
-            </w:pPr>
-            <w:r>
-              <w:rPr>
-                <w:sz w:val="24"/>
-                <w:szCs w:val="24"/>
-              </w:rPr>
-              <w:t>7</w:t>
-            </w:r>
-          </w:p>
-        </w:tc>
-        <w:tc>
-          <w:tcPr>
-            <w:tcW w:w="2394" w:type="dxa"/>
-            <w:vAlign w:val="center"/>
-          </w:tcPr>
-          <w:p>
-            <w:pPr>
-              <w:rPr>
-                <w:sz w:val="24"/>
-                <w:szCs w:val="24"/>
-              </w:rPr>
-            </w:pPr>
-            <w:r>
-              <w:rPr>
-                <w:sz w:val="24"/>
-                <w:szCs w:val="24"/>
-              </w:rPr>
-              <w:t/>
-            </w:r>
-          </w:p>
-        </w:tc>
-        <w:tc>
-          <w:tcPr>
-            <w:tcW w:w="2394" w:type="dxa"/>
-            <w:vAlign w:val="center"/>
-          </w:tcPr>
-          <w:p>
-            <w:pPr>
-              <w:rPr>
-                <w:sz w:val="24"/>
-                <w:szCs w:val="24"/>
-              </w:rPr>
-            </w:pPr>
-            <w:r>
-              <w:rPr>
-                <w:sz w:val="24"/>
-                <w:szCs w:val="24"/>
-              </w:rPr>
-              <w:t>2230007061</w:t>
-            </w:r>
-          </w:p>
-        </w:tc>
-        <w:tc>
-          <w:tcPr>
-            <w:tcW w:w="1150" w:type="dxa"/>
-          </w:tcPr>
-          <w:p>
-            <w:pPr>
-              <w:rPr>
-                <w:sz w:val="24"/>
-                <w:szCs w:val="24"/>
-              </w:rPr>
-            </w:pPr>
-            <w:r>
-              <w:rPr>
-                <w:sz w:val="24"/>
-                <w:szCs w:val="24"/>
-              </w:rPr>
-              <w:t>Member</w:t>
-            </w:r>
-          </w:p>
-        </w:tc>
-      </w:tr>
-    </w:tbl>
-    <w:p>
-      <w:pPr>
-        <w:pStyle w:val="ListParagraph"/>
         <w:spacing w:line="360" w:lineRule="auto"/>
         <w:rPr>
           <w:sz w:val="24"/>
@@ -2596,728 +1844,6 @@
         </w:rPr>
       </w:pPr>
     </w:p>
-    <w:p>
-      <w:pPr>
-        <w:pStyle w:val="ListParagraph"/>
-        <w:numPr>
-          <w:ilvl w:val="0"/>
-          <w:numId w:val="10"/>
-        </w:numPr>
-        <w:spacing w:after="200" w:line="276" w:lineRule="auto"/>
-        <w:rPr>
-          <w:b/>
-          <w:bCs/>
-          <w:sz w:val="24"/>
-          <w:szCs w:val="24"/>
-        </w:rPr>
-      </w:pPr>
-      <w:r>
-        <w:rPr>
-          <w:b/>
-          <w:bCs/>
-          <w:sz w:val="24"/>
-          <w:szCs w:val="24"/>
-        </w:rPr>
-        <w:t>Signatures of group members</w:t>
-      </w:r>
-    </w:p>
-    <w:tbl>
-      <w:tblPr>
-        <w:tblStyle w:val="TableGrid"/>
-        <w:tblW w:w="0" w:type="auto"/>
-        <w:tblInd w:w="468" w:type="dxa"/>
-        <w:tblLook w:val="04A0" w:firstRow="1" w:lastRow="0" w:firstColumn="1" w:lastColumn="0" w:noHBand="0" w:noVBand="1"/>
-      </w:tblPr>
-      <w:tblGrid>
-        <w:gridCol w:w="348"/>
-        <w:gridCol w:w="2910"/>
-        <w:gridCol w:w="2340"/>
-        <w:gridCol w:w="3510"/>
-      </w:tblGrid>
-      <w:tr>
-        <w:tc>
-          <w:tcPr>
-            <w:tcW w:w="348" w:type="dxa"/>
-            <w:shd w:val="clear" w:color="auto" w:fill="8DB3E2" w:themeFill="text2" w:themeFillTint="66"/>
-            <w:vAlign w:val="center"/>
-          </w:tcPr>
-          <w:p>
-            <w:pPr>
-              <w:jc w:val="center"/>
-              <w:rPr>
-                <w:sz w:val="24"/>
-                <w:szCs w:val="24"/>
-              </w:rPr>
-            </w:pPr>
-            <w:r>
-              <w:rPr>
-                <w:sz w:val="24"/>
-                <w:szCs w:val="24"/>
-              </w:rPr>
-              <w:t>#</w:t>
-            </w:r>
-          </w:p>
-        </w:tc>
-        <w:tc>
-          <w:tcPr>
-            <w:tcW w:w="2910" w:type="dxa"/>
-            <w:shd w:val="clear" w:color="auto" w:fill="8DB3E2" w:themeFill="text2" w:themeFillTint="66"/>
-            <w:vAlign w:val="center"/>
-          </w:tcPr>
-          <w:p>
-            <w:pPr>
-              <w:jc w:val="center"/>
-              <w:rPr>
-                <w:sz w:val="24"/>
-                <w:szCs w:val="24"/>
-              </w:rPr>
-            </w:pPr>
-            <w:r>
-              <w:rPr>
-                <w:sz w:val="24"/>
-                <w:szCs w:val="24"/>
-              </w:rPr>
-              <w:t>Name</w:t>
-            </w:r>
-          </w:p>
-        </w:tc>
-        <w:tc>
-          <w:tcPr>
-            <w:tcW w:w="2340" w:type="dxa"/>
-            <w:shd w:val="clear" w:color="auto" w:fill="8DB3E2" w:themeFill="text2" w:themeFillTint="66"/>
-            <w:vAlign w:val="center"/>
-          </w:tcPr>
-          <w:p>
-            <w:pPr>
-              <w:jc w:val="center"/>
-              <w:rPr>
-                <w:sz w:val="24"/>
-                <w:szCs w:val="24"/>
-              </w:rPr>
-            </w:pPr>
-            <w:r>
-              <w:rPr>
-                <w:sz w:val="24"/>
-                <w:szCs w:val="24"/>
-              </w:rPr>
-              <w:t>ID</w:t>
-            </w:r>
-          </w:p>
-        </w:tc>
-        <w:tc>
-          <w:tcPr>
-            <w:tcW w:w="3510" w:type="dxa"/>
-            <w:shd w:val="clear" w:color="auto" w:fill="8DB3E2" w:themeFill="text2" w:themeFillTint="66"/>
-            <w:vAlign w:val="center"/>
-          </w:tcPr>
-          <w:p>
-            <w:pPr>
-              <w:jc w:val="center"/>
-              <w:rPr>
-                <w:sz w:val="24"/>
-                <w:szCs w:val="24"/>
-              </w:rPr>
-            </w:pPr>
-            <w:r>
-              <w:rPr>
-                <w:sz w:val="24"/>
-                <w:szCs w:val="24"/>
-              </w:rPr>
-              <w:t>Signature</w:t>
-            </w:r>
-          </w:p>
-        </w:tc>
-      </w:tr>
-      <w:tr>
-        <w:trPr>
-          <w:trHeight w:val="432"/>
-        </w:trPr>
-        <w:tc>
-          <w:tcPr>
-            <w:tcW w:w="348" w:type="dxa"/>
-            <w:vAlign w:val="center"/>
-          </w:tcPr>
-          <w:p>
-            <w:pPr>
-              <w:jc w:val="center"/>
-              <w:rPr>
-                <w:sz w:val="24"/>
-                <w:szCs w:val="24"/>
-              </w:rPr>
-            </w:pPr>
-            <w:r>
-              <w:rPr>
-                <w:sz w:val="24"/>
-                <w:szCs w:val="24"/>
-              </w:rPr>
-              <w:t>1</w:t>
-            </w:r>
-          </w:p>
-        </w:tc>
-        <w:tc>
-          <w:tcPr>
-            <w:tcW w:w="2910" w:type="dxa"/>
-            <w:vAlign w:val="center"/>
-          </w:tcPr>
-          <w:p>
-            <w:pPr>
-              <w:rPr>
-                <w:sz w:val="24"/>
-                <w:szCs w:val="24"/>
-              </w:rPr>
-            </w:pPr>
-            <w:r>
-              <w:rPr>
-                <w:sz w:val="24"/>
-                <w:szCs w:val="24"/>
-              </w:rPr>
-              <w:t/>
-            </w:r>
-          </w:p>
-        </w:tc>
-        <w:tc>
-          <w:tcPr>
-            <w:tcW w:w="2340" w:type="dxa"/>
-            <w:vAlign w:val="center"/>
-          </w:tcPr>
-          <w:p>
-            <w:pPr>
-              <w:rPr>
-                <w:sz w:val="24"/>
-                <w:szCs w:val="24"/>
-              </w:rPr>
-            </w:pPr>
-            <w:r>
-              <w:rPr>
-                <w:sz w:val="24"/>
-                <w:szCs w:val="24"/>
-              </w:rPr>
-              <w:t>2230003538</w:t>
-            </w:r>
-          </w:p>
-        </w:tc>
-        <w:tc>
-          <w:tcPr>
-            <w:tcW w:w="3510" w:type="dxa"/>
-            <w:vAlign w:val="center"/>
-          </w:tcPr>
-          <w:p>
-            <w:pPr>
-              <w:bidi/>
-              <w:rPr>
-                <w:sz w:val="24"/>
-                <w:szCs w:val="24"/>
-              </w:rPr>
-            </w:pPr>
-            <w:r>
-              <w:rPr>
-                <w:sz w:val="24"/>
-                <w:szCs w:val="24"/>
-              </w:rPr>
-              <w:t xml:space="preserve"> </w:t>
-            </w:r>
-          </w:p>
-        </w:tc>
-      </w:tr>
-      <w:tr>
-        <w:trPr>
-          <w:trHeight w:val="432"/>
-        </w:trPr>
-        <w:tc>
-          <w:tcPr>
-            <w:tcW w:w="348" w:type="dxa"/>
-            <w:vAlign w:val="center"/>
-          </w:tcPr>
-          <w:p>
-            <w:pPr>
-              <w:jc w:val="center"/>
-              <w:rPr>
-                <w:sz w:val="24"/>
-                <w:szCs w:val="24"/>
-              </w:rPr>
-            </w:pPr>
-            <w:r>
-              <w:rPr>
-                <w:sz w:val="24"/>
-                <w:szCs w:val="24"/>
-              </w:rPr>
-              <w:t>2</w:t>
-            </w:r>
-          </w:p>
-        </w:tc>
-        <w:tc>
-          <w:tcPr>
-            <w:tcW w:w="2910" w:type="dxa"/>
-            <w:vAlign w:val="center"/>
-          </w:tcPr>
-          <w:p>
-            <w:pPr>
-              <w:rPr>
-                <w:sz w:val="24"/>
-                <w:szCs w:val="24"/>
-              </w:rPr>
-            </w:pPr>
-            <w:r>
-              <w:rPr>
-                <w:sz w:val="24"/>
-                <w:szCs w:val="24"/>
-              </w:rPr>
-              <w:t/>
-            </w:r>
-          </w:p>
-        </w:tc>
-        <w:tc>
-          <w:tcPr>
-            <w:tcW w:w="2340" w:type="dxa"/>
-            <w:vAlign w:val="center"/>
-          </w:tcPr>
-          <w:p>
-            <w:pPr>
-              <w:rPr>
-                <w:sz w:val="24"/>
-                <w:szCs w:val="24"/>
-              </w:rPr>
-            </w:pPr>
-            <w:r>
-              <w:rPr>
-                <w:sz w:val="24"/>
-                <w:szCs w:val="24"/>
-              </w:rPr>
-              <w:t>2230004065</w:t>
-            </w:r>
-          </w:p>
-        </w:tc>
-        <w:tc>
-          <w:tcPr>
-            <w:tcW w:w="3510" w:type="dxa"/>
-            <w:vAlign w:val="center"/>
-          </w:tcPr>
-          <w:p>
-            <w:pPr>
-              <w:rPr>
-                <w:sz w:val="24"/>
-                <w:szCs w:val="24"/>
-              </w:rPr>
-            </w:pPr>
-          </w:p>
-        </w:tc>
-      </w:tr>
-      <w:tr>
-        <w:trPr>
-          <w:trHeight w:val="432"/>
-        </w:trPr>
-        <w:tc>
-          <w:tcPr>
-            <w:tcW w:w="348" w:type="dxa"/>
-            <w:vAlign w:val="center"/>
-          </w:tcPr>
-          <w:p>
-            <w:pPr>
-              <w:jc w:val="center"/>
-              <w:rPr>
-                <w:sz w:val="24"/>
-                <w:szCs w:val="24"/>
-              </w:rPr>
-            </w:pPr>
-            <w:r>
-              <w:rPr>
-                <w:sz w:val="24"/>
-                <w:szCs w:val="24"/>
-              </w:rPr>
-              <w:t>3</w:t>
-            </w:r>
-          </w:p>
-        </w:tc>
-        <w:tc>
-          <w:tcPr>
-            <w:tcW w:w="2910" w:type="dxa"/>
-            <w:vAlign w:val="center"/>
-          </w:tcPr>
-          <w:p>
-            <w:pPr>
-              <w:rPr>
-                <w:sz w:val="24"/>
-                <w:szCs w:val="24"/>
-              </w:rPr>
-            </w:pPr>
-            <w:r>
-              <w:rPr>
-                <w:sz w:val="24"/>
-                <w:szCs w:val="24"/>
-              </w:rPr>
-              <w:t/>
-            </w:r>
-          </w:p>
-        </w:tc>
-        <w:tc>
-          <w:tcPr>
-            <w:tcW w:w="2340" w:type="dxa"/>
-            <w:vAlign w:val="center"/>
-          </w:tcPr>
-          <w:p>
-            <w:pPr>
-              <w:rPr>
-                <w:sz w:val="24"/>
-                <w:szCs w:val="24"/>
-              </w:rPr>
-            </w:pPr>
-            <w:r>
-              <w:rPr>
-                <w:sz w:val="24"/>
-                <w:szCs w:val="24"/>
-              </w:rPr>
-              <w:t>2230005567</w:t>
-            </w:r>
-          </w:p>
-        </w:tc>
-        <w:tc>
-          <w:tcPr>
-            <w:tcW w:w="3510" w:type="dxa"/>
-            <w:vAlign w:val="center"/>
-          </w:tcPr>
-          <w:p>
-            <w:pPr>
-              <w:rPr>
-                <w:sz w:val="24"/>
-                <w:szCs w:val="24"/>
-              </w:rPr>
-            </w:pPr>
-          </w:p>
-        </w:tc>
-      </w:tr>
-      <w:tr>
-        <w:trPr>
-          <w:trHeight w:val="432"/>
-        </w:trPr>
-        <w:tc>
-          <w:tcPr>
-            <w:tcW w:w="348" w:type="dxa"/>
-            <w:vAlign w:val="center"/>
-          </w:tcPr>
-          <w:p>
-            <w:pPr>
-              <w:jc w:val="center"/>
-              <w:rPr>
-                <w:sz w:val="24"/>
-                <w:szCs w:val="24"/>
-              </w:rPr>
-            </w:pPr>
-            <w:r>
-              <w:rPr>
-                <w:sz w:val="24"/>
-                <w:szCs w:val="24"/>
-              </w:rPr>
-              <w:t>4</w:t>
-            </w:r>
-          </w:p>
-        </w:tc>
-        <w:tc>
-          <w:tcPr>
-            <w:tcW w:w="2910" w:type="dxa"/>
-            <w:vAlign w:val="center"/>
-          </w:tcPr>
-          <w:p>
-            <w:pPr>
-              <w:rPr>
-                <w:sz w:val="24"/>
-                <w:szCs w:val="24"/>
-              </w:rPr>
-            </w:pPr>
-            <w:r>
-              <w:rPr>
-                <w:sz w:val="24"/>
-                <w:szCs w:val="24"/>
-              </w:rPr>
-              <w:t/>
-            </w:r>
-          </w:p>
-        </w:tc>
-        <w:tc>
-          <w:tcPr>
-            <w:tcW w:w="2340" w:type="dxa"/>
-            <w:vAlign w:val="center"/>
-          </w:tcPr>
-          <w:p>
-            <w:pPr>
-              <w:rPr>
-                <w:sz w:val="24"/>
-                <w:szCs w:val="24"/>
-              </w:rPr>
-            </w:pPr>
-            <w:r>
-              <w:rPr>
-                <w:sz w:val="24"/>
-                <w:szCs w:val="24"/>
-              </w:rPr>
-              <w:t>2230002838</w:t>
-            </w:r>
-          </w:p>
-        </w:tc>
-        <w:tc>
-          <w:tcPr>
-            <w:tcW w:w="3510" w:type="dxa"/>
-            <w:vAlign w:val="center"/>
-          </w:tcPr>
-          <w:p>
-            <w:pPr>
-              <w:rPr>
-                <w:sz w:val="24"/>
-                <w:szCs w:val="24"/>
-              </w:rPr>
-            </w:pPr>
-          </w:p>
-        </w:tc>
-      </w:tr>
-      <w:tr>
-        <w:trPr>
-          <w:trHeight w:val="432"/>
-        </w:trPr>
-        <w:tc>
-          <w:tcPr>
-            <w:tcW w:w="348" w:type="dxa"/>
-            <w:vAlign w:val="center"/>
-          </w:tcPr>
-          <w:p>
-            <w:pPr>
-              <w:jc w:val="center"/>
-              <w:rPr>
-                <w:sz w:val="24"/>
-                <w:szCs w:val="24"/>
-              </w:rPr>
-            </w:pPr>
-            <w:r>
-              <w:rPr>
-                <w:sz w:val="24"/>
-                <w:szCs w:val="24"/>
-              </w:rPr>
-              <w:t>5</w:t>
-            </w:r>
-          </w:p>
-        </w:tc>
-        <w:tc>
-          <w:tcPr>
-            <w:tcW w:w="2910" w:type="dxa"/>
-            <w:vAlign w:val="center"/>
-          </w:tcPr>
-          <w:p>
-            <w:pPr>
-              <w:rPr>
-                <w:sz w:val="24"/>
-                <w:szCs w:val="24"/>
-              </w:rPr>
-            </w:pPr>
-            <w:r>
-              <w:rPr>
-                <w:sz w:val="24"/>
-                <w:szCs w:val="24"/>
-              </w:rPr>
-              <w:t/>
-            </w:r>
-          </w:p>
-        </w:tc>
-        <w:tc>
-          <w:tcPr>
-            <w:tcW w:w="2340" w:type="dxa"/>
-            <w:vAlign w:val="center"/>
-          </w:tcPr>
-          <w:p>
-            <w:pPr>
-              <w:rPr>
-                <w:sz w:val="24"/>
-                <w:szCs w:val="24"/>
-              </w:rPr>
-            </w:pPr>
-            <w:r>
-              <w:rPr>
-                <w:sz w:val="24"/>
-                <w:szCs w:val="24"/>
-              </w:rPr>
-              <w:t>2230004462</w:t>
-            </w:r>
-          </w:p>
-        </w:tc>
-        <w:tc>
-          <w:tcPr>
-            <w:tcW w:w="3510" w:type="dxa"/>
-            <w:vAlign w:val="center"/>
-          </w:tcPr>
-          <w:p>
-            <w:pPr>
-              <w:rPr>
-                <w:sz w:val="24"/>
-                <w:szCs w:val="24"/>
-              </w:rPr>
-            </w:pPr>
-          </w:p>
-        </w:tc>
-      </w:tr>
-      <w:tr>
-        <w:trPr>
-          <w:trHeight w:val="432"/>
-        </w:trPr>
-        <w:tc>
-          <w:tcPr>
-            <w:tcW w:w="348" w:type="dxa"/>
-            <w:vAlign w:val="center"/>
-          </w:tcPr>
-          <w:p>
-            <w:pPr>
-              <w:jc w:val="center"/>
-              <w:rPr>
-                <w:sz w:val="24"/>
-                <w:szCs w:val="24"/>
-              </w:rPr>
-            </w:pPr>
-            <w:r>
-              <w:rPr>
-                <w:sz w:val="24"/>
-                <w:szCs w:val="24"/>
-              </w:rPr>
-              <w:t>6</w:t>
-            </w:r>
-          </w:p>
-        </w:tc>
-        <w:tc>
-          <w:tcPr>
-            <w:tcW w:w="2910" w:type="dxa"/>
-            <w:vAlign w:val="center"/>
-          </w:tcPr>
-          <w:p>
-            <w:pPr>
-              <w:rPr>
-                <w:sz w:val="24"/>
-                <w:szCs w:val="24"/>
-              </w:rPr>
-            </w:pPr>
-            <w:r>
-              <w:rPr>
-                <w:sz w:val="24"/>
-                <w:szCs w:val="24"/>
-              </w:rPr>
-              <w:t/>
-            </w:r>
-          </w:p>
-        </w:tc>
-        <w:tc>
-          <w:tcPr>
-            <w:tcW w:w="2340" w:type="dxa"/>
-            <w:vAlign w:val="center"/>
-          </w:tcPr>
-          <w:p>
-            <w:pPr>
-              <w:rPr>
-                <w:sz w:val="24"/>
-                <w:szCs w:val="24"/>
-              </w:rPr>
-            </w:pPr>
-            <w:r>
-              <w:rPr>
-                <w:sz w:val="24"/>
-                <w:szCs w:val="24"/>
-              </w:rPr>
-              <w:t>2230001190</w:t>
-            </w:r>
-          </w:p>
-        </w:tc>
-        <w:tc>
-          <w:tcPr>
-            <w:tcW w:w="3510" w:type="dxa"/>
-            <w:vAlign w:val="center"/>
-          </w:tcPr>
-          <w:p>
-            <w:pPr>
-              <w:rPr>
-                <w:sz w:val="24"/>
-                <w:szCs w:val="24"/>
-              </w:rPr>
-            </w:pPr>
-          </w:p>
-        </w:tc>
-      </w:tr>
-      <w:tr>
-        <w:trPr>
-          <w:trHeight w:val="432"/>
-        </w:trPr>
-        <w:tc>
-          <w:tcPr>
-            <w:tcW w:w="348" w:type="dxa"/>
-            <w:vAlign w:val="center"/>
-          </w:tcPr>
-          <w:p>
-            <w:pPr>
-              <w:jc w:val="center"/>
-              <w:rPr>
-                <w:sz w:val="24"/>
-                <w:szCs w:val="24"/>
-              </w:rPr>
-            </w:pPr>
-            <w:r>
-              <w:rPr>
-                <w:sz w:val="24"/>
-                <w:szCs w:val="24"/>
-              </w:rPr>
-              <w:t>7</w:t>
-            </w:r>
-          </w:p>
-        </w:tc>
-        <w:tc>
-          <w:tcPr>
-            <w:tcW w:w="2910" w:type="dxa"/>
-            <w:vAlign w:val="center"/>
-          </w:tcPr>
-          <w:p>
-            <w:pPr>
-              <w:rPr>
-                <w:sz w:val="24"/>
-                <w:szCs w:val="24"/>
-              </w:rPr>
-            </w:pPr>
-            <w:r>
-              <w:rPr>
-                <w:sz w:val="24"/>
-                <w:szCs w:val="24"/>
-              </w:rPr>
-              <w:t/>
-            </w:r>
-          </w:p>
-        </w:tc>
-        <w:tc>
-          <w:tcPr>
-            <w:tcW w:w="2340" w:type="dxa"/>
-            <w:vAlign w:val="center"/>
-          </w:tcPr>
-          <w:p>
-            <w:pPr>
-              <w:rPr>
-                <w:sz w:val="24"/>
-                <w:szCs w:val="24"/>
-              </w:rPr>
-            </w:pPr>
-            <w:r>
-              <w:rPr>
-                <w:sz w:val="24"/>
-                <w:szCs w:val="24"/>
-              </w:rPr>
-              <w:t>2230007061</w:t>
-            </w:r>
-          </w:p>
-        </w:tc>
-        <w:tc>
-          <w:tcPr>
-            <w:tcW w:w="3510" w:type="dxa"/>
-            <w:vAlign w:val="center"/>
-          </w:tcPr>
-          <w:p>
-            <w:pPr>
-              <w:rPr>
-                <w:sz w:val="24"/>
-                <w:szCs w:val="24"/>
-              </w:rPr>
-            </w:pPr>
-          </w:p>
-        </w:tc>
-      </w:tr>
-    </w:tbl>
     <w:p>
       <w:pPr>
         <w:rPr>

</xml_diff>

<commit_message>
Remove course group and section identifiers from project documents
</commit_message>
<xml_diff>
--- a/docs/Project_Proposal.docx
+++ b/docs/Project_Proposal.docx
@@ -413,27 +413,6 @@
           <w:u w:val="single"/>
         </w:rPr>
       </w:pPr>
-    </w:p>
-    <w:p>
-      <w:pPr>
-        <w:pStyle w:val="ListParagraph"/>
-        <w:numPr>
-          <w:ilvl w:val="0"/>
-          <w:numId w:val="6"/>
-        </w:numPr>
-        <w:ind w:left="360"/>
-        <w:rPr>
-          <w:sz w:val="24"/>
-          <w:szCs w:val="24"/>
-        </w:rPr>
-      </w:pPr>
-      <w:r>
-        <w:rPr>
-          <w:sz w:val="24"/>
-          <w:szCs w:val="24"/>
-        </w:rPr>
-        <w:t xml:space="preserve">Group 5 – Section 3</w:t>
-      </w:r>
     </w:p>
     <w:p>
       <w:pPr>

</xml_diff>